<commit_message>
Drift-dok: 2FA haandhaevet for administratorer paa event.cbcit.dk (28/10)
- 02 par. 1/5/7.2d: two-factor + mu-plugin cbc-admin-2fa, admins = cbcadmin/anja/jan, janadmin slettet
- 03 par. 3.1: plugins/brugere; 06 par. 1.13: runbook for laast admin + korrekt reset-flow; 07 par. 10 + docx

Co-Authored-By: Claude Fable 5.1 <noreply@anthropic.com>
</commit_message>
<xml_diff>
--- a/drift/07-break-glass-adgang.docx
+++ b/drift/07-break-glass-adgang.docx
@@ -231,7 +231,7 @@
       <w:pPr>
         <w:pStyle w:val="NormalWeb"/>
         <w:shd w:val="clear" w:color="auto" w:fill="F7FBFA"/>
-        <w:divId w:val="1260865798"/>
+        <w:divId w:val="702361770"/>
         <w:rPr>
           <w:rFonts w:ascii="Calibri" w:hAnsi="Calibri" w:cs="Calibri"/>
           <w:sz w:val="21"/>
@@ -301,7 +301,7 @@
       <w:pPr>
         <w:pStyle w:val="NormalWeb"/>
         <w:shd w:val="clear" w:color="auto" w:fill="F7FBFA"/>
-        <w:divId w:val="1260865798"/>
+        <w:divId w:val="702361770"/>
         <w:rPr>
           <w:rFonts w:ascii="Calibri" w:hAnsi="Calibri" w:cs="Calibri"/>
           <w:sz w:val="21"/>
@@ -381,7 +381,7 @@
           <w:sz w:val="21"/>
           <w:szCs w:val="21"/>
         </w:rPr>
-        <w:pict w14:anchorId="05A5DD8C">
+        <w:pict w14:anchorId="4063DDBC">
           <v:rect id="_x0000_i1025" style="width:0;height:1.5pt" o:hralign="center" o:hrstd="t" o:hr="t" fillcolor="#a0a0a0" stroked="f"/>
         </w:pict>
       </w:r>
@@ -714,7 +714,7 @@
           <w:sz w:val="21"/>
           <w:szCs w:val="21"/>
         </w:rPr>
-        <w:pict w14:anchorId="4730E6A0">
+        <w:pict w14:anchorId="523E52E2">
           <v:rect id="_x0000_i1026" style="width:0;height:1.5pt" o:hralign="center" o:hrstd="t" o:hr="t" fillcolor="#a0a0a0" stroked="f"/>
         </w:pict>
       </w:r>
@@ -2290,7 +2290,7 @@
           <w:sz w:val="21"/>
           <w:szCs w:val="21"/>
         </w:rPr>
-        <w:pict w14:anchorId="3A0C6CC1">
+        <w:pict w14:anchorId="3BFE7CEC">
           <v:rect id="_x0000_i1027" style="width:0;height:1.5pt" o:hralign="center" o:hrstd="t" o:hr="t" fillcolor="#a0a0a0" stroked="f"/>
         </w:pict>
       </w:r>
@@ -3297,7 +3297,7 @@
           <w:sz w:val="21"/>
           <w:szCs w:val="21"/>
         </w:rPr>
-        <w:pict w14:anchorId="09B4FFC8">
+        <w:pict w14:anchorId="2D0B34E4">
           <v:rect id="_x0000_i1028" style="width:0;height:1.5pt" o:hralign="center" o:hrstd="t" o:hr="t" fillcolor="#a0a0a0" stroked="f"/>
         </w:pict>
       </w:r>
@@ -3629,7 +3629,7 @@
           <w:sz w:val="21"/>
           <w:szCs w:val="21"/>
         </w:rPr>
-        <w:pict w14:anchorId="7FC5630F">
+        <w:pict w14:anchorId="21F8C96D">
           <v:rect id="_x0000_i1029" style="width:0;height:1.5pt" o:hralign="center" o:hrstd="t" o:hr="t" fillcolor="#a0a0a0" stroked="f"/>
         </w:pict>
       </w:r>
@@ -3944,7 +3944,7 @@
           <w:sz w:val="21"/>
           <w:szCs w:val="21"/>
         </w:rPr>
-        <w:pict w14:anchorId="52763A9F">
+        <w:pict w14:anchorId="60540FB8">
           <v:rect id="_x0000_i1030" style="width:0;height:1.5pt" o:hralign="center" o:hrstd="t" o:hr="t" fillcolor="#a0a0a0" stroked="f"/>
         </w:pict>
       </w:r>
@@ -5643,7 +5643,7 @@
           <w:sz w:val="21"/>
           <w:szCs w:val="21"/>
         </w:rPr>
-        <w:pict w14:anchorId="1CB3CF7D">
+        <w:pict w14:anchorId="13EBFDBB">
           <v:rect id="_x0000_i1031" style="width:0;height:1.5pt" o:hralign="center" o:hrstd="t" o:hr="t" fillcolor="#a0a0a0" stroked="f"/>
         </w:pict>
       </w:r>
@@ -7150,7 +7150,7 @@
           <w:sz w:val="21"/>
           <w:szCs w:val="21"/>
         </w:rPr>
-        <w:pict w14:anchorId="392BAD33">
+        <w:pict w14:anchorId="5F71BA63">
           <v:rect id="_x0000_i1032" style="width:0;height:1.5pt" o:hralign="center" o:hrstd="t" o:hr="t" fillcolor="#a0a0a0" stroked="f"/>
         </w:pict>
       </w:r>
@@ -7690,7 +7690,7 @@
           <w:sz w:val="21"/>
           <w:szCs w:val="21"/>
         </w:rPr>
-        <w:pict w14:anchorId="5BA05F9B">
+        <w:pict w14:anchorId="29083E6F">
           <v:rect id="_x0000_i1033" style="width:0;height:1.5pt" o:hralign="center" o:hrstd="t" o:hr="t" fillcolor="#a0a0a0" stroked="f"/>
         </w:pict>
       </w:r>
@@ -7930,7 +7930,7 @@
       <w:pPr>
         <w:pStyle w:val="NormalWeb"/>
         <w:shd w:val="clear" w:color="auto" w:fill="F7FBFA"/>
-        <w:divId w:val="2091001658"/>
+        <w:divId w:val="1829133798"/>
         <w:rPr>
           <w:rFonts w:ascii="Calibri" w:hAnsi="Calibri" w:cs="Calibri"/>
           <w:sz w:val="21"/>
@@ -8383,7 +8383,7 @@
           <w:sz w:val="21"/>
           <w:szCs w:val="21"/>
         </w:rPr>
-        <w:pict w14:anchorId="3280B498">
+        <w:pict w14:anchorId="3C4FF354">
           <v:rect id="_x0000_i1034" style="width:0;height:1.5pt" o:hralign="center" o:hrstd="t" o:hr="t" fillcolor="#a0a0a0" stroked="f"/>
         </w:pict>
       </w:r>
@@ -9295,7 +9295,7 @@
           <w:sz w:val="21"/>
           <w:szCs w:val="21"/>
         </w:rPr>
-        <w:pict w14:anchorId="0E9D0BA8">
+        <w:pict w14:anchorId="6236B089">
           <v:rect id="_x0000_i1035" style="width:0;height:1.5pt" o:hralign="center" o:hrstd="t" o:hr="t" fillcolor="#a0a0a0" stroked="f"/>
         </w:pict>
       </w:r>
@@ -9738,7 +9738,102 @@
           <w:sz w:val="21"/>
           <w:szCs w:val="21"/>
         </w:rPr>
-        <w:t>Åbne sikkerhedspunkter pr. 2026-10-27</w:t>
+        <w:t>WP-admin-login på event.cbcit.dk kræver 2FA</w:t>
+      </w:r>
+      <w:r>
+        <w:rPr>
+          <w:rFonts w:ascii="Calibri" w:eastAsia="Times New Roman" w:hAnsi="Calibri" w:cs="Calibri"/>
+          <w:sz w:val="21"/>
+          <w:szCs w:val="21"/>
+        </w:rPr>
+        <w:t xml:space="preserve"> (siden 2026-10-28): admins er </w:t>
+      </w:r>
+      <w:r>
+        <w:rPr>
+          <w:rStyle w:val="HTML-kode"/>
+        </w:rPr>
+        <w:t>cbcadmin</w:t>
+      </w:r>
+      <w:r>
+        <w:rPr>
+          <w:rFonts w:ascii="Calibri" w:eastAsia="Times New Roman" w:hAnsi="Calibri" w:cs="Calibri"/>
+          <w:sz w:val="21"/>
+          <w:szCs w:val="21"/>
+        </w:rPr>
+        <w:t xml:space="preserve"> (johan@), </w:t>
+      </w:r>
+      <w:r>
+        <w:rPr>
+          <w:rStyle w:val="HTML-kode"/>
+        </w:rPr>
+        <w:t>anja@cbcit.dk</w:t>
+      </w:r>
+      <w:r>
+        <w:rPr>
+          <w:rFonts w:ascii="Calibri" w:eastAsia="Times New Roman" w:hAnsi="Calibri" w:cs="Calibri"/>
+          <w:sz w:val="21"/>
+          <w:szCs w:val="21"/>
+        </w:rPr>
+        <w:t xml:space="preserve">, </w:t>
+      </w:r>
+      <w:r>
+        <w:rPr>
+          <w:rStyle w:val="HTML-kode"/>
+        </w:rPr>
+        <w:t>jan@cbcit.dk</w:t>
+      </w:r>
+      <w:r>
+        <w:rPr>
+          <w:rFonts w:ascii="Calibri" w:eastAsia="Times New Roman" w:hAnsi="Calibri" w:cs="Calibri"/>
+          <w:sz w:val="21"/>
+          <w:szCs w:val="21"/>
+        </w:rPr>
+        <w:t xml:space="preserve"> — password + TOTP via </w:t>
+      </w:r>
+      <w:r>
+        <w:rPr>
+          <w:rStyle w:val="HTML-kode"/>
+        </w:rPr>
+        <w:t>wp-login.php</w:t>
+      </w:r>
+      <w:r>
+        <w:rPr>
+          <w:rFonts w:ascii="Calibri" w:eastAsia="Times New Roman" w:hAnsi="Calibri" w:cs="Calibri"/>
+          <w:sz w:val="21"/>
+          <w:szCs w:val="21"/>
+        </w:rPr>
+        <w:t xml:space="preserve"> </w:t>
+      </w:r>
+      <w:r>
+        <w:rPr>
+          <w:rFonts w:ascii="Calibri" w:eastAsia="Times New Roman" w:hAnsi="Calibri" w:cs="Calibri"/>
+          <w:sz w:val="21"/>
+          <w:szCs w:val="21"/>
+        </w:rPr>
+        <w:t>(bag CF-challenge); magic-link virker ikke for admins. Låst ude → driftsmanual 06 §1.13. Mister ALLE tre adgang: nulstil 2FA-meta via SSH som beskrevet dér.</w:t>
+      </w:r>
+    </w:p>
+    <w:p>
+      <w:pPr>
+        <w:numPr>
+          <w:ilvl w:val="0"/>
+          <w:numId w:val="18"/>
+        </w:numPr>
+        <w:spacing w:before="100" w:beforeAutospacing="1" w:after="100" w:afterAutospacing="1"/>
+        <w:rPr>
+          <w:rFonts w:ascii="Calibri" w:eastAsia="Times New Roman" w:hAnsi="Calibri" w:cs="Calibri"/>
+          <w:sz w:val="21"/>
+          <w:szCs w:val="21"/>
+        </w:rPr>
+      </w:pPr>
+      <w:r>
+        <w:rPr>
+          <w:rStyle w:val="Strk"/>
+          <w:rFonts w:ascii="Calibri" w:eastAsia="Times New Roman" w:hAnsi="Calibri" w:cs="Calibri"/>
+          <w:sz w:val="21"/>
+          <w:szCs w:val="21"/>
+        </w:rPr>
+        <w:t>Åbne sikkerhedspunkter pr. 2026-10-28</w:t>
       </w:r>
       <w:r>
         <w:rPr>
@@ -9769,7 +9864,7 @@
           <w:sz w:val="21"/>
           <w:szCs w:val="21"/>
         </w:rPr>
-        <w:t>2FA på alle WP-admins</w:t>
+        <w:t>2FA på cbcit.dk og datagaarden.dk</w:t>
       </w:r>
       <w:r>
         <w:rPr>
@@ -9785,7 +9880,7 @@
           <w:sz w:val="21"/>
           <w:szCs w:val="21"/>
         </w:rPr>
-        <w:t xml:space="preserve">(ingen har det; Wordfence Login Security ligger klar på cbcit/datagaarden) · datagaarden-ansatte nedgraderes fra administrator til editor · mail-DNS (SPF-oprydning cbcit.dk, DMARC → quarantine, DMARC + Brevo-DKIM for datagaarden.dk) · deaktivér All-in-One WP Migration på cbcit.dk · CF Origin-cert til datagaarden.dk · fjern TeamViewerQS.exe fra datagaarden.dk/Support · slet </w:t>
+        <w:t xml:space="preserve">(event er håndhævet; Wordfence Login Security-modulet ligger klar på de to andre) · datagaarden-ansatte nedgraderes fra administrator til editor · mail-DNS (SPF-oprydning cbcit.dk, DMARC → quarantine, DMARC + Brevo-DKIM for datagaarden.dk) · deaktivér All-in-One WP Migration på cbcit.dk · CF Origin-cert til datagaarden.dk · fjern TeamViewerQS.exe fra datagaarden.dk/Support · slet </w:t>
       </w:r>
       <w:r>
         <w:rPr>
@@ -9816,7 +9911,7 @@
           <w:sz w:val="21"/>
           <w:szCs w:val="21"/>
         </w:rPr>
-        <w:pict w14:anchorId="39D4D6BE">
+        <w:pict w14:anchorId="671F5B7F">
           <v:rect id="_x0000_i1036" style="width:0;height:1.5pt" o:hralign="center" o:hrstd="t" o:hr="t" fillcolor="#a0a0a0" stroked="f"/>
         </w:pict>
       </w:r>
@@ -10074,7 +10169,7 @@
       <w:pPr>
         <w:pStyle w:val="NormalWeb"/>
         <w:shd w:val="clear" w:color="auto" w:fill="F7FBFA"/>
-        <w:divId w:val="399014458"/>
+        <w:divId w:val="1925996066"/>
         <w:rPr>
           <w:rFonts w:ascii="Calibri" w:hAnsi="Calibri" w:cs="Calibri"/>
           <w:sz w:val="21"/>
@@ -10104,7 +10199,7 @@
           <w:sz w:val="21"/>
           <w:szCs w:val="21"/>
         </w:rPr>
-        <w:pict w14:anchorId="353EFF08">
+        <w:pict w14:anchorId="39060E46">
           <v:rect id="_x0000_i1037" style="width:0;height:1.5pt" o:hralign="center" o:hrstd="t" o:hr="t" fillcolor="#a0a0a0" stroked="f"/>
         </w:pict>
       </w:r>
@@ -10670,7 +10765,7 @@
           <w:sz w:val="21"/>
           <w:szCs w:val="21"/>
         </w:rPr>
-        <w:pict w14:anchorId="4CCA9EBC">
+        <w:pict w14:anchorId="385E65ED">
           <v:rect id="_x0000_i1038" style="width:0;height:1.5pt" o:hralign="center" o:hrstd="t" o:hr="t" fillcolor="#a0a0a0" stroked="f"/>
         </w:pict>
       </w:r>
@@ -10715,235 +10810,9 @@
 <file path=word/numbering.xml><?xml version="1.0" encoding="utf-8"?>
 <w:numbering xmlns:wpc="http://schemas.microsoft.com/office/word/2010/wordprocessingCanvas" xmlns:cx="http://schemas.microsoft.com/office/drawing/2014/chartex" xmlns:cx1="http://schemas.microsoft.com/office/drawing/2015/9/8/chartex" xmlns:cx2="http://schemas.microsoft.com/office/drawing/2015/10/21/chartex" xmlns:cx3="http://schemas.microsoft.com/office/drawing/2016/5/9/chartex" xmlns:cx4="http://schemas.microsoft.com/office/drawing/2016/5/10/chartex" xmlns:cx5="http://schemas.microsoft.com/office/drawing/2016/5/11/chartex" xmlns:cx6="http://schemas.microsoft.com/office/drawing/2016/5/12/chartex" xmlns:cx7="http://schemas.microsoft.com/office/drawing/2016/5/13/chartex" xmlns:cx8="http://schemas.microsoft.com/office/drawing/2016/5/14/chartex" xmlns:mc="http://schemas.openxmlformats.org/markup-compatibility/2006" xmlns:aink="http://schemas.microsoft.com/office/drawing/2016/ink" xmlns:am3d="http://schemas.microsoft.com/office/drawing/2017/model3d" xmlns:o="urn:schemas-microsoft-com:office:office" xmlns:oel="http://schemas.microsoft.com/office/2019/extlst" xmlns:r="http://schemas.openxmlformats.org/officeDocument/2006/relationships" xmlns:m="http://schemas.openxmlformats.org/officeDocument/2006/math" xmlns:v="urn:schemas-microsoft-com:vml" xmlns:wp14="http://schemas.microsoft.com/office/word/2010/wordprocessingDrawing" xmlns:wp="http://schemas.openxmlformats.org/drawingml/2006/wordprocessingDrawing" xmlns:w10="urn:schemas-microsoft-com:office:word" xmlns:w="http://schemas.openxmlformats.org/wordprocessingml/2006/main" xmlns:w14="http://schemas.microsoft.com/office/word/2010/wordml" xmlns:w15="http://schemas.microsoft.com/office/word/2012/wordml" xmlns:w16cex="http://schemas.microsoft.com/office/word/2018/wordml/cex" xmlns:w16cid="http://schemas.microsoft.com/office/word/2016/wordml/cid" xmlns:w16="http://schemas.microsoft.com/office/word/2018/wordml" xmlns:w16du="http://schemas.microsoft.com/office/word/2023/wordml/word16du" xmlns:w16sdtdh="http://schemas.microsoft.com/office/word/2020/wordml/sdtdatahash" xmlns:w16sdtfl="http://schemas.microsoft.com/office/word/2024/wordml/sdtformatlock" xmlns:w16se="http://schemas.microsoft.com/office/word/2015/wordml/symex" xmlns:wpg="http://schemas.microsoft.com/office/word/2010/wordprocessingGroup" xmlns:wpi="http://schemas.microsoft.com/office/word/2010/wordprocessingInk" xmlns:wne="http://schemas.microsoft.com/office/word/2006/wordml" xmlns:wps="http://schemas.microsoft.com/office/word/2010/wordprocessingShape" mc:Ignorable="w14 w15 w16se w16cid w16 w16cex w16sdtdh w16sdtfl w16du wp14">
   <w:abstractNum w:abstractNumId="0" w15:restartNumberingAfterBreak="0">
-    <w:nsid w:val="09007CA4"/>
+    <w:nsid w:val="14A5444B"/>
     <w:multiLevelType w:val="multilevel"/>
-    <w:tmpl w:val="ED8A8AF2"/>
-    <w:lvl w:ilvl="0">
-      <w:start w:val="1"/>
-      <w:numFmt w:val="decimal"/>
-      <w:lvlText w:val="%1."/>
-      <w:lvlJc w:val="left"/>
-      <w:pPr>
-        <w:tabs>
-          <w:tab w:val="num" w:pos="720"/>
-        </w:tabs>
-        <w:ind w:left="720" w:hanging="360"/>
-      </w:pPr>
-    </w:lvl>
-    <w:lvl w:ilvl="1" w:tentative="1">
-      <w:start w:val="1"/>
-      <w:numFmt w:val="decimal"/>
-      <w:lvlText w:val="%2."/>
-      <w:lvlJc w:val="left"/>
-      <w:pPr>
-        <w:tabs>
-          <w:tab w:val="num" w:pos="1440"/>
-        </w:tabs>
-        <w:ind w:left="1440" w:hanging="360"/>
-      </w:pPr>
-    </w:lvl>
-    <w:lvl w:ilvl="2" w:tentative="1">
-      <w:start w:val="1"/>
-      <w:numFmt w:val="decimal"/>
-      <w:lvlText w:val="%3."/>
-      <w:lvlJc w:val="left"/>
-      <w:pPr>
-        <w:tabs>
-          <w:tab w:val="num" w:pos="2160"/>
-        </w:tabs>
-        <w:ind w:left="2160" w:hanging="360"/>
-      </w:pPr>
-    </w:lvl>
-    <w:lvl w:ilvl="3" w:tentative="1">
-      <w:start w:val="1"/>
-      <w:numFmt w:val="decimal"/>
-      <w:lvlText w:val="%4."/>
-      <w:lvlJc w:val="left"/>
-      <w:pPr>
-        <w:tabs>
-          <w:tab w:val="num" w:pos="2880"/>
-        </w:tabs>
-        <w:ind w:left="2880" w:hanging="360"/>
-      </w:pPr>
-    </w:lvl>
-    <w:lvl w:ilvl="4" w:tentative="1">
-      <w:start w:val="1"/>
-      <w:numFmt w:val="decimal"/>
-      <w:lvlText w:val="%5."/>
-      <w:lvlJc w:val="left"/>
-      <w:pPr>
-        <w:tabs>
-          <w:tab w:val="num" w:pos="3600"/>
-        </w:tabs>
-        <w:ind w:left="3600" w:hanging="360"/>
-      </w:pPr>
-    </w:lvl>
-    <w:lvl w:ilvl="5" w:tentative="1">
-      <w:start w:val="1"/>
-      <w:numFmt w:val="decimal"/>
-      <w:lvlText w:val="%6."/>
-      <w:lvlJc w:val="left"/>
-      <w:pPr>
-        <w:tabs>
-          <w:tab w:val="num" w:pos="4320"/>
-        </w:tabs>
-        <w:ind w:left="4320" w:hanging="360"/>
-      </w:pPr>
-    </w:lvl>
-    <w:lvl w:ilvl="6" w:tentative="1">
-      <w:start w:val="1"/>
-      <w:numFmt w:val="decimal"/>
-      <w:lvlText w:val="%7."/>
-      <w:lvlJc w:val="left"/>
-      <w:pPr>
-        <w:tabs>
-          <w:tab w:val="num" w:pos="5040"/>
-        </w:tabs>
-        <w:ind w:left="5040" w:hanging="360"/>
-      </w:pPr>
-    </w:lvl>
-    <w:lvl w:ilvl="7" w:tentative="1">
-      <w:start w:val="1"/>
-      <w:numFmt w:val="decimal"/>
-      <w:lvlText w:val="%8."/>
-      <w:lvlJc w:val="left"/>
-      <w:pPr>
-        <w:tabs>
-          <w:tab w:val="num" w:pos="5760"/>
-        </w:tabs>
-        <w:ind w:left="5760" w:hanging="360"/>
-      </w:pPr>
-    </w:lvl>
-    <w:lvl w:ilvl="8" w:tentative="1">
-      <w:start w:val="1"/>
-      <w:numFmt w:val="decimal"/>
-      <w:lvlText w:val="%9."/>
-      <w:lvlJc w:val="left"/>
-      <w:pPr>
-        <w:tabs>
-          <w:tab w:val="num" w:pos="6480"/>
-        </w:tabs>
-        <w:ind w:left="6480" w:hanging="360"/>
-      </w:pPr>
-    </w:lvl>
-  </w:abstractNum>
-  <w:abstractNum w:abstractNumId="1" w15:restartNumberingAfterBreak="0">
-    <w:nsid w:val="17BE0A79"/>
-    <w:multiLevelType w:val="multilevel"/>
-    <w:tmpl w:val="A30A47E8"/>
-    <w:lvl w:ilvl="0">
-      <w:start w:val="1"/>
-      <w:numFmt w:val="decimal"/>
-      <w:lvlText w:val="%1."/>
-      <w:lvlJc w:val="left"/>
-      <w:pPr>
-        <w:tabs>
-          <w:tab w:val="num" w:pos="720"/>
-        </w:tabs>
-        <w:ind w:left="720" w:hanging="360"/>
-      </w:pPr>
-    </w:lvl>
-    <w:lvl w:ilvl="1" w:tentative="1">
-      <w:start w:val="1"/>
-      <w:numFmt w:val="decimal"/>
-      <w:lvlText w:val="%2."/>
-      <w:lvlJc w:val="left"/>
-      <w:pPr>
-        <w:tabs>
-          <w:tab w:val="num" w:pos="1440"/>
-        </w:tabs>
-        <w:ind w:left="1440" w:hanging="360"/>
-      </w:pPr>
-    </w:lvl>
-    <w:lvl w:ilvl="2" w:tentative="1">
-      <w:start w:val="1"/>
-      <w:numFmt w:val="decimal"/>
-      <w:lvlText w:val="%3."/>
-      <w:lvlJc w:val="left"/>
-      <w:pPr>
-        <w:tabs>
-          <w:tab w:val="num" w:pos="2160"/>
-        </w:tabs>
-        <w:ind w:left="2160" w:hanging="360"/>
-      </w:pPr>
-    </w:lvl>
-    <w:lvl w:ilvl="3" w:tentative="1">
-      <w:start w:val="1"/>
-      <w:numFmt w:val="decimal"/>
-      <w:lvlText w:val="%4."/>
-      <w:lvlJc w:val="left"/>
-      <w:pPr>
-        <w:tabs>
-          <w:tab w:val="num" w:pos="2880"/>
-        </w:tabs>
-        <w:ind w:left="2880" w:hanging="360"/>
-      </w:pPr>
-    </w:lvl>
-    <w:lvl w:ilvl="4" w:tentative="1">
-      <w:start w:val="1"/>
-      <w:numFmt w:val="decimal"/>
-      <w:lvlText w:val="%5."/>
-      <w:lvlJc w:val="left"/>
-      <w:pPr>
-        <w:tabs>
-          <w:tab w:val="num" w:pos="3600"/>
-        </w:tabs>
-        <w:ind w:left="3600" w:hanging="360"/>
-      </w:pPr>
-    </w:lvl>
-    <w:lvl w:ilvl="5" w:tentative="1">
-      <w:start w:val="1"/>
-      <w:numFmt w:val="decimal"/>
-      <w:lvlText w:val="%6."/>
-      <w:lvlJc w:val="left"/>
-      <w:pPr>
-        <w:tabs>
-          <w:tab w:val="num" w:pos="4320"/>
-        </w:tabs>
-        <w:ind w:left="4320" w:hanging="360"/>
-      </w:pPr>
-    </w:lvl>
-    <w:lvl w:ilvl="6" w:tentative="1">
-      <w:start w:val="1"/>
-      <w:numFmt w:val="decimal"/>
-      <w:lvlText w:val="%7."/>
-      <w:lvlJc w:val="left"/>
-      <w:pPr>
-        <w:tabs>
-          <w:tab w:val="num" w:pos="5040"/>
-        </w:tabs>
-        <w:ind w:left="5040" w:hanging="360"/>
-      </w:pPr>
-    </w:lvl>
-    <w:lvl w:ilvl="7" w:tentative="1">
-      <w:start w:val="1"/>
-      <w:numFmt w:val="decimal"/>
-      <w:lvlText w:val="%8."/>
-      <w:lvlJc w:val="left"/>
-      <w:pPr>
-        <w:tabs>
-          <w:tab w:val="num" w:pos="5760"/>
-        </w:tabs>
-        <w:ind w:left="5760" w:hanging="360"/>
-      </w:pPr>
-    </w:lvl>
-    <w:lvl w:ilvl="8" w:tentative="1">
-      <w:start w:val="1"/>
-      <w:numFmt w:val="decimal"/>
-      <w:lvlText w:val="%9."/>
-      <w:lvlJc w:val="left"/>
-      <w:pPr>
-        <w:tabs>
-          <w:tab w:val="num" w:pos="6480"/>
-        </w:tabs>
-        <w:ind w:left="6480" w:hanging="360"/>
-      </w:pPr>
-    </w:lvl>
-  </w:abstractNum>
-  <w:abstractNum w:abstractNumId="2" w15:restartNumberingAfterBreak="0">
-    <w:nsid w:val="211973BB"/>
-    <w:multiLevelType w:val="multilevel"/>
-    <w:tmpl w:val="2C2E6F2C"/>
+    <w:tmpl w:val="55AAE3C6"/>
     <w:lvl w:ilvl="0">
       <w:start w:val="1"/>
       <w:numFmt w:val="bullet"/>
@@ -11089,10 +10958,10 @@
       </w:rPr>
     </w:lvl>
   </w:abstractNum>
-  <w:abstractNum w:abstractNumId="3" w15:restartNumberingAfterBreak="0">
-    <w:nsid w:val="21DC30F0"/>
+  <w:abstractNum w:abstractNumId="1" w15:restartNumberingAfterBreak="0">
+    <w:nsid w:val="14BA4AE3"/>
     <w:multiLevelType w:val="multilevel"/>
-    <w:tmpl w:val="45E0FC50"/>
+    <w:tmpl w:val="40C07366"/>
     <w:lvl w:ilvl="0">
       <w:start w:val="1"/>
       <w:numFmt w:val="bullet"/>
@@ -11238,10 +11107,10 @@
       </w:rPr>
     </w:lvl>
   </w:abstractNum>
-  <w:abstractNum w:abstractNumId="4" w15:restartNumberingAfterBreak="0">
-    <w:nsid w:val="23AE07DE"/>
+  <w:abstractNum w:abstractNumId="2" w15:restartNumberingAfterBreak="0">
+    <w:nsid w:val="160C7273"/>
     <w:multiLevelType w:val="multilevel"/>
-    <w:tmpl w:val="F1EA2AB4"/>
+    <w:tmpl w:val="DE064B6A"/>
     <w:lvl w:ilvl="0">
       <w:start w:val="1"/>
       <w:numFmt w:val="bullet"/>
@@ -11387,10 +11256,10 @@
       </w:rPr>
     </w:lvl>
   </w:abstractNum>
-  <w:abstractNum w:abstractNumId="5" w15:restartNumberingAfterBreak="0">
-    <w:nsid w:val="3CB6602F"/>
+  <w:abstractNum w:abstractNumId="3" w15:restartNumberingAfterBreak="0">
+    <w:nsid w:val="1B705118"/>
     <w:multiLevelType w:val="multilevel"/>
-    <w:tmpl w:val="65781ADA"/>
+    <w:tmpl w:val="8ABA84E8"/>
     <w:lvl w:ilvl="0">
       <w:start w:val="1"/>
       <w:numFmt w:val="bullet"/>
@@ -11536,10 +11405,349 @@
       </w:rPr>
     </w:lvl>
   </w:abstractNum>
+  <w:abstractNum w:abstractNumId="4" w15:restartNumberingAfterBreak="0">
+    <w:nsid w:val="25B66E48"/>
+    <w:multiLevelType w:val="multilevel"/>
+    <w:tmpl w:val="056427B6"/>
+    <w:lvl w:ilvl="0">
+      <w:start w:val="1"/>
+      <w:numFmt w:val="decimal"/>
+      <w:lvlText w:val="%1."/>
+      <w:lvlJc w:val="left"/>
+      <w:pPr>
+        <w:tabs>
+          <w:tab w:val="num" w:pos="720"/>
+        </w:tabs>
+        <w:ind w:left="720" w:hanging="360"/>
+      </w:pPr>
+    </w:lvl>
+    <w:lvl w:ilvl="1" w:tentative="1">
+      <w:start w:val="1"/>
+      <w:numFmt w:val="decimal"/>
+      <w:lvlText w:val="%2."/>
+      <w:lvlJc w:val="left"/>
+      <w:pPr>
+        <w:tabs>
+          <w:tab w:val="num" w:pos="1440"/>
+        </w:tabs>
+        <w:ind w:left="1440" w:hanging="360"/>
+      </w:pPr>
+    </w:lvl>
+    <w:lvl w:ilvl="2" w:tentative="1">
+      <w:start w:val="1"/>
+      <w:numFmt w:val="decimal"/>
+      <w:lvlText w:val="%3."/>
+      <w:lvlJc w:val="left"/>
+      <w:pPr>
+        <w:tabs>
+          <w:tab w:val="num" w:pos="2160"/>
+        </w:tabs>
+        <w:ind w:left="2160" w:hanging="360"/>
+      </w:pPr>
+    </w:lvl>
+    <w:lvl w:ilvl="3" w:tentative="1">
+      <w:start w:val="1"/>
+      <w:numFmt w:val="decimal"/>
+      <w:lvlText w:val="%4."/>
+      <w:lvlJc w:val="left"/>
+      <w:pPr>
+        <w:tabs>
+          <w:tab w:val="num" w:pos="2880"/>
+        </w:tabs>
+        <w:ind w:left="2880" w:hanging="360"/>
+      </w:pPr>
+    </w:lvl>
+    <w:lvl w:ilvl="4" w:tentative="1">
+      <w:start w:val="1"/>
+      <w:numFmt w:val="decimal"/>
+      <w:lvlText w:val="%5."/>
+      <w:lvlJc w:val="left"/>
+      <w:pPr>
+        <w:tabs>
+          <w:tab w:val="num" w:pos="3600"/>
+        </w:tabs>
+        <w:ind w:left="3600" w:hanging="360"/>
+      </w:pPr>
+    </w:lvl>
+    <w:lvl w:ilvl="5" w:tentative="1">
+      <w:start w:val="1"/>
+      <w:numFmt w:val="decimal"/>
+      <w:lvlText w:val="%6."/>
+      <w:lvlJc w:val="left"/>
+      <w:pPr>
+        <w:tabs>
+          <w:tab w:val="num" w:pos="4320"/>
+        </w:tabs>
+        <w:ind w:left="4320" w:hanging="360"/>
+      </w:pPr>
+    </w:lvl>
+    <w:lvl w:ilvl="6" w:tentative="1">
+      <w:start w:val="1"/>
+      <w:numFmt w:val="decimal"/>
+      <w:lvlText w:val="%7."/>
+      <w:lvlJc w:val="left"/>
+      <w:pPr>
+        <w:tabs>
+          <w:tab w:val="num" w:pos="5040"/>
+        </w:tabs>
+        <w:ind w:left="5040" w:hanging="360"/>
+      </w:pPr>
+    </w:lvl>
+    <w:lvl w:ilvl="7" w:tentative="1">
+      <w:start w:val="1"/>
+      <w:numFmt w:val="decimal"/>
+      <w:lvlText w:val="%8."/>
+      <w:lvlJc w:val="left"/>
+      <w:pPr>
+        <w:tabs>
+          <w:tab w:val="num" w:pos="5760"/>
+        </w:tabs>
+        <w:ind w:left="5760" w:hanging="360"/>
+      </w:pPr>
+    </w:lvl>
+    <w:lvl w:ilvl="8" w:tentative="1">
+      <w:start w:val="1"/>
+      <w:numFmt w:val="decimal"/>
+      <w:lvlText w:val="%9."/>
+      <w:lvlJc w:val="left"/>
+      <w:pPr>
+        <w:tabs>
+          <w:tab w:val="num" w:pos="6480"/>
+        </w:tabs>
+        <w:ind w:left="6480" w:hanging="360"/>
+      </w:pPr>
+    </w:lvl>
+  </w:abstractNum>
+  <w:abstractNum w:abstractNumId="5" w15:restartNumberingAfterBreak="0">
+    <w:nsid w:val="2F7714BB"/>
+    <w:multiLevelType w:val="multilevel"/>
+    <w:tmpl w:val="0088D038"/>
+    <w:lvl w:ilvl="0">
+      <w:start w:val="1"/>
+      <w:numFmt w:val="decimal"/>
+      <w:lvlText w:val="%1."/>
+      <w:lvlJc w:val="left"/>
+      <w:pPr>
+        <w:tabs>
+          <w:tab w:val="num" w:pos="720"/>
+        </w:tabs>
+        <w:ind w:left="720" w:hanging="360"/>
+      </w:pPr>
+    </w:lvl>
+    <w:lvl w:ilvl="1" w:tentative="1">
+      <w:start w:val="1"/>
+      <w:numFmt w:val="decimal"/>
+      <w:lvlText w:val="%2."/>
+      <w:lvlJc w:val="left"/>
+      <w:pPr>
+        <w:tabs>
+          <w:tab w:val="num" w:pos="1440"/>
+        </w:tabs>
+        <w:ind w:left="1440" w:hanging="360"/>
+      </w:pPr>
+    </w:lvl>
+    <w:lvl w:ilvl="2" w:tentative="1">
+      <w:start w:val="1"/>
+      <w:numFmt w:val="decimal"/>
+      <w:lvlText w:val="%3."/>
+      <w:lvlJc w:val="left"/>
+      <w:pPr>
+        <w:tabs>
+          <w:tab w:val="num" w:pos="2160"/>
+        </w:tabs>
+        <w:ind w:left="2160" w:hanging="360"/>
+      </w:pPr>
+    </w:lvl>
+    <w:lvl w:ilvl="3" w:tentative="1">
+      <w:start w:val="1"/>
+      <w:numFmt w:val="decimal"/>
+      <w:lvlText w:val="%4."/>
+      <w:lvlJc w:val="left"/>
+      <w:pPr>
+        <w:tabs>
+          <w:tab w:val="num" w:pos="2880"/>
+        </w:tabs>
+        <w:ind w:left="2880" w:hanging="360"/>
+      </w:pPr>
+    </w:lvl>
+    <w:lvl w:ilvl="4" w:tentative="1">
+      <w:start w:val="1"/>
+      <w:numFmt w:val="decimal"/>
+      <w:lvlText w:val="%5."/>
+      <w:lvlJc w:val="left"/>
+      <w:pPr>
+        <w:tabs>
+          <w:tab w:val="num" w:pos="3600"/>
+        </w:tabs>
+        <w:ind w:left="3600" w:hanging="360"/>
+      </w:pPr>
+    </w:lvl>
+    <w:lvl w:ilvl="5" w:tentative="1">
+      <w:start w:val="1"/>
+      <w:numFmt w:val="decimal"/>
+      <w:lvlText w:val="%6."/>
+      <w:lvlJc w:val="left"/>
+      <w:pPr>
+        <w:tabs>
+          <w:tab w:val="num" w:pos="4320"/>
+        </w:tabs>
+        <w:ind w:left="4320" w:hanging="360"/>
+      </w:pPr>
+    </w:lvl>
+    <w:lvl w:ilvl="6" w:tentative="1">
+      <w:start w:val="1"/>
+      <w:numFmt w:val="decimal"/>
+      <w:lvlText w:val="%7."/>
+      <w:lvlJc w:val="left"/>
+      <w:pPr>
+        <w:tabs>
+          <w:tab w:val="num" w:pos="5040"/>
+        </w:tabs>
+        <w:ind w:left="5040" w:hanging="360"/>
+      </w:pPr>
+    </w:lvl>
+    <w:lvl w:ilvl="7" w:tentative="1">
+      <w:start w:val="1"/>
+      <w:numFmt w:val="decimal"/>
+      <w:lvlText w:val="%8."/>
+      <w:lvlJc w:val="left"/>
+      <w:pPr>
+        <w:tabs>
+          <w:tab w:val="num" w:pos="5760"/>
+        </w:tabs>
+        <w:ind w:left="5760" w:hanging="360"/>
+      </w:pPr>
+    </w:lvl>
+    <w:lvl w:ilvl="8" w:tentative="1">
+      <w:start w:val="1"/>
+      <w:numFmt w:val="decimal"/>
+      <w:lvlText w:val="%9."/>
+      <w:lvlJc w:val="left"/>
+      <w:pPr>
+        <w:tabs>
+          <w:tab w:val="num" w:pos="6480"/>
+        </w:tabs>
+        <w:ind w:left="6480" w:hanging="360"/>
+      </w:pPr>
+    </w:lvl>
+  </w:abstractNum>
   <w:abstractNum w:abstractNumId="6" w15:restartNumberingAfterBreak="0">
-    <w:nsid w:val="3DC9013E"/>
+    <w:nsid w:val="32BB6637"/>
     <w:multiLevelType w:val="multilevel"/>
-    <w:tmpl w:val="C4021F3C"/>
+    <w:tmpl w:val="1AEC2058"/>
+    <w:lvl w:ilvl="0">
+      <w:start w:val="1"/>
+      <w:numFmt w:val="decimal"/>
+      <w:lvlText w:val="%1."/>
+      <w:lvlJc w:val="left"/>
+      <w:pPr>
+        <w:tabs>
+          <w:tab w:val="num" w:pos="720"/>
+        </w:tabs>
+        <w:ind w:left="720" w:hanging="360"/>
+      </w:pPr>
+    </w:lvl>
+    <w:lvl w:ilvl="1" w:tentative="1">
+      <w:start w:val="1"/>
+      <w:numFmt w:val="decimal"/>
+      <w:lvlText w:val="%2."/>
+      <w:lvlJc w:val="left"/>
+      <w:pPr>
+        <w:tabs>
+          <w:tab w:val="num" w:pos="1440"/>
+        </w:tabs>
+        <w:ind w:left="1440" w:hanging="360"/>
+      </w:pPr>
+    </w:lvl>
+    <w:lvl w:ilvl="2" w:tentative="1">
+      <w:start w:val="1"/>
+      <w:numFmt w:val="decimal"/>
+      <w:lvlText w:val="%3."/>
+      <w:lvlJc w:val="left"/>
+      <w:pPr>
+        <w:tabs>
+          <w:tab w:val="num" w:pos="2160"/>
+        </w:tabs>
+        <w:ind w:left="2160" w:hanging="360"/>
+      </w:pPr>
+    </w:lvl>
+    <w:lvl w:ilvl="3" w:tentative="1">
+      <w:start w:val="1"/>
+      <w:numFmt w:val="decimal"/>
+      <w:lvlText w:val="%4."/>
+      <w:lvlJc w:val="left"/>
+      <w:pPr>
+        <w:tabs>
+          <w:tab w:val="num" w:pos="2880"/>
+        </w:tabs>
+        <w:ind w:left="2880" w:hanging="360"/>
+      </w:pPr>
+    </w:lvl>
+    <w:lvl w:ilvl="4" w:tentative="1">
+      <w:start w:val="1"/>
+      <w:numFmt w:val="decimal"/>
+      <w:lvlText w:val="%5."/>
+      <w:lvlJc w:val="left"/>
+      <w:pPr>
+        <w:tabs>
+          <w:tab w:val="num" w:pos="3600"/>
+        </w:tabs>
+        <w:ind w:left="3600" w:hanging="360"/>
+      </w:pPr>
+    </w:lvl>
+    <w:lvl w:ilvl="5" w:tentative="1">
+      <w:start w:val="1"/>
+      <w:numFmt w:val="decimal"/>
+      <w:lvlText w:val="%6."/>
+      <w:lvlJc w:val="left"/>
+      <w:pPr>
+        <w:tabs>
+          <w:tab w:val="num" w:pos="4320"/>
+        </w:tabs>
+        <w:ind w:left="4320" w:hanging="360"/>
+      </w:pPr>
+    </w:lvl>
+    <w:lvl w:ilvl="6" w:tentative="1">
+      <w:start w:val="1"/>
+      <w:numFmt w:val="decimal"/>
+      <w:lvlText w:val="%7."/>
+      <w:lvlJc w:val="left"/>
+      <w:pPr>
+        <w:tabs>
+          <w:tab w:val="num" w:pos="5040"/>
+        </w:tabs>
+        <w:ind w:left="5040" w:hanging="360"/>
+      </w:pPr>
+    </w:lvl>
+    <w:lvl w:ilvl="7" w:tentative="1">
+      <w:start w:val="1"/>
+      <w:numFmt w:val="decimal"/>
+      <w:lvlText w:val="%8."/>
+      <w:lvlJc w:val="left"/>
+      <w:pPr>
+        <w:tabs>
+          <w:tab w:val="num" w:pos="5760"/>
+        </w:tabs>
+        <w:ind w:left="5760" w:hanging="360"/>
+      </w:pPr>
+    </w:lvl>
+    <w:lvl w:ilvl="8" w:tentative="1">
+      <w:start w:val="1"/>
+      <w:numFmt w:val="decimal"/>
+      <w:lvlText w:val="%9."/>
+      <w:lvlJc w:val="left"/>
+      <w:pPr>
+        <w:tabs>
+          <w:tab w:val="num" w:pos="6480"/>
+        </w:tabs>
+        <w:ind w:left="6480" w:hanging="360"/>
+      </w:pPr>
+    </w:lvl>
+  </w:abstractNum>
+  <w:abstractNum w:abstractNumId="7" w15:restartNumberingAfterBreak="0">
+    <w:nsid w:val="33BA32B5"/>
+    <w:multiLevelType w:val="multilevel"/>
+    <w:tmpl w:val="EA2E6B4A"/>
     <w:lvl w:ilvl="0">
       <w:start w:val="1"/>
       <w:numFmt w:val="bullet"/>
@@ -11685,10 +11893,10 @@
       </w:rPr>
     </w:lvl>
   </w:abstractNum>
-  <w:abstractNum w:abstractNumId="7" w15:restartNumberingAfterBreak="0">
-    <w:nsid w:val="444724E2"/>
+  <w:abstractNum w:abstractNumId="8" w15:restartNumberingAfterBreak="0">
+    <w:nsid w:val="33DC427E"/>
     <w:multiLevelType w:val="multilevel"/>
-    <w:tmpl w:val="7D1282D0"/>
+    <w:tmpl w:val="329E256E"/>
     <w:lvl w:ilvl="0">
       <w:start w:val="1"/>
       <w:numFmt w:val="bullet"/>
@@ -11834,10 +12042,10 @@
       </w:rPr>
     </w:lvl>
   </w:abstractNum>
-  <w:abstractNum w:abstractNumId="8" w15:restartNumberingAfterBreak="0">
-    <w:nsid w:val="50D709D8"/>
+  <w:abstractNum w:abstractNumId="9" w15:restartNumberingAfterBreak="0">
+    <w:nsid w:val="4A3056C0"/>
     <w:multiLevelType w:val="multilevel"/>
-    <w:tmpl w:val="BB80B940"/>
+    <w:tmpl w:val="8DD4920A"/>
     <w:lvl w:ilvl="0">
       <w:start w:val="1"/>
       <w:numFmt w:val="bullet"/>
@@ -11983,10 +12191,10 @@
       </w:rPr>
     </w:lvl>
   </w:abstractNum>
-  <w:abstractNum w:abstractNumId="9" w15:restartNumberingAfterBreak="0">
-    <w:nsid w:val="568335EE"/>
+  <w:abstractNum w:abstractNumId="10" w15:restartNumberingAfterBreak="0">
+    <w:nsid w:val="4B9C6D0E"/>
     <w:multiLevelType w:val="multilevel"/>
-    <w:tmpl w:val="4394FC5A"/>
+    <w:tmpl w:val="FC3EA2EE"/>
     <w:lvl w:ilvl="0">
       <w:start w:val="1"/>
       <w:numFmt w:val="bullet"/>
@@ -12132,236 +12340,10 @@
       </w:rPr>
     </w:lvl>
   </w:abstractNum>
-  <w:abstractNum w:abstractNumId="10" w15:restartNumberingAfterBreak="0">
-    <w:nsid w:val="631438B0"/>
+  <w:abstractNum w:abstractNumId="11" w15:restartNumberingAfterBreak="0">
+    <w:nsid w:val="613E62E4"/>
     <w:multiLevelType w:val="multilevel"/>
-    <w:tmpl w:val="1070E4BC"/>
-    <w:lvl w:ilvl="0">
-      <w:start w:val="1"/>
-      <w:numFmt w:val="decimal"/>
-      <w:lvlText w:val="%1."/>
-      <w:lvlJc w:val="left"/>
-      <w:pPr>
-        <w:tabs>
-          <w:tab w:val="num" w:pos="720"/>
-        </w:tabs>
-        <w:ind w:left="720" w:hanging="360"/>
-      </w:pPr>
-    </w:lvl>
-    <w:lvl w:ilvl="1" w:tentative="1">
-      <w:start w:val="1"/>
-      <w:numFmt w:val="decimal"/>
-      <w:lvlText w:val="%2."/>
-      <w:lvlJc w:val="left"/>
-      <w:pPr>
-        <w:tabs>
-          <w:tab w:val="num" w:pos="1440"/>
-        </w:tabs>
-        <w:ind w:left="1440" w:hanging="360"/>
-      </w:pPr>
-    </w:lvl>
-    <w:lvl w:ilvl="2" w:tentative="1">
-      <w:start w:val="1"/>
-      <w:numFmt w:val="decimal"/>
-      <w:lvlText w:val="%3."/>
-      <w:lvlJc w:val="left"/>
-      <w:pPr>
-        <w:tabs>
-          <w:tab w:val="num" w:pos="2160"/>
-        </w:tabs>
-        <w:ind w:left="2160" w:hanging="360"/>
-      </w:pPr>
-    </w:lvl>
-    <w:lvl w:ilvl="3" w:tentative="1">
-      <w:start w:val="1"/>
-      <w:numFmt w:val="decimal"/>
-      <w:lvlText w:val="%4."/>
-      <w:lvlJc w:val="left"/>
-      <w:pPr>
-        <w:tabs>
-          <w:tab w:val="num" w:pos="2880"/>
-        </w:tabs>
-        <w:ind w:left="2880" w:hanging="360"/>
-      </w:pPr>
-    </w:lvl>
-    <w:lvl w:ilvl="4" w:tentative="1">
-      <w:start w:val="1"/>
-      <w:numFmt w:val="decimal"/>
-      <w:lvlText w:val="%5."/>
-      <w:lvlJc w:val="left"/>
-      <w:pPr>
-        <w:tabs>
-          <w:tab w:val="num" w:pos="3600"/>
-        </w:tabs>
-        <w:ind w:left="3600" w:hanging="360"/>
-      </w:pPr>
-    </w:lvl>
-    <w:lvl w:ilvl="5" w:tentative="1">
-      <w:start w:val="1"/>
-      <w:numFmt w:val="decimal"/>
-      <w:lvlText w:val="%6."/>
-      <w:lvlJc w:val="left"/>
-      <w:pPr>
-        <w:tabs>
-          <w:tab w:val="num" w:pos="4320"/>
-        </w:tabs>
-        <w:ind w:left="4320" w:hanging="360"/>
-      </w:pPr>
-    </w:lvl>
-    <w:lvl w:ilvl="6" w:tentative="1">
-      <w:start w:val="1"/>
-      <w:numFmt w:val="decimal"/>
-      <w:lvlText w:val="%7."/>
-      <w:lvlJc w:val="left"/>
-      <w:pPr>
-        <w:tabs>
-          <w:tab w:val="num" w:pos="5040"/>
-        </w:tabs>
-        <w:ind w:left="5040" w:hanging="360"/>
-      </w:pPr>
-    </w:lvl>
-    <w:lvl w:ilvl="7" w:tentative="1">
-      <w:start w:val="1"/>
-      <w:numFmt w:val="decimal"/>
-      <w:lvlText w:val="%8."/>
-      <w:lvlJc w:val="left"/>
-      <w:pPr>
-        <w:tabs>
-          <w:tab w:val="num" w:pos="5760"/>
-        </w:tabs>
-        <w:ind w:left="5760" w:hanging="360"/>
-      </w:pPr>
-    </w:lvl>
-    <w:lvl w:ilvl="8" w:tentative="1">
-      <w:start w:val="1"/>
-      <w:numFmt w:val="decimal"/>
-      <w:lvlText w:val="%9."/>
-      <w:lvlJc w:val="left"/>
-      <w:pPr>
-        <w:tabs>
-          <w:tab w:val="num" w:pos="6480"/>
-        </w:tabs>
-        <w:ind w:left="6480" w:hanging="360"/>
-      </w:pPr>
-    </w:lvl>
-  </w:abstractNum>
-  <w:abstractNum w:abstractNumId="11" w15:restartNumberingAfterBreak="0">
-    <w:nsid w:val="69F47147"/>
-    <w:multiLevelType w:val="multilevel"/>
-    <w:tmpl w:val="E2A0D43E"/>
-    <w:lvl w:ilvl="0">
-      <w:start w:val="1"/>
-      <w:numFmt w:val="decimal"/>
-      <w:lvlText w:val="%1."/>
-      <w:lvlJc w:val="left"/>
-      <w:pPr>
-        <w:tabs>
-          <w:tab w:val="num" w:pos="720"/>
-        </w:tabs>
-        <w:ind w:left="720" w:hanging="360"/>
-      </w:pPr>
-    </w:lvl>
-    <w:lvl w:ilvl="1" w:tentative="1">
-      <w:start w:val="1"/>
-      <w:numFmt w:val="decimal"/>
-      <w:lvlText w:val="%2."/>
-      <w:lvlJc w:val="left"/>
-      <w:pPr>
-        <w:tabs>
-          <w:tab w:val="num" w:pos="1440"/>
-        </w:tabs>
-        <w:ind w:left="1440" w:hanging="360"/>
-      </w:pPr>
-    </w:lvl>
-    <w:lvl w:ilvl="2" w:tentative="1">
-      <w:start w:val="1"/>
-      <w:numFmt w:val="decimal"/>
-      <w:lvlText w:val="%3."/>
-      <w:lvlJc w:val="left"/>
-      <w:pPr>
-        <w:tabs>
-          <w:tab w:val="num" w:pos="2160"/>
-        </w:tabs>
-        <w:ind w:left="2160" w:hanging="360"/>
-      </w:pPr>
-    </w:lvl>
-    <w:lvl w:ilvl="3" w:tentative="1">
-      <w:start w:val="1"/>
-      <w:numFmt w:val="decimal"/>
-      <w:lvlText w:val="%4."/>
-      <w:lvlJc w:val="left"/>
-      <w:pPr>
-        <w:tabs>
-          <w:tab w:val="num" w:pos="2880"/>
-        </w:tabs>
-        <w:ind w:left="2880" w:hanging="360"/>
-      </w:pPr>
-    </w:lvl>
-    <w:lvl w:ilvl="4" w:tentative="1">
-      <w:start w:val="1"/>
-      <w:numFmt w:val="decimal"/>
-      <w:lvlText w:val="%5."/>
-      <w:lvlJc w:val="left"/>
-      <w:pPr>
-        <w:tabs>
-          <w:tab w:val="num" w:pos="3600"/>
-        </w:tabs>
-        <w:ind w:left="3600" w:hanging="360"/>
-      </w:pPr>
-    </w:lvl>
-    <w:lvl w:ilvl="5" w:tentative="1">
-      <w:start w:val="1"/>
-      <w:numFmt w:val="decimal"/>
-      <w:lvlText w:val="%6."/>
-      <w:lvlJc w:val="left"/>
-      <w:pPr>
-        <w:tabs>
-          <w:tab w:val="num" w:pos="4320"/>
-        </w:tabs>
-        <w:ind w:left="4320" w:hanging="360"/>
-      </w:pPr>
-    </w:lvl>
-    <w:lvl w:ilvl="6" w:tentative="1">
-      <w:start w:val="1"/>
-      <w:numFmt w:val="decimal"/>
-      <w:lvlText w:val="%7."/>
-      <w:lvlJc w:val="left"/>
-      <w:pPr>
-        <w:tabs>
-          <w:tab w:val="num" w:pos="5040"/>
-        </w:tabs>
-        <w:ind w:left="5040" w:hanging="360"/>
-      </w:pPr>
-    </w:lvl>
-    <w:lvl w:ilvl="7" w:tentative="1">
-      <w:start w:val="1"/>
-      <w:numFmt w:val="decimal"/>
-      <w:lvlText w:val="%8."/>
-      <w:lvlJc w:val="left"/>
-      <w:pPr>
-        <w:tabs>
-          <w:tab w:val="num" w:pos="5760"/>
-        </w:tabs>
-        <w:ind w:left="5760" w:hanging="360"/>
-      </w:pPr>
-    </w:lvl>
-    <w:lvl w:ilvl="8" w:tentative="1">
-      <w:start w:val="1"/>
-      <w:numFmt w:val="decimal"/>
-      <w:lvlText w:val="%9."/>
-      <w:lvlJc w:val="left"/>
-      <w:pPr>
-        <w:tabs>
-          <w:tab w:val="num" w:pos="6480"/>
-        </w:tabs>
-        <w:ind w:left="6480" w:hanging="360"/>
-      </w:pPr>
-    </w:lvl>
-  </w:abstractNum>
-  <w:abstractNum w:abstractNumId="12" w15:restartNumberingAfterBreak="0">
-    <w:nsid w:val="6AEB1123"/>
-    <w:multiLevelType w:val="multilevel"/>
-    <w:tmpl w:val="27F8BB00"/>
+    <w:tmpl w:val="28ACAA2A"/>
     <w:lvl w:ilvl="0">
       <w:start w:val="1"/>
       <w:numFmt w:val="bullet"/>
@@ -12507,10 +12489,10 @@
       </w:rPr>
     </w:lvl>
   </w:abstractNum>
-  <w:abstractNum w:abstractNumId="13" w15:restartNumberingAfterBreak="0">
-    <w:nsid w:val="6CB0773D"/>
+  <w:abstractNum w:abstractNumId="12" w15:restartNumberingAfterBreak="0">
+    <w:nsid w:val="634D4920"/>
     <w:multiLevelType w:val="multilevel"/>
-    <w:tmpl w:val="8070C530"/>
+    <w:tmpl w:val="4E9E669A"/>
     <w:lvl w:ilvl="0">
       <w:start w:val="1"/>
       <w:numFmt w:val="bullet"/>
@@ -12656,10 +12638,123 @@
       </w:rPr>
     </w:lvl>
   </w:abstractNum>
+  <w:abstractNum w:abstractNumId="13" w15:restartNumberingAfterBreak="0">
+    <w:nsid w:val="6A83612C"/>
+    <w:multiLevelType w:val="multilevel"/>
+    <w:tmpl w:val="392497F2"/>
+    <w:lvl w:ilvl="0">
+      <w:start w:val="1"/>
+      <w:numFmt w:val="decimal"/>
+      <w:lvlText w:val="%1."/>
+      <w:lvlJc w:val="left"/>
+      <w:pPr>
+        <w:tabs>
+          <w:tab w:val="num" w:pos="720"/>
+        </w:tabs>
+        <w:ind w:left="720" w:hanging="360"/>
+      </w:pPr>
+    </w:lvl>
+    <w:lvl w:ilvl="1" w:tentative="1">
+      <w:start w:val="1"/>
+      <w:numFmt w:val="decimal"/>
+      <w:lvlText w:val="%2."/>
+      <w:lvlJc w:val="left"/>
+      <w:pPr>
+        <w:tabs>
+          <w:tab w:val="num" w:pos="1440"/>
+        </w:tabs>
+        <w:ind w:left="1440" w:hanging="360"/>
+      </w:pPr>
+    </w:lvl>
+    <w:lvl w:ilvl="2" w:tentative="1">
+      <w:start w:val="1"/>
+      <w:numFmt w:val="decimal"/>
+      <w:lvlText w:val="%3."/>
+      <w:lvlJc w:val="left"/>
+      <w:pPr>
+        <w:tabs>
+          <w:tab w:val="num" w:pos="2160"/>
+        </w:tabs>
+        <w:ind w:left="2160" w:hanging="360"/>
+      </w:pPr>
+    </w:lvl>
+    <w:lvl w:ilvl="3" w:tentative="1">
+      <w:start w:val="1"/>
+      <w:numFmt w:val="decimal"/>
+      <w:lvlText w:val="%4."/>
+      <w:lvlJc w:val="left"/>
+      <w:pPr>
+        <w:tabs>
+          <w:tab w:val="num" w:pos="2880"/>
+        </w:tabs>
+        <w:ind w:left="2880" w:hanging="360"/>
+      </w:pPr>
+    </w:lvl>
+    <w:lvl w:ilvl="4" w:tentative="1">
+      <w:start w:val="1"/>
+      <w:numFmt w:val="decimal"/>
+      <w:lvlText w:val="%5."/>
+      <w:lvlJc w:val="left"/>
+      <w:pPr>
+        <w:tabs>
+          <w:tab w:val="num" w:pos="3600"/>
+        </w:tabs>
+        <w:ind w:left="3600" w:hanging="360"/>
+      </w:pPr>
+    </w:lvl>
+    <w:lvl w:ilvl="5" w:tentative="1">
+      <w:start w:val="1"/>
+      <w:numFmt w:val="decimal"/>
+      <w:lvlText w:val="%6."/>
+      <w:lvlJc w:val="left"/>
+      <w:pPr>
+        <w:tabs>
+          <w:tab w:val="num" w:pos="4320"/>
+        </w:tabs>
+        <w:ind w:left="4320" w:hanging="360"/>
+      </w:pPr>
+    </w:lvl>
+    <w:lvl w:ilvl="6" w:tentative="1">
+      <w:start w:val="1"/>
+      <w:numFmt w:val="decimal"/>
+      <w:lvlText w:val="%7."/>
+      <w:lvlJc w:val="left"/>
+      <w:pPr>
+        <w:tabs>
+          <w:tab w:val="num" w:pos="5040"/>
+        </w:tabs>
+        <w:ind w:left="5040" w:hanging="360"/>
+      </w:pPr>
+    </w:lvl>
+    <w:lvl w:ilvl="7" w:tentative="1">
+      <w:start w:val="1"/>
+      <w:numFmt w:val="decimal"/>
+      <w:lvlText w:val="%8."/>
+      <w:lvlJc w:val="left"/>
+      <w:pPr>
+        <w:tabs>
+          <w:tab w:val="num" w:pos="5760"/>
+        </w:tabs>
+        <w:ind w:left="5760" w:hanging="360"/>
+      </w:pPr>
+    </w:lvl>
+    <w:lvl w:ilvl="8" w:tentative="1">
+      <w:start w:val="1"/>
+      <w:numFmt w:val="decimal"/>
+      <w:lvlText w:val="%9."/>
+      <w:lvlJc w:val="left"/>
+      <w:pPr>
+        <w:tabs>
+          <w:tab w:val="num" w:pos="6480"/>
+        </w:tabs>
+        <w:ind w:left="6480" w:hanging="360"/>
+      </w:pPr>
+    </w:lvl>
+  </w:abstractNum>
   <w:abstractNum w:abstractNumId="14" w15:restartNumberingAfterBreak="0">
-    <w:nsid w:val="6FEF7BE6"/>
+    <w:nsid w:val="6C2A50C3"/>
     <w:multiLevelType w:val="multilevel"/>
-    <w:tmpl w:val="D286D476"/>
+    <w:tmpl w:val="030C5282"/>
     <w:lvl w:ilvl="0">
       <w:start w:val="1"/>
       <w:numFmt w:val="bullet"/>
@@ -12806,9 +12901,9 @@
     </w:lvl>
   </w:abstractNum>
   <w:abstractNum w:abstractNumId="15" w15:restartNumberingAfterBreak="0">
-    <w:nsid w:val="7681130E"/>
+    <w:nsid w:val="754930AC"/>
     <w:multiLevelType w:val="multilevel"/>
-    <w:tmpl w:val="7C0E8580"/>
+    <w:tmpl w:val="0B2E3346"/>
     <w:lvl w:ilvl="0">
       <w:start w:val="1"/>
       <w:numFmt w:val="decimal"/>
@@ -12919,9 +13014,9 @@
     </w:lvl>
   </w:abstractNum>
   <w:abstractNum w:abstractNumId="16" w15:restartNumberingAfterBreak="0">
-    <w:nsid w:val="7D917E3C"/>
+    <w:nsid w:val="75837B8E"/>
     <w:multiLevelType w:val="multilevel"/>
-    <w:tmpl w:val="1736C4EA"/>
+    <w:tmpl w:val="9B5242E4"/>
     <w:lvl w:ilvl="0">
       <w:start w:val="1"/>
       <w:numFmt w:val="bullet"/>
@@ -13068,9 +13163,9 @@
     </w:lvl>
   </w:abstractNum>
   <w:abstractNum w:abstractNumId="17" w15:restartNumberingAfterBreak="0">
-    <w:nsid w:val="7DDA55F9"/>
+    <w:nsid w:val="7AFE2E8C"/>
     <w:multiLevelType w:val="multilevel"/>
-    <w:tmpl w:val="191A5DBA"/>
+    <w:tmpl w:val="EF0C493C"/>
     <w:lvl w:ilvl="0">
       <w:start w:val="1"/>
       <w:numFmt w:val="bullet"/>
@@ -13217,9 +13312,9 @@
     </w:lvl>
   </w:abstractNum>
   <w:abstractNum w:abstractNumId="18" w15:restartNumberingAfterBreak="0">
-    <w:nsid w:val="7F4F5FB6"/>
+    <w:nsid w:val="7D4C29A3"/>
     <w:multiLevelType w:val="multilevel"/>
-    <w:tmpl w:val="16AAC11C"/>
+    <w:tmpl w:val="FA9CBBAA"/>
     <w:lvl w:ilvl="0">
       <w:start w:val="1"/>
       <w:numFmt w:val="bullet"/>
@@ -13366,9 +13461,9 @@
     </w:lvl>
   </w:abstractNum>
   <w:abstractNum w:abstractNumId="19" w15:restartNumberingAfterBreak="0">
-    <w:nsid w:val="7F692942"/>
+    <w:nsid w:val="7E4F7AC7"/>
     <w:multiLevelType w:val="multilevel"/>
-    <w:tmpl w:val="FE84BE84"/>
+    <w:tmpl w:val="0D224538"/>
     <w:lvl w:ilvl="0">
       <w:start w:val="1"/>
       <w:numFmt w:val="bullet"/>
@@ -13514,65 +13609,65 @@
       </w:rPr>
     </w:lvl>
   </w:abstractNum>
-  <w:num w:numId="1" w16cid:durableId="2003770471">
+  <w:num w:numId="1" w16cid:durableId="1159426298">
+    <w:abstractNumId w:val="15"/>
+  </w:num>
+  <w:num w:numId="2" w16cid:durableId="1696300125">
+    <w:abstractNumId w:val="19"/>
+  </w:num>
+  <w:num w:numId="3" w16cid:durableId="2128692725">
+    <w:abstractNumId w:val="10"/>
+  </w:num>
+  <w:num w:numId="4" w16cid:durableId="1393045154">
     <w:abstractNumId w:val="1"/>
   </w:num>
-  <w:num w:numId="2" w16cid:durableId="1691956777">
-    <w:abstractNumId w:val="16"/>
+  <w:num w:numId="5" w16cid:durableId="163320192">
+    <w:abstractNumId w:val="6"/>
   </w:num>
-  <w:num w:numId="3" w16cid:durableId="370618947">
+  <w:num w:numId="6" w16cid:durableId="1310667831">
     <w:abstractNumId w:val="14"/>
   </w:num>
-  <w:num w:numId="4" w16cid:durableId="963660136">
-    <w:abstractNumId w:val="19"/>
+  <w:num w:numId="7" w16cid:durableId="1048604011">
+    <w:abstractNumId w:val="11"/>
   </w:num>
-  <w:num w:numId="5" w16cid:durableId="1409377907">
-    <w:abstractNumId w:val="10"/>
+  <w:num w:numId="8" w16cid:durableId="1497111106">
+    <w:abstractNumId w:val="12"/>
   </w:num>
-  <w:num w:numId="6" w16cid:durableId="26376826">
+  <w:num w:numId="9" w16cid:durableId="189953629">
+    <w:abstractNumId w:val="18"/>
+  </w:num>
+  <w:num w:numId="10" w16cid:durableId="576984820">
+    <w:abstractNumId w:val="3"/>
+  </w:num>
+  <w:num w:numId="11" w16cid:durableId="688526845">
+    <w:abstractNumId w:val="8"/>
+  </w:num>
+  <w:num w:numId="12" w16cid:durableId="187528476">
+    <w:abstractNumId w:val="9"/>
+  </w:num>
+  <w:num w:numId="13" w16cid:durableId="1884058792">
+    <w:abstractNumId w:val="0"/>
+  </w:num>
+  <w:num w:numId="14" w16cid:durableId="882450668">
     <w:abstractNumId w:val="7"/>
   </w:num>
-  <w:num w:numId="7" w16cid:durableId="1826314243">
-    <w:abstractNumId w:val="18"/>
+  <w:num w:numId="15" w16cid:durableId="1698894260">
+    <w:abstractNumId w:val="4"/>
   </w:num>
-  <w:num w:numId="8" w16cid:durableId="848718576">
+  <w:num w:numId="16" w16cid:durableId="1469786262">
+    <w:abstractNumId w:val="13"/>
+  </w:num>
+  <w:num w:numId="17" w16cid:durableId="1312175537">
     <w:abstractNumId w:val="5"/>
   </w:num>
-  <w:num w:numId="9" w16cid:durableId="1178084824">
-    <w:abstractNumId w:val="6"/>
+  <w:num w:numId="18" w16cid:durableId="1272664816">
+    <w:abstractNumId w:val="2"/>
   </w:num>
-  <w:num w:numId="10" w16cid:durableId="2127386450">
+  <w:num w:numId="19" w16cid:durableId="221331412">
     <w:abstractNumId w:val="17"/>
   </w:num>
-  <w:num w:numId="11" w16cid:durableId="568853901">
-    <w:abstractNumId w:val="2"/>
-  </w:num>
-  <w:num w:numId="12" w16cid:durableId="1696538304">
-    <w:abstractNumId w:val="4"/>
-  </w:num>
-  <w:num w:numId="13" w16cid:durableId="980890025">
-    <w:abstractNumId w:val="8"/>
-  </w:num>
-  <w:num w:numId="14" w16cid:durableId="736318135">
-    <w:abstractNumId w:val="13"/>
-  </w:num>
-  <w:num w:numId="15" w16cid:durableId="2033728248">
-    <w:abstractNumId w:val="0"/>
-  </w:num>
-  <w:num w:numId="16" w16cid:durableId="1763332848">
-    <w:abstractNumId w:val="11"/>
-  </w:num>
-  <w:num w:numId="17" w16cid:durableId="1890653427">
-    <w:abstractNumId w:val="15"/>
-  </w:num>
-  <w:num w:numId="18" w16cid:durableId="1340430664">
-    <w:abstractNumId w:val="9"/>
-  </w:num>
-  <w:num w:numId="19" w16cid:durableId="967130700">
-    <w:abstractNumId w:val="12"/>
-  </w:num>
-  <w:num w:numId="20" w16cid:durableId="180047299">
-    <w:abstractNumId w:val="3"/>
+  <w:num w:numId="20" w16cid:durableId="1315917534">
+    <w:abstractNumId w:val="16"/>
   </w:num>
 </w:numbering>
 </file>

</xml_diff>

<commit_message>
Drift-dok: 2FA-krav for administratorer paa cbcit.dk + datagaarden.dk (Wordfence Login Security, 28/10)
Co-Authored-By: Claude Fable 5.1 <noreply@anthropic.com>
</commit_message>
<xml_diff>
--- a/drift/07-break-glass-adgang.docx
+++ b/drift/07-break-glass-adgang.docx
@@ -231,7 +231,7 @@
       <w:pPr>
         <w:pStyle w:val="NormalWeb"/>
         <w:shd w:val="clear" w:color="auto" w:fill="F7FBFA"/>
-        <w:divId w:val="702361770"/>
+        <w:divId w:val="479662942"/>
         <w:rPr>
           <w:rFonts w:ascii="Calibri" w:hAnsi="Calibri" w:cs="Calibri"/>
           <w:sz w:val="21"/>
@@ -301,7 +301,7 @@
       <w:pPr>
         <w:pStyle w:val="NormalWeb"/>
         <w:shd w:val="clear" w:color="auto" w:fill="F7FBFA"/>
-        <w:divId w:val="702361770"/>
+        <w:divId w:val="479662942"/>
         <w:rPr>
           <w:rFonts w:ascii="Calibri" w:hAnsi="Calibri" w:cs="Calibri"/>
           <w:sz w:val="21"/>
@@ -381,7 +381,7 @@
           <w:sz w:val="21"/>
           <w:szCs w:val="21"/>
         </w:rPr>
-        <w:pict w14:anchorId="4063DDBC">
+        <w:pict w14:anchorId="3861EC35">
           <v:rect id="_x0000_i1025" style="width:0;height:1.5pt" o:hralign="center" o:hrstd="t" o:hr="t" fillcolor="#a0a0a0" stroked="f"/>
         </w:pict>
       </w:r>
@@ -714,7 +714,7 @@
           <w:sz w:val="21"/>
           <w:szCs w:val="21"/>
         </w:rPr>
-        <w:pict w14:anchorId="523E52E2">
+        <w:pict w14:anchorId="1FAF83CC">
           <v:rect id="_x0000_i1026" style="width:0;height:1.5pt" o:hralign="center" o:hrstd="t" o:hr="t" fillcolor="#a0a0a0" stroked="f"/>
         </w:pict>
       </w:r>
@@ -808,6 +808,7 @@
                 <w:sz w:val="18"/>
                 <w:szCs w:val="18"/>
               </w:rPr>
+              <w:lastRenderedPageBreak/>
               <w:t>Lag</w:t>
             </w:r>
           </w:p>
@@ -2290,7 +2291,7 @@
           <w:sz w:val="21"/>
           <w:szCs w:val="21"/>
         </w:rPr>
-        <w:pict w14:anchorId="3BFE7CEC">
+        <w:pict w14:anchorId="2B5FFB15">
           <v:rect id="_x0000_i1027" style="width:0;height:1.5pt" o:hralign="center" o:hrstd="t" o:hr="t" fillcolor="#a0a0a0" stroked="f"/>
         </w:pict>
       </w:r>
@@ -2525,6 +2526,7 @@
           <w:sz w:val="21"/>
           <w:szCs w:val="21"/>
         </w:rPr>
+        <w:lastRenderedPageBreak/>
         <w:t xml:space="preserve">[ ] </w:t>
       </w:r>
       <w:r>
@@ -3297,7 +3299,7 @@
           <w:sz w:val="21"/>
           <w:szCs w:val="21"/>
         </w:rPr>
-        <w:pict w14:anchorId="2D0B34E4">
+        <w:pict w14:anchorId="1C302388">
           <v:rect id="_x0000_i1028" style="width:0;height:1.5pt" o:hralign="center" o:hrstd="t" o:hr="t" fillcolor="#a0a0a0" stroked="f"/>
         </w:pict>
       </w:r>
@@ -3629,7 +3631,7 @@
           <w:sz w:val="21"/>
           <w:szCs w:val="21"/>
         </w:rPr>
-        <w:pict w14:anchorId="21F8C96D">
+        <w:pict w14:anchorId="7DCFD625">
           <v:rect id="_x0000_i1029" style="width:0;height:1.5pt" o:hralign="center" o:hrstd="t" o:hr="t" fillcolor="#a0a0a0" stroked="f"/>
         </w:pict>
       </w:r>
@@ -3645,6 +3647,7 @@
         <w:rPr>
           <w:rFonts w:ascii="Calibri" w:eastAsia="Times New Roman" w:hAnsi="Calibri" w:cs="Calibri"/>
         </w:rPr>
+        <w:lastRenderedPageBreak/>
         <w:t>4. Trin-for-trin: Genskab SSH-adgang</w:t>
       </w:r>
     </w:p>
@@ -3944,7 +3947,7 @@
           <w:sz w:val="21"/>
           <w:szCs w:val="21"/>
         </w:rPr>
-        <w:pict w14:anchorId="60540FB8">
+        <w:pict w14:anchorId="29573D0F">
           <v:rect id="_x0000_i1030" style="width:0;height:1.5pt" o:hralign="center" o:hrstd="t" o:hr="t" fillcolor="#a0a0a0" stroked="f"/>
         </w:pict>
       </w:r>
@@ -4396,6 +4399,7 @@
                 <w:sz w:val="18"/>
                 <w:szCs w:val="18"/>
               </w:rPr>
+              <w:lastRenderedPageBreak/>
               <w:t>Hvad</w:t>
             </w:r>
           </w:p>
@@ -5643,7 +5647,7 @@
           <w:sz w:val="21"/>
           <w:szCs w:val="21"/>
         </w:rPr>
-        <w:pict w14:anchorId="13EBFDBB">
+        <w:pict w14:anchorId="12CE266B">
           <v:rect id="_x0000_i1031" style="width:0;height:1.5pt" o:hralign="center" o:hrstd="t" o:hr="t" fillcolor="#a0a0a0" stroked="f"/>
         </w:pict>
       </w:r>
@@ -7150,7 +7154,7 @@
           <w:sz w:val="21"/>
           <w:szCs w:val="21"/>
         </w:rPr>
-        <w:pict w14:anchorId="5F71BA63">
+        <w:pict w14:anchorId="09A492AB">
           <v:rect id="_x0000_i1032" style="width:0;height:1.5pt" o:hralign="center" o:hrstd="t" o:hr="t" fillcolor="#a0a0a0" stroked="f"/>
         </w:pict>
       </w:r>
@@ -7690,7 +7694,7 @@
           <w:sz w:val="21"/>
           <w:szCs w:val="21"/>
         </w:rPr>
-        <w:pict w14:anchorId="29083E6F">
+        <w:pict w14:anchorId="099B5BA7">
           <v:rect id="_x0000_i1033" style="width:0;height:1.5pt" o:hralign="center" o:hrstd="t" o:hr="t" fillcolor="#a0a0a0" stroked="f"/>
         </w:pict>
       </w:r>
@@ -7930,7 +7934,7 @@
       <w:pPr>
         <w:pStyle w:val="NormalWeb"/>
         <w:shd w:val="clear" w:color="auto" w:fill="F7FBFA"/>
-        <w:divId w:val="1829133798"/>
+        <w:divId w:val="1938323347"/>
         <w:rPr>
           <w:rFonts w:ascii="Calibri" w:hAnsi="Calibri" w:cs="Calibri"/>
           <w:sz w:val="21"/>
@@ -8383,7 +8387,7 @@
           <w:sz w:val="21"/>
           <w:szCs w:val="21"/>
         </w:rPr>
-        <w:pict w14:anchorId="3C4FF354">
+        <w:pict w14:anchorId="2817CB9E">
           <v:rect id="_x0000_i1034" style="width:0;height:1.5pt" o:hralign="center" o:hrstd="t" o:hr="t" fillcolor="#a0a0a0" stroked="f"/>
         </w:pict>
       </w:r>
@@ -9295,7 +9299,7 @@
           <w:sz w:val="21"/>
           <w:szCs w:val="21"/>
         </w:rPr>
-        <w:pict w14:anchorId="6236B089">
+        <w:pict w14:anchorId="33EB3DD9">
           <v:rect id="_x0000_i1035" style="width:0;height:1.5pt" o:hralign="center" o:hrstd="t" o:hr="t" fillcolor="#a0a0a0" stroked="f"/>
         </w:pict>
       </w:r>
@@ -9833,6 +9837,51 @@
           <w:sz w:val="21"/>
           <w:szCs w:val="21"/>
         </w:rPr>
+        <w:t>WP-admin-login på cbcit.dk og datagaarden.dk kræver 2FA</w:t>
+      </w:r>
+      <w:r>
+        <w:rPr>
+          <w:rFonts w:ascii="Calibri" w:eastAsia="Times New Roman" w:hAnsi="Calibri" w:cs="Calibri"/>
+          <w:sz w:val="21"/>
+          <w:szCs w:val="21"/>
+        </w:rPr>
+        <w:t xml:space="preserve"> (Wordfence Login Security, krav sat 2026-10-28; nådeperiode til 4/11 hhv. 11/11): Wordfence → Login Security → Two-Factor Authentication. Låst ude → driftsmanual 06 §1.13 (WFLS-varianten: </w:t>
+      </w:r>
+      <w:r>
+        <w:rPr>
+          <w:rStyle w:val="HTML-kode"/>
+        </w:rPr>
+        <w:t>reset_grace_period</w:t>
+      </w:r>
+      <w:r>
+        <w:rPr>
+          <w:rFonts w:ascii="Calibri" w:eastAsia="Times New Roman" w:hAnsi="Calibri" w:cs="Calibri"/>
+          <w:sz w:val="21"/>
+          <w:szCs w:val="21"/>
+        </w:rPr>
+        <w:t>).</w:t>
+      </w:r>
+    </w:p>
+    <w:p>
+      <w:pPr>
+        <w:numPr>
+          <w:ilvl w:val="0"/>
+          <w:numId w:val="18"/>
+        </w:numPr>
+        <w:spacing w:before="100" w:beforeAutospacing="1" w:after="100" w:afterAutospacing="1"/>
+        <w:rPr>
+          <w:rFonts w:ascii="Calibri" w:eastAsia="Times New Roman" w:hAnsi="Calibri" w:cs="Calibri"/>
+          <w:sz w:val="21"/>
+          <w:szCs w:val="21"/>
+        </w:rPr>
+      </w:pPr>
+      <w:r>
+        <w:rPr>
+          <w:rStyle w:val="Strk"/>
+          <w:rFonts w:ascii="Calibri" w:eastAsia="Times New Roman" w:hAnsi="Calibri" w:cs="Calibri"/>
+          <w:sz w:val="21"/>
+          <w:szCs w:val="21"/>
+        </w:rPr>
         <w:t>Åbne sikkerhedspunkter pr. 2026-10-28</w:t>
       </w:r>
       <w:r>
@@ -9841,7 +9890,15 @@
           <w:sz w:val="21"/>
           <w:szCs w:val="21"/>
         </w:rPr>
-        <w:t xml:space="preserve"> (fra fuld audit 26/10, prioriteret — fuld liste i Claude-memory </w:t>
+        <w:t xml:space="preserve"> </w:t>
+      </w:r>
+      <w:r>
+        <w:rPr>
+          <w:rFonts w:ascii="Calibri" w:eastAsia="Times New Roman" w:hAnsi="Calibri" w:cs="Calibri"/>
+          <w:sz w:val="21"/>
+          <w:szCs w:val="21"/>
+        </w:rPr>
+        <w:t xml:space="preserve">(fra fuld audit 26/10, prioriteret — fuld liste i Claude-memory </w:t>
       </w:r>
       <w:r>
         <w:rPr>
@@ -9855,7 +9912,7 @@
           <w:sz w:val="21"/>
           <w:szCs w:val="21"/>
         </w:rPr>
-        <w:t xml:space="preserve"> på Johans PC): </w:t>
+        <w:t xml:space="preserve"> på Johans PC): 2FA-</w:t>
       </w:r>
       <w:r>
         <w:rPr>
@@ -9864,7 +9921,7 @@
           <w:sz w:val="21"/>
           <w:szCs w:val="21"/>
         </w:rPr>
-        <w:t>2FA på cbcit.dk og datagaarden.dk</w:t>
+        <w:t>enrollment</w:t>
       </w:r>
       <w:r>
         <w:rPr>
@@ -9880,7 +9937,7 @@
           <w:sz w:val="21"/>
           <w:szCs w:val="21"/>
         </w:rPr>
-        <w:t xml:space="preserve">(event er håndhævet; Wordfence Login Security-modulet ligger klar på de to andre) · datagaarden-ansatte nedgraderes fra administrator til editor · mail-DNS (SPF-oprydning cbcit.dk, DMARC → quarantine, DMARC + Brevo-DKIM for datagaarden.dk) · deaktivér All-in-One WP Migration på cbcit.dk · CF Origin-cert til datagaarden.dk · fjern TeamViewerQS.exe fra datagaarden.dk/Support · slet </w:t>
+        <w:t xml:space="preserve">gennemføres af de enkelte admins inden fristerne (kravet er sat på alle tre sites) · datagaarden-ansatte nedgraderes fra administrator til editor (Datagaardens egen admin) · mail-DNS (SPF-oprydning cbcit.dk, DMARC → quarantine, DMARC + Brevo-DKIM for datagaarden.dk) · deaktivér All-in-One WP Migration på cbcit.dk · CF Origin-cert til datagaarden.dk · fjern TeamViewerQS.exe fra datagaarden.dk/Support · slet </w:t>
       </w:r>
       <w:r>
         <w:rPr>
@@ -9911,7 +9968,7 @@
           <w:sz w:val="21"/>
           <w:szCs w:val="21"/>
         </w:rPr>
-        <w:pict w14:anchorId="671F5B7F">
+        <w:pict w14:anchorId="62B07251">
           <v:rect id="_x0000_i1036" style="width:0;height:1.5pt" o:hralign="center" o:hrstd="t" o:hr="t" fillcolor="#a0a0a0" stroked="f"/>
         </w:pict>
       </w:r>
@@ -10169,7 +10226,7 @@
       <w:pPr>
         <w:pStyle w:val="NormalWeb"/>
         <w:shd w:val="clear" w:color="auto" w:fill="F7FBFA"/>
-        <w:divId w:val="1925996066"/>
+        <w:divId w:val="2144273544"/>
         <w:rPr>
           <w:rFonts w:ascii="Calibri" w:hAnsi="Calibri" w:cs="Calibri"/>
           <w:sz w:val="21"/>
@@ -10199,7 +10256,7 @@
           <w:sz w:val="21"/>
           <w:szCs w:val="21"/>
         </w:rPr>
-        <w:pict w14:anchorId="39060E46">
+        <w:pict w14:anchorId="261E6804">
           <v:rect id="_x0000_i1037" style="width:0;height:1.5pt" o:hralign="center" o:hrstd="t" o:hr="t" fillcolor="#a0a0a0" stroked="f"/>
         </w:pict>
       </w:r>
@@ -10765,7 +10822,7 @@
           <w:sz w:val="21"/>
           <w:szCs w:val="21"/>
         </w:rPr>
-        <w:pict w14:anchorId="385E65ED">
+        <w:pict w14:anchorId="77892C14">
           <v:rect id="_x0000_i1038" style="width:0;height:1.5pt" o:hralign="center" o:hrstd="t" o:hr="t" fillcolor="#a0a0a0" stroked="f"/>
         </w:pict>
       </w:r>
@@ -10810,9 +10867,9 @@
 <file path=word/numbering.xml><?xml version="1.0" encoding="utf-8"?>
 <w:numbering xmlns:wpc="http://schemas.microsoft.com/office/word/2010/wordprocessingCanvas" xmlns:cx="http://schemas.microsoft.com/office/drawing/2014/chartex" xmlns:cx1="http://schemas.microsoft.com/office/drawing/2015/9/8/chartex" xmlns:cx2="http://schemas.microsoft.com/office/drawing/2015/10/21/chartex" xmlns:cx3="http://schemas.microsoft.com/office/drawing/2016/5/9/chartex" xmlns:cx4="http://schemas.microsoft.com/office/drawing/2016/5/10/chartex" xmlns:cx5="http://schemas.microsoft.com/office/drawing/2016/5/11/chartex" xmlns:cx6="http://schemas.microsoft.com/office/drawing/2016/5/12/chartex" xmlns:cx7="http://schemas.microsoft.com/office/drawing/2016/5/13/chartex" xmlns:cx8="http://schemas.microsoft.com/office/drawing/2016/5/14/chartex" xmlns:mc="http://schemas.openxmlformats.org/markup-compatibility/2006" xmlns:aink="http://schemas.microsoft.com/office/drawing/2016/ink" xmlns:am3d="http://schemas.microsoft.com/office/drawing/2017/model3d" xmlns:o="urn:schemas-microsoft-com:office:office" xmlns:oel="http://schemas.microsoft.com/office/2019/extlst" xmlns:r="http://schemas.openxmlformats.org/officeDocument/2006/relationships" xmlns:m="http://schemas.openxmlformats.org/officeDocument/2006/math" xmlns:v="urn:schemas-microsoft-com:vml" xmlns:wp14="http://schemas.microsoft.com/office/word/2010/wordprocessingDrawing" xmlns:wp="http://schemas.openxmlformats.org/drawingml/2006/wordprocessingDrawing" xmlns:w10="urn:schemas-microsoft-com:office:word" xmlns:w="http://schemas.openxmlformats.org/wordprocessingml/2006/main" xmlns:w14="http://schemas.microsoft.com/office/word/2010/wordml" xmlns:w15="http://schemas.microsoft.com/office/word/2012/wordml" xmlns:w16cex="http://schemas.microsoft.com/office/word/2018/wordml/cex" xmlns:w16cid="http://schemas.microsoft.com/office/word/2016/wordml/cid" xmlns:w16="http://schemas.microsoft.com/office/word/2018/wordml" xmlns:w16du="http://schemas.microsoft.com/office/word/2023/wordml/word16du" xmlns:w16sdtdh="http://schemas.microsoft.com/office/word/2020/wordml/sdtdatahash" xmlns:w16sdtfl="http://schemas.microsoft.com/office/word/2024/wordml/sdtformatlock" xmlns:w16se="http://schemas.microsoft.com/office/word/2015/wordml/symex" xmlns:wpg="http://schemas.microsoft.com/office/word/2010/wordprocessingGroup" xmlns:wpi="http://schemas.microsoft.com/office/word/2010/wordprocessingInk" xmlns:wne="http://schemas.microsoft.com/office/word/2006/wordml" xmlns:wps="http://schemas.microsoft.com/office/word/2010/wordprocessingShape" mc:Ignorable="w14 w15 w16se w16cid w16 w16cex w16sdtdh w16sdtfl w16du wp14">
   <w:abstractNum w:abstractNumId="0" w15:restartNumberingAfterBreak="0">
-    <w:nsid w:val="14A5444B"/>
+    <w:nsid w:val="061F0C62"/>
     <w:multiLevelType w:val="multilevel"/>
-    <w:tmpl w:val="55AAE3C6"/>
+    <w:tmpl w:val="558C35AC"/>
     <w:lvl w:ilvl="0">
       <w:start w:val="1"/>
       <w:numFmt w:val="bullet"/>
@@ -10959,9 +11016,122 @@
     </w:lvl>
   </w:abstractNum>
   <w:abstractNum w:abstractNumId="1" w15:restartNumberingAfterBreak="0">
-    <w:nsid w:val="14BA4AE3"/>
+    <w:nsid w:val="0A982823"/>
     <w:multiLevelType w:val="multilevel"/>
-    <w:tmpl w:val="40C07366"/>
+    <w:tmpl w:val="F5160BF4"/>
+    <w:lvl w:ilvl="0">
+      <w:start w:val="1"/>
+      <w:numFmt w:val="decimal"/>
+      <w:lvlText w:val="%1."/>
+      <w:lvlJc w:val="left"/>
+      <w:pPr>
+        <w:tabs>
+          <w:tab w:val="num" w:pos="720"/>
+        </w:tabs>
+        <w:ind w:left="720" w:hanging="360"/>
+      </w:pPr>
+    </w:lvl>
+    <w:lvl w:ilvl="1" w:tentative="1">
+      <w:start w:val="1"/>
+      <w:numFmt w:val="decimal"/>
+      <w:lvlText w:val="%2."/>
+      <w:lvlJc w:val="left"/>
+      <w:pPr>
+        <w:tabs>
+          <w:tab w:val="num" w:pos="1440"/>
+        </w:tabs>
+        <w:ind w:left="1440" w:hanging="360"/>
+      </w:pPr>
+    </w:lvl>
+    <w:lvl w:ilvl="2" w:tentative="1">
+      <w:start w:val="1"/>
+      <w:numFmt w:val="decimal"/>
+      <w:lvlText w:val="%3."/>
+      <w:lvlJc w:val="left"/>
+      <w:pPr>
+        <w:tabs>
+          <w:tab w:val="num" w:pos="2160"/>
+        </w:tabs>
+        <w:ind w:left="2160" w:hanging="360"/>
+      </w:pPr>
+    </w:lvl>
+    <w:lvl w:ilvl="3" w:tentative="1">
+      <w:start w:val="1"/>
+      <w:numFmt w:val="decimal"/>
+      <w:lvlText w:val="%4."/>
+      <w:lvlJc w:val="left"/>
+      <w:pPr>
+        <w:tabs>
+          <w:tab w:val="num" w:pos="2880"/>
+        </w:tabs>
+        <w:ind w:left="2880" w:hanging="360"/>
+      </w:pPr>
+    </w:lvl>
+    <w:lvl w:ilvl="4" w:tentative="1">
+      <w:start w:val="1"/>
+      <w:numFmt w:val="decimal"/>
+      <w:lvlText w:val="%5."/>
+      <w:lvlJc w:val="left"/>
+      <w:pPr>
+        <w:tabs>
+          <w:tab w:val="num" w:pos="3600"/>
+        </w:tabs>
+        <w:ind w:left="3600" w:hanging="360"/>
+      </w:pPr>
+    </w:lvl>
+    <w:lvl w:ilvl="5" w:tentative="1">
+      <w:start w:val="1"/>
+      <w:numFmt w:val="decimal"/>
+      <w:lvlText w:val="%6."/>
+      <w:lvlJc w:val="left"/>
+      <w:pPr>
+        <w:tabs>
+          <w:tab w:val="num" w:pos="4320"/>
+        </w:tabs>
+        <w:ind w:left="4320" w:hanging="360"/>
+      </w:pPr>
+    </w:lvl>
+    <w:lvl w:ilvl="6" w:tentative="1">
+      <w:start w:val="1"/>
+      <w:numFmt w:val="decimal"/>
+      <w:lvlText w:val="%7."/>
+      <w:lvlJc w:val="left"/>
+      <w:pPr>
+        <w:tabs>
+          <w:tab w:val="num" w:pos="5040"/>
+        </w:tabs>
+        <w:ind w:left="5040" w:hanging="360"/>
+      </w:pPr>
+    </w:lvl>
+    <w:lvl w:ilvl="7" w:tentative="1">
+      <w:start w:val="1"/>
+      <w:numFmt w:val="decimal"/>
+      <w:lvlText w:val="%8."/>
+      <w:lvlJc w:val="left"/>
+      <w:pPr>
+        <w:tabs>
+          <w:tab w:val="num" w:pos="5760"/>
+        </w:tabs>
+        <w:ind w:left="5760" w:hanging="360"/>
+      </w:pPr>
+    </w:lvl>
+    <w:lvl w:ilvl="8" w:tentative="1">
+      <w:start w:val="1"/>
+      <w:numFmt w:val="decimal"/>
+      <w:lvlText w:val="%9."/>
+      <w:lvlJc w:val="left"/>
+      <w:pPr>
+        <w:tabs>
+          <w:tab w:val="num" w:pos="6480"/>
+        </w:tabs>
+        <w:ind w:left="6480" w:hanging="360"/>
+      </w:pPr>
+    </w:lvl>
+  </w:abstractNum>
+  <w:abstractNum w:abstractNumId="2" w15:restartNumberingAfterBreak="0">
+    <w:nsid w:val="12A61B05"/>
+    <w:multiLevelType w:val="multilevel"/>
+    <w:tmpl w:val="89F63A1E"/>
     <w:lvl w:ilvl="0">
       <w:start w:val="1"/>
       <w:numFmt w:val="bullet"/>
@@ -11107,10 +11277,123 @@
       </w:rPr>
     </w:lvl>
   </w:abstractNum>
-  <w:abstractNum w:abstractNumId="2" w15:restartNumberingAfterBreak="0">
-    <w:nsid w:val="160C7273"/>
+  <w:abstractNum w:abstractNumId="3" w15:restartNumberingAfterBreak="0">
+    <w:nsid w:val="13BA710B"/>
     <w:multiLevelType w:val="multilevel"/>
-    <w:tmpl w:val="DE064B6A"/>
+    <w:tmpl w:val="0EB81CAE"/>
+    <w:lvl w:ilvl="0">
+      <w:start w:val="1"/>
+      <w:numFmt w:val="decimal"/>
+      <w:lvlText w:val="%1."/>
+      <w:lvlJc w:val="left"/>
+      <w:pPr>
+        <w:tabs>
+          <w:tab w:val="num" w:pos="720"/>
+        </w:tabs>
+        <w:ind w:left="720" w:hanging="360"/>
+      </w:pPr>
+    </w:lvl>
+    <w:lvl w:ilvl="1" w:tentative="1">
+      <w:start w:val="1"/>
+      <w:numFmt w:val="decimal"/>
+      <w:lvlText w:val="%2."/>
+      <w:lvlJc w:val="left"/>
+      <w:pPr>
+        <w:tabs>
+          <w:tab w:val="num" w:pos="1440"/>
+        </w:tabs>
+        <w:ind w:left="1440" w:hanging="360"/>
+      </w:pPr>
+    </w:lvl>
+    <w:lvl w:ilvl="2" w:tentative="1">
+      <w:start w:val="1"/>
+      <w:numFmt w:val="decimal"/>
+      <w:lvlText w:val="%3."/>
+      <w:lvlJc w:val="left"/>
+      <w:pPr>
+        <w:tabs>
+          <w:tab w:val="num" w:pos="2160"/>
+        </w:tabs>
+        <w:ind w:left="2160" w:hanging="360"/>
+      </w:pPr>
+    </w:lvl>
+    <w:lvl w:ilvl="3" w:tentative="1">
+      <w:start w:val="1"/>
+      <w:numFmt w:val="decimal"/>
+      <w:lvlText w:val="%4."/>
+      <w:lvlJc w:val="left"/>
+      <w:pPr>
+        <w:tabs>
+          <w:tab w:val="num" w:pos="2880"/>
+        </w:tabs>
+        <w:ind w:left="2880" w:hanging="360"/>
+      </w:pPr>
+    </w:lvl>
+    <w:lvl w:ilvl="4" w:tentative="1">
+      <w:start w:val="1"/>
+      <w:numFmt w:val="decimal"/>
+      <w:lvlText w:val="%5."/>
+      <w:lvlJc w:val="left"/>
+      <w:pPr>
+        <w:tabs>
+          <w:tab w:val="num" w:pos="3600"/>
+        </w:tabs>
+        <w:ind w:left="3600" w:hanging="360"/>
+      </w:pPr>
+    </w:lvl>
+    <w:lvl w:ilvl="5" w:tentative="1">
+      <w:start w:val="1"/>
+      <w:numFmt w:val="decimal"/>
+      <w:lvlText w:val="%6."/>
+      <w:lvlJc w:val="left"/>
+      <w:pPr>
+        <w:tabs>
+          <w:tab w:val="num" w:pos="4320"/>
+        </w:tabs>
+        <w:ind w:left="4320" w:hanging="360"/>
+      </w:pPr>
+    </w:lvl>
+    <w:lvl w:ilvl="6" w:tentative="1">
+      <w:start w:val="1"/>
+      <w:numFmt w:val="decimal"/>
+      <w:lvlText w:val="%7."/>
+      <w:lvlJc w:val="left"/>
+      <w:pPr>
+        <w:tabs>
+          <w:tab w:val="num" w:pos="5040"/>
+        </w:tabs>
+        <w:ind w:left="5040" w:hanging="360"/>
+      </w:pPr>
+    </w:lvl>
+    <w:lvl w:ilvl="7" w:tentative="1">
+      <w:start w:val="1"/>
+      <w:numFmt w:val="decimal"/>
+      <w:lvlText w:val="%8."/>
+      <w:lvlJc w:val="left"/>
+      <w:pPr>
+        <w:tabs>
+          <w:tab w:val="num" w:pos="5760"/>
+        </w:tabs>
+        <w:ind w:left="5760" w:hanging="360"/>
+      </w:pPr>
+    </w:lvl>
+    <w:lvl w:ilvl="8" w:tentative="1">
+      <w:start w:val="1"/>
+      <w:numFmt w:val="decimal"/>
+      <w:lvlText w:val="%9."/>
+      <w:lvlJc w:val="left"/>
+      <w:pPr>
+        <w:tabs>
+          <w:tab w:val="num" w:pos="6480"/>
+        </w:tabs>
+        <w:ind w:left="6480" w:hanging="360"/>
+      </w:pPr>
+    </w:lvl>
+  </w:abstractNum>
+  <w:abstractNum w:abstractNumId="4" w15:restartNumberingAfterBreak="0">
+    <w:nsid w:val="13E7488D"/>
+    <w:multiLevelType w:val="multilevel"/>
+    <w:tmpl w:val="3196C172"/>
     <w:lvl w:ilvl="0">
       <w:start w:val="1"/>
       <w:numFmt w:val="bullet"/>
@@ -11256,10 +11539,10 @@
       </w:rPr>
     </w:lvl>
   </w:abstractNum>
-  <w:abstractNum w:abstractNumId="3" w15:restartNumberingAfterBreak="0">
-    <w:nsid w:val="1B705118"/>
+  <w:abstractNum w:abstractNumId="5" w15:restartNumberingAfterBreak="0">
+    <w:nsid w:val="15B73D0C"/>
     <w:multiLevelType w:val="multilevel"/>
-    <w:tmpl w:val="8ABA84E8"/>
+    <w:tmpl w:val="5C6878B4"/>
     <w:lvl w:ilvl="0">
       <w:start w:val="1"/>
       <w:numFmt w:val="bullet"/>
@@ -11405,10 +11688,10 @@
       </w:rPr>
     </w:lvl>
   </w:abstractNum>
-  <w:abstractNum w:abstractNumId="4" w15:restartNumberingAfterBreak="0">
-    <w:nsid w:val="25B66E48"/>
+  <w:abstractNum w:abstractNumId="6" w15:restartNumberingAfterBreak="0">
+    <w:nsid w:val="1BF65B59"/>
     <w:multiLevelType w:val="multilevel"/>
-    <w:tmpl w:val="056427B6"/>
+    <w:tmpl w:val="8AE60924"/>
     <w:lvl w:ilvl="0">
       <w:start w:val="1"/>
       <w:numFmt w:val="decimal"/>
@@ -11518,236 +11801,10 @@
       </w:pPr>
     </w:lvl>
   </w:abstractNum>
-  <w:abstractNum w:abstractNumId="5" w15:restartNumberingAfterBreak="0">
-    <w:nsid w:val="2F7714BB"/>
+  <w:abstractNum w:abstractNumId="7" w15:restartNumberingAfterBreak="0">
+    <w:nsid w:val="1DFF70D4"/>
     <w:multiLevelType w:val="multilevel"/>
-    <w:tmpl w:val="0088D038"/>
-    <w:lvl w:ilvl="0">
-      <w:start w:val="1"/>
-      <w:numFmt w:val="decimal"/>
-      <w:lvlText w:val="%1."/>
-      <w:lvlJc w:val="left"/>
-      <w:pPr>
-        <w:tabs>
-          <w:tab w:val="num" w:pos="720"/>
-        </w:tabs>
-        <w:ind w:left="720" w:hanging="360"/>
-      </w:pPr>
-    </w:lvl>
-    <w:lvl w:ilvl="1" w:tentative="1">
-      <w:start w:val="1"/>
-      <w:numFmt w:val="decimal"/>
-      <w:lvlText w:val="%2."/>
-      <w:lvlJc w:val="left"/>
-      <w:pPr>
-        <w:tabs>
-          <w:tab w:val="num" w:pos="1440"/>
-        </w:tabs>
-        <w:ind w:left="1440" w:hanging="360"/>
-      </w:pPr>
-    </w:lvl>
-    <w:lvl w:ilvl="2" w:tentative="1">
-      <w:start w:val="1"/>
-      <w:numFmt w:val="decimal"/>
-      <w:lvlText w:val="%3."/>
-      <w:lvlJc w:val="left"/>
-      <w:pPr>
-        <w:tabs>
-          <w:tab w:val="num" w:pos="2160"/>
-        </w:tabs>
-        <w:ind w:left="2160" w:hanging="360"/>
-      </w:pPr>
-    </w:lvl>
-    <w:lvl w:ilvl="3" w:tentative="1">
-      <w:start w:val="1"/>
-      <w:numFmt w:val="decimal"/>
-      <w:lvlText w:val="%4."/>
-      <w:lvlJc w:val="left"/>
-      <w:pPr>
-        <w:tabs>
-          <w:tab w:val="num" w:pos="2880"/>
-        </w:tabs>
-        <w:ind w:left="2880" w:hanging="360"/>
-      </w:pPr>
-    </w:lvl>
-    <w:lvl w:ilvl="4" w:tentative="1">
-      <w:start w:val="1"/>
-      <w:numFmt w:val="decimal"/>
-      <w:lvlText w:val="%5."/>
-      <w:lvlJc w:val="left"/>
-      <w:pPr>
-        <w:tabs>
-          <w:tab w:val="num" w:pos="3600"/>
-        </w:tabs>
-        <w:ind w:left="3600" w:hanging="360"/>
-      </w:pPr>
-    </w:lvl>
-    <w:lvl w:ilvl="5" w:tentative="1">
-      <w:start w:val="1"/>
-      <w:numFmt w:val="decimal"/>
-      <w:lvlText w:val="%6."/>
-      <w:lvlJc w:val="left"/>
-      <w:pPr>
-        <w:tabs>
-          <w:tab w:val="num" w:pos="4320"/>
-        </w:tabs>
-        <w:ind w:left="4320" w:hanging="360"/>
-      </w:pPr>
-    </w:lvl>
-    <w:lvl w:ilvl="6" w:tentative="1">
-      <w:start w:val="1"/>
-      <w:numFmt w:val="decimal"/>
-      <w:lvlText w:val="%7."/>
-      <w:lvlJc w:val="left"/>
-      <w:pPr>
-        <w:tabs>
-          <w:tab w:val="num" w:pos="5040"/>
-        </w:tabs>
-        <w:ind w:left="5040" w:hanging="360"/>
-      </w:pPr>
-    </w:lvl>
-    <w:lvl w:ilvl="7" w:tentative="1">
-      <w:start w:val="1"/>
-      <w:numFmt w:val="decimal"/>
-      <w:lvlText w:val="%8."/>
-      <w:lvlJc w:val="left"/>
-      <w:pPr>
-        <w:tabs>
-          <w:tab w:val="num" w:pos="5760"/>
-        </w:tabs>
-        <w:ind w:left="5760" w:hanging="360"/>
-      </w:pPr>
-    </w:lvl>
-    <w:lvl w:ilvl="8" w:tentative="1">
-      <w:start w:val="1"/>
-      <w:numFmt w:val="decimal"/>
-      <w:lvlText w:val="%9."/>
-      <w:lvlJc w:val="left"/>
-      <w:pPr>
-        <w:tabs>
-          <w:tab w:val="num" w:pos="6480"/>
-        </w:tabs>
-        <w:ind w:left="6480" w:hanging="360"/>
-      </w:pPr>
-    </w:lvl>
-  </w:abstractNum>
-  <w:abstractNum w:abstractNumId="6" w15:restartNumberingAfterBreak="0">
-    <w:nsid w:val="32BB6637"/>
-    <w:multiLevelType w:val="multilevel"/>
-    <w:tmpl w:val="1AEC2058"/>
-    <w:lvl w:ilvl="0">
-      <w:start w:val="1"/>
-      <w:numFmt w:val="decimal"/>
-      <w:lvlText w:val="%1."/>
-      <w:lvlJc w:val="left"/>
-      <w:pPr>
-        <w:tabs>
-          <w:tab w:val="num" w:pos="720"/>
-        </w:tabs>
-        <w:ind w:left="720" w:hanging="360"/>
-      </w:pPr>
-    </w:lvl>
-    <w:lvl w:ilvl="1" w:tentative="1">
-      <w:start w:val="1"/>
-      <w:numFmt w:val="decimal"/>
-      <w:lvlText w:val="%2."/>
-      <w:lvlJc w:val="left"/>
-      <w:pPr>
-        <w:tabs>
-          <w:tab w:val="num" w:pos="1440"/>
-        </w:tabs>
-        <w:ind w:left="1440" w:hanging="360"/>
-      </w:pPr>
-    </w:lvl>
-    <w:lvl w:ilvl="2" w:tentative="1">
-      <w:start w:val="1"/>
-      <w:numFmt w:val="decimal"/>
-      <w:lvlText w:val="%3."/>
-      <w:lvlJc w:val="left"/>
-      <w:pPr>
-        <w:tabs>
-          <w:tab w:val="num" w:pos="2160"/>
-        </w:tabs>
-        <w:ind w:left="2160" w:hanging="360"/>
-      </w:pPr>
-    </w:lvl>
-    <w:lvl w:ilvl="3" w:tentative="1">
-      <w:start w:val="1"/>
-      <w:numFmt w:val="decimal"/>
-      <w:lvlText w:val="%4."/>
-      <w:lvlJc w:val="left"/>
-      <w:pPr>
-        <w:tabs>
-          <w:tab w:val="num" w:pos="2880"/>
-        </w:tabs>
-        <w:ind w:left="2880" w:hanging="360"/>
-      </w:pPr>
-    </w:lvl>
-    <w:lvl w:ilvl="4" w:tentative="1">
-      <w:start w:val="1"/>
-      <w:numFmt w:val="decimal"/>
-      <w:lvlText w:val="%5."/>
-      <w:lvlJc w:val="left"/>
-      <w:pPr>
-        <w:tabs>
-          <w:tab w:val="num" w:pos="3600"/>
-        </w:tabs>
-        <w:ind w:left="3600" w:hanging="360"/>
-      </w:pPr>
-    </w:lvl>
-    <w:lvl w:ilvl="5" w:tentative="1">
-      <w:start w:val="1"/>
-      <w:numFmt w:val="decimal"/>
-      <w:lvlText w:val="%6."/>
-      <w:lvlJc w:val="left"/>
-      <w:pPr>
-        <w:tabs>
-          <w:tab w:val="num" w:pos="4320"/>
-        </w:tabs>
-        <w:ind w:left="4320" w:hanging="360"/>
-      </w:pPr>
-    </w:lvl>
-    <w:lvl w:ilvl="6" w:tentative="1">
-      <w:start w:val="1"/>
-      <w:numFmt w:val="decimal"/>
-      <w:lvlText w:val="%7."/>
-      <w:lvlJc w:val="left"/>
-      <w:pPr>
-        <w:tabs>
-          <w:tab w:val="num" w:pos="5040"/>
-        </w:tabs>
-        <w:ind w:left="5040" w:hanging="360"/>
-      </w:pPr>
-    </w:lvl>
-    <w:lvl w:ilvl="7" w:tentative="1">
-      <w:start w:val="1"/>
-      <w:numFmt w:val="decimal"/>
-      <w:lvlText w:val="%8."/>
-      <w:lvlJc w:val="left"/>
-      <w:pPr>
-        <w:tabs>
-          <w:tab w:val="num" w:pos="5760"/>
-        </w:tabs>
-        <w:ind w:left="5760" w:hanging="360"/>
-      </w:pPr>
-    </w:lvl>
-    <w:lvl w:ilvl="8" w:tentative="1">
-      <w:start w:val="1"/>
-      <w:numFmt w:val="decimal"/>
-      <w:lvlText w:val="%9."/>
-      <w:lvlJc w:val="left"/>
-      <w:pPr>
-        <w:tabs>
-          <w:tab w:val="num" w:pos="6480"/>
-        </w:tabs>
-        <w:ind w:left="6480" w:hanging="360"/>
-      </w:pPr>
-    </w:lvl>
-  </w:abstractNum>
-  <w:abstractNum w:abstractNumId="7" w15:restartNumberingAfterBreak="0">
-    <w:nsid w:val="33BA32B5"/>
-    <w:multiLevelType w:val="multilevel"/>
-    <w:tmpl w:val="EA2E6B4A"/>
+    <w:tmpl w:val="A066DB72"/>
     <w:lvl w:ilvl="0">
       <w:start w:val="1"/>
       <w:numFmt w:val="bullet"/>
@@ -11894,9 +11951,9 @@
     </w:lvl>
   </w:abstractNum>
   <w:abstractNum w:abstractNumId="8" w15:restartNumberingAfterBreak="0">
-    <w:nsid w:val="33DC427E"/>
+    <w:nsid w:val="1F49788C"/>
     <w:multiLevelType w:val="multilevel"/>
-    <w:tmpl w:val="329E256E"/>
+    <w:tmpl w:val="C51EB51C"/>
     <w:lvl w:ilvl="0">
       <w:start w:val="1"/>
       <w:numFmt w:val="bullet"/>
@@ -12043,9 +12100,9 @@
     </w:lvl>
   </w:abstractNum>
   <w:abstractNum w:abstractNumId="9" w15:restartNumberingAfterBreak="0">
-    <w:nsid w:val="4A3056C0"/>
+    <w:nsid w:val="21765D8D"/>
     <w:multiLevelType w:val="multilevel"/>
-    <w:tmpl w:val="8DD4920A"/>
+    <w:tmpl w:val="739A3DC0"/>
     <w:lvl w:ilvl="0">
       <w:start w:val="1"/>
       <w:numFmt w:val="bullet"/>
@@ -12192,9 +12249,122 @@
     </w:lvl>
   </w:abstractNum>
   <w:abstractNum w:abstractNumId="10" w15:restartNumberingAfterBreak="0">
-    <w:nsid w:val="4B9C6D0E"/>
+    <w:nsid w:val="243240BA"/>
     <w:multiLevelType w:val="multilevel"/>
-    <w:tmpl w:val="FC3EA2EE"/>
+    <w:tmpl w:val="DCC28FAE"/>
+    <w:lvl w:ilvl="0">
+      <w:start w:val="1"/>
+      <w:numFmt w:val="decimal"/>
+      <w:lvlText w:val="%1."/>
+      <w:lvlJc w:val="left"/>
+      <w:pPr>
+        <w:tabs>
+          <w:tab w:val="num" w:pos="720"/>
+        </w:tabs>
+        <w:ind w:left="720" w:hanging="360"/>
+      </w:pPr>
+    </w:lvl>
+    <w:lvl w:ilvl="1" w:tentative="1">
+      <w:start w:val="1"/>
+      <w:numFmt w:val="decimal"/>
+      <w:lvlText w:val="%2."/>
+      <w:lvlJc w:val="left"/>
+      <w:pPr>
+        <w:tabs>
+          <w:tab w:val="num" w:pos="1440"/>
+        </w:tabs>
+        <w:ind w:left="1440" w:hanging="360"/>
+      </w:pPr>
+    </w:lvl>
+    <w:lvl w:ilvl="2" w:tentative="1">
+      <w:start w:val="1"/>
+      <w:numFmt w:val="decimal"/>
+      <w:lvlText w:val="%3."/>
+      <w:lvlJc w:val="left"/>
+      <w:pPr>
+        <w:tabs>
+          <w:tab w:val="num" w:pos="2160"/>
+        </w:tabs>
+        <w:ind w:left="2160" w:hanging="360"/>
+      </w:pPr>
+    </w:lvl>
+    <w:lvl w:ilvl="3" w:tentative="1">
+      <w:start w:val="1"/>
+      <w:numFmt w:val="decimal"/>
+      <w:lvlText w:val="%4."/>
+      <w:lvlJc w:val="left"/>
+      <w:pPr>
+        <w:tabs>
+          <w:tab w:val="num" w:pos="2880"/>
+        </w:tabs>
+        <w:ind w:left="2880" w:hanging="360"/>
+      </w:pPr>
+    </w:lvl>
+    <w:lvl w:ilvl="4" w:tentative="1">
+      <w:start w:val="1"/>
+      <w:numFmt w:val="decimal"/>
+      <w:lvlText w:val="%5."/>
+      <w:lvlJc w:val="left"/>
+      <w:pPr>
+        <w:tabs>
+          <w:tab w:val="num" w:pos="3600"/>
+        </w:tabs>
+        <w:ind w:left="3600" w:hanging="360"/>
+      </w:pPr>
+    </w:lvl>
+    <w:lvl w:ilvl="5" w:tentative="1">
+      <w:start w:val="1"/>
+      <w:numFmt w:val="decimal"/>
+      <w:lvlText w:val="%6."/>
+      <w:lvlJc w:val="left"/>
+      <w:pPr>
+        <w:tabs>
+          <w:tab w:val="num" w:pos="4320"/>
+        </w:tabs>
+        <w:ind w:left="4320" w:hanging="360"/>
+      </w:pPr>
+    </w:lvl>
+    <w:lvl w:ilvl="6" w:tentative="1">
+      <w:start w:val="1"/>
+      <w:numFmt w:val="decimal"/>
+      <w:lvlText w:val="%7."/>
+      <w:lvlJc w:val="left"/>
+      <w:pPr>
+        <w:tabs>
+          <w:tab w:val="num" w:pos="5040"/>
+        </w:tabs>
+        <w:ind w:left="5040" w:hanging="360"/>
+      </w:pPr>
+    </w:lvl>
+    <w:lvl w:ilvl="7" w:tentative="1">
+      <w:start w:val="1"/>
+      <w:numFmt w:val="decimal"/>
+      <w:lvlText w:val="%8."/>
+      <w:lvlJc w:val="left"/>
+      <w:pPr>
+        <w:tabs>
+          <w:tab w:val="num" w:pos="5760"/>
+        </w:tabs>
+        <w:ind w:left="5760" w:hanging="360"/>
+      </w:pPr>
+    </w:lvl>
+    <w:lvl w:ilvl="8" w:tentative="1">
+      <w:start w:val="1"/>
+      <w:numFmt w:val="decimal"/>
+      <w:lvlText w:val="%9."/>
+      <w:lvlJc w:val="left"/>
+      <w:pPr>
+        <w:tabs>
+          <w:tab w:val="num" w:pos="6480"/>
+        </w:tabs>
+        <w:ind w:left="6480" w:hanging="360"/>
+      </w:pPr>
+    </w:lvl>
+  </w:abstractNum>
+  <w:abstractNum w:abstractNumId="11" w15:restartNumberingAfterBreak="0">
+    <w:nsid w:val="38C33D4A"/>
+    <w:multiLevelType w:val="multilevel"/>
+    <w:tmpl w:val="231C4B2C"/>
     <w:lvl w:ilvl="0">
       <w:start w:val="1"/>
       <w:numFmt w:val="bullet"/>
@@ -12340,10 +12510,10 @@
       </w:rPr>
     </w:lvl>
   </w:abstractNum>
-  <w:abstractNum w:abstractNumId="11" w15:restartNumberingAfterBreak="0">
-    <w:nsid w:val="613E62E4"/>
+  <w:abstractNum w:abstractNumId="12" w15:restartNumberingAfterBreak="0">
+    <w:nsid w:val="456F7938"/>
     <w:multiLevelType w:val="multilevel"/>
-    <w:tmpl w:val="28ACAA2A"/>
+    <w:tmpl w:val="6298B67A"/>
     <w:lvl w:ilvl="0">
       <w:start w:val="1"/>
       <w:numFmt w:val="bullet"/>
@@ -12489,10 +12659,10 @@
       </w:rPr>
     </w:lvl>
   </w:abstractNum>
-  <w:abstractNum w:abstractNumId="12" w15:restartNumberingAfterBreak="0">
-    <w:nsid w:val="634D4920"/>
+  <w:abstractNum w:abstractNumId="13" w15:restartNumberingAfterBreak="0">
+    <w:nsid w:val="5E912196"/>
     <w:multiLevelType w:val="multilevel"/>
-    <w:tmpl w:val="4E9E669A"/>
+    <w:tmpl w:val="3F504A0A"/>
     <w:lvl w:ilvl="0">
       <w:start w:val="1"/>
       <w:numFmt w:val="bullet"/>
@@ -12638,123 +12808,10 @@
       </w:rPr>
     </w:lvl>
   </w:abstractNum>
-  <w:abstractNum w:abstractNumId="13" w15:restartNumberingAfterBreak="0">
-    <w:nsid w:val="6A83612C"/>
+  <w:abstractNum w:abstractNumId="14" w15:restartNumberingAfterBreak="0">
+    <w:nsid w:val="654A1001"/>
     <w:multiLevelType w:val="multilevel"/>
-    <w:tmpl w:val="392497F2"/>
-    <w:lvl w:ilvl="0">
-      <w:start w:val="1"/>
-      <w:numFmt w:val="decimal"/>
-      <w:lvlText w:val="%1."/>
-      <w:lvlJc w:val="left"/>
-      <w:pPr>
-        <w:tabs>
-          <w:tab w:val="num" w:pos="720"/>
-        </w:tabs>
-        <w:ind w:left="720" w:hanging="360"/>
-      </w:pPr>
-    </w:lvl>
-    <w:lvl w:ilvl="1" w:tentative="1">
-      <w:start w:val="1"/>
-      <w:numFmt w:val="decimal"/>
-      <w:lvlText w:val="%2."/>
-      <w:lvlJc w:val="left"/>
-      <w:pPr>
-        <w:tabs>
-          <w:tab w:val="num" w:pos="1440"/>
-        </w:tabs>
-        <w:ind w:left="1440" w:hanging="360"/>
-      </w:pPr>
-    </w:lvl>
-    <w:lvl w:ilvl="2" w:tentative="1">
-      <w:start w:val="1"/>
-      <w:numFmt w:val="decimal"/>
-      <w:lvlText w:val="%3."/>
-      <w:lvlJc w:val="left"/>
-      <w:pPr>
-        <w:tabs>
-          <w:tab w:val="num" w:pos="2160"/>
-        </w:tabs>
-        <w:ind w:left="2160" w:hanging="360"/>
-      </w:pPr>
-    </w:lvl>
-    <w:lvl w:ilvl="3" w:tentative="1">
-      <w:start w:val="1"/>
-      <w:numFmt w:val="decimal"/>
-      <w:lvlText w:val="%4."/>
-      <w:lvlJc w:val="left"/>
-      <w:pPr>
-        <w:tabs>
-          <w:tab w:val="num" w:pos="2880"/>
-        </w:tabs>
-        <w:ind w:left="2880" w:hanging="360"/>
-      </w:pPr>
-    </w:lvl>
-    <w:lvl w:ilvl="4" w:tentative="1">
-      <w:start w:val="1"/>
-      <w:numFmt w:val="decimal"/>
-      <w:lvlText w:val="%5."/>
-      <w:lvlJc w:val="left"/>
-      <w:pPr>
-        <w:tabs>
-          <w:tab w:val="num" w:pos="3600"/>
-        </w:tabs>
-        <w:ind w:left="3600" w:hanging="360"/>
-      </w:pPr>
-    </w:lvl>
-    <w:lvl w:ilvl="5" w:tentative="1">
-      <w:start w:val="1"/>
-      <w:numFmt w:val="decimal"/>
-      <w:lvlText w:val="%6."/>
-      <w:lvlJc w:val="left"/>
-      <w:pPr>
-        <w:tabs>
-          <w:tab w:val="num" w:pos="4320"/>
-        </w:tabs>
-        <w:ind w:left="4320" w:hanging="360"/>
-      </w:pPr>
-    </w:lvl>
-    <w:lvl w:ilvl="6" w:tentative="1">
-      <w:start w:val="1"/>
-      <w:numFmt w:val="decimal"/>
-      <w:lvlText w:val="%7."/>
-      <w:lvlJc w:val="left"/>
-      <w:pPr>
-        <w:tabs>
-          <w:tab w:val="num" w:pos="5040"/>
-        </w:tabs>
-        <w:ind w:left="5040" w:hanging="360"/>
-      </w:pPr>
-    </w:lvl>
-    <w:lvl w:ilvl="7" w:tentative="1">
-      <w:start w:val="1"/>
-      <w:numFmt w:val="decimal"/>
-      <w:lvlText w:val="%8."/>
-      <w:lvlJc w:val="left"/>
-      <w:pPr>
-        <w:tabs>
-          <w:tab w:val="num" w:pos="5760"/>
-        </w:tabs>
-        <w:ind w:left="5760" w:hanging="360"/>
-      </w:pPr>
-    </w:lvl>
-    <w:lvl w:ilvl="8" w:tentative="1">
-      <w:start w:val="1"/>
-      <w:numFmt w:val="decimal"/>
-      <w:lvlText w:val="%9."/>
-      <w:lvlJc w:val="left"/>
-      <w:pPr>
-        <w:tabs>
-          <w:tab w:val="num" w:pos="6480"/>
-        </w:tabs>
-        <w:ind w:left="6480" w:hanging="360"/>
-      </w:pPr>
-    </w:lvl>
-  </w:abstractNum>
-  <w:abstractNum w:abstractNumId="14" w15:restartNumberingAfterBreak="0">
-    <w:nsid w:val="6C2A50C3"/>
-    <w:multiLevelType w:val="multilevel"/>
-    <w:tmpl w:val="030C5282"/>
+    <w:tmpl w:val="37423168"/>
     <w:lvl w:ilvl="0">
       <w:start w:val="1"/>
       <w:numFmt w:val="bullet"/>
@@ -12901,122 +12958,9 @@
     </w:lvl>
   </w:abstractNum>
   <w:abstractNum w:abstractNumId="15" w15:restartNumberingAfterBreak="0">
-    <w:nsid w:val="754930AC"/>
+    <w:nsid w:val="683C250E"/>
     <w:multiLevelType w:val="multilevel"/>
-    <w:tmpl w:val="0B2E3346"/>
-    <w:lvl w:ilvl="0">
-      <w:start w:val="1"/>
-      <w:numFmt w:val="decimal"/>
-      <w:lvlText w:val="%1."/>
-      <w:lvlJc w:val="left"/>
-      <w:pPr>
-        <w:tabs>
-          <w:tab w:val="num" w:pos="720"/>
-        </w:tabs>
-        <w:ind w:left="720" w:hanging="360"/>
-      </w:pPr>
-    </w:lvl>
-    <w:lvl w:ilvl="1" w:tentative="1">
-      <w:start w:val="1"/>
-      <w:numFmt w:val="decimal"/>
-      <w:lvlText w:val="%2."/>
-      <w:lvlJc w:val="left"/>
-      <w:pPr>
-        <w:tabs>
-          <w:tab w:val="num" w:pos="1440"/>
-        </w:tabs>
-        <w:ind w:left="1440" w:hanging="360"/>
-      </w:pPr>
-    </w:lvl>
-    <w:lvl w:ilvl="2" w:tentative="1">
-      <w:start w:val="1"/>
-      <w:numFmt w:val="decimal"/>
-      <w:lvlText w:val="%3."/>
-      <w:lvlJc w:val="left"/>
-      <w:pPr>
-        <w:tabs>
-          <w:tab w:val="num" w:pos="2160"/>
-        </w:tabs>
-        <w:ind w:left="2160" w:hanging="360"/>
-      </w:pPr>
-    </w:lvl>
-    <w:lvl w:ilvl="3" w:tentative="1">
-      <w:start w:val="1"/>
-      <w:numFmt w:val="decimal"/>
-      <w:lvlText w:val="%4."/>
-      <w:lvlJc w:val="left"/>
-      <w:pPr>
-        <w:tabs>
-          <w:tab w:val="num" w:pos="2880"/>
-        </w:tabs>
-        <w:ind w:left="2880" w:hanging="360"/>
-      </w:pPr>
-    </w:lvl>
-    <w:lvl w:ilvl="4" w:tentative="1">
-      <w:start w:val="1"/>
-      <w:numFmt w:val="decimal"/>
-      <w:lvlText w:val="%5."/>
-      <w:lvlJc w:val="left"/>
-      <w:pPr>
-        <w:tabs>
-          <w:tab w:val="num" w:pos="3600"/>
-        </w:tabs>
-        <w:ind w:left="3600" w:hanging="360"/>
-      </w:pPr>
-    </w:lvl>
-    <w:lvl w:ilvl="5" w:tentative="1">
-      <w:start w:val="1"/>
-      <w:numFmt w:val="decimal"/>
-      <w:lvlText w:val="%6."/>
-      <w:lvlJc w:val="left"/>
-      <w:pPr>
-        <w:tabs>
-          <w:tab w:val="num" w:pos="4320"/>
-        </w:tabs>
-        <w:ind w:left="4320" w:hanging="360"/>
-      </w:pPr>
-    </w:lvl>
-    <w:lvl w:ilvl="6" w:tentative="1">
-      <w:start w:val="1"/>
-      <w:numFmt w:val="decimal"/>
-      <w:lvlText w:val="%7."/>
-      <w:lvlJc w:val="left"/>
-      <w:pPr>
-        <w:tabs>
-          <w:tab w:val="num" w:pos="5040"/>
-        </w:tabs>
-        <w:ind w:left="5040" w:hanging="360"/>
-      </w:pPr>
-    </w:lvl>
-    <w:lvl w:ilvl="7" w:tentative="1">
-      <w:start w:val="1"/>
-      <w:numFmt w:val="decimal"/>
-      <w:lvlText w:val="%8."/>
-      <w:lvlJc w:val="left"/>
-      <w:pPr>
-        <w:tabs>
-          <w:tab w:val="num" w:pos="5760"/>
-        </w:tabs>
-        <w:ind w:left="5760" w:hanging="360"/>
-      </w:pPr>
-    </w:lvl>
-    <w:lvl w:ilvl="8" w:tentative="1">
-      <w:start w:val="1"/>
-      <w:numFmt w:val="decimal"/>
-      <w:lvlText w:val="%9."/>
-      <w:lvlJc w:val="left"/>
-      <w:pPr>
-        <w:tabs>
-          <w:tab w:val="num" w:pos="6480"/>
-        </w:tabs>
-        <w:ind w:left="6480" w:hanging="360"/>
-      </w:pPr>
-    </w:lvl>
-  </w:abstractNum>
-  <w:abstractNum w:abstractNumId="16" w15:restartNumberingAfterBreak="0">
-    <w:nsid w:val="75837B8E"/>
-    <w:multiLevelType w:val="multilevel"/>
-    <w:tmpl w:val="9B5242E4"/>
+    <w:tmpl w:val="77069A8C"/>
     <w:lvl w:ilvl="0">
       <w:start w:val="1"/>
       <w:numFmt w:val="bullet"/>
@@ -13162,10 +13106,10 @@
       </w:rPr>
     </w:lvl>
   </w:abstractNum>
-  <w:abstractNum w:abstractNumId="17" w15:restartNumberingAfterBreak="0">
-    <w:nsid w:val="7AFE2E8C"/>
+  <w:abstractNum w:abstractNumId="16" w15:restartNumberingAfterBreak="0">
+    <w:nsid w:val="69965DE8"/>
     <w:multiLevelType w:val="multilevel"/>
-    <w:tmpl w:val="EF0C493C"/>
+    <w:tmpl w:val="938CFB80"/>
     <w:lvl w:ilvl="0">
       <w:start w:val="1"/>
       <w:numFmt w:val="bullet"/>
@@ -13311,10 +13255,10 @@
       </w:rPr>
     </w:lvl>
   </w:abstractNum>
-  <w:abstractNum w:abstractNumId="18" w15:restartNumberingAfterBreak="0">
-    <w:nsid w:val="7D4C29A3"/>
+  <w:abstractNum w:abstractNumId="17" w15:restartNumberingAfterBreak="0">
+    <w:nsid w:val="69EE1C9C"/>
     <w:multiLevelType w:val="multilevel"/>
-    <w:tmpl w:val="FA9CBBAA"/>
+    <w:tmpl w:val="7DFE1CC0"/>
     <w:lvl w:ilvl="0">
       <w:start w:val="1"/>
       <w:numFmt w:val="bullet"/>
@@ -13460,10 +13404,10 @@
       </w:rPr>
     </w:lvl>
   </w:abstractNum>
-  <w:abstractNum w:abstractNumId="19" w15:restartNumberingAfterBreak="0">
-    <w:nsid w:val="7E4F7AC7"/>
+  <w:abstractNum w:abstractNumId="18" w15:restartNumberingAfterBreak="0">
+    <w:nsid w:val="6EE34E1A"/>
     <w:multiLevelType w:val="multilevel"/>
-    <w:tmpl w:val="0D224538"/>
+    <w:tmpl w:val="19B46CC0"/>
     <w:lvl w:ilvl="0">
       <w:start w:val="1"/>
       <w:numFmt w:val="bullet"/>
@@ -13609,65 +13553,178 @@
       </w:rPr>
     </w:lvl>
   </w:abstractNum>
-  <w:num w:numId="1" w16cid:durableId="1159426298">
+  <w:abstractNum w:abstractNumId="19" w15:restartNumberingAfterBreak="0">
+    <w:nsid w:val="6F556780"/>
+    <w:multiLevelType w:val="multilevel"/>
+    <w:tmpl w:val="DCBCD2FE"/>
+    <w:lvl w:ilvl="0">
+      <w:start w:val="1"/>
+      <w:numFmt w:val="decimal"/>
+      <w:lvlText w:val="%1."/>
+      <w:lvlJc w:val="left"/>
+      <w:pPr>
+        <w:tabs>
+          <w:tab w:val="num" w:pos="720"/>
+        </w:tabs>
+        <w:ind w:left="720" w:hanging="360"/>
+      </w:pPr>
+    </w:lvl>
+    <w:lvl w:ilvl="1" w:tentative="1">
+      <w:start w:val="1"/>
+      <w:numFmt w:val="decimal"/>
+      <w:lvlText w:val="%2."/>
+      <w:lvlJc w:val="left"/>
+      <w:pPr>
+        <w:tabs>
+          <w:tab w:val="num" w:pos="1440"/>
+        </w:tabs>
+        <w:ind w:left="1440" w:hanging="360"/>
+      </w:pPr>
+    </w:lvl>
+    <w:lvl w:ilvl="2" w:tentative="1">
+      <w:start w:val="1"/>
+      <w:numFmt w:val="decimal"/>
+      <w:lvlText w:val="%3."/>
+      <w:lvlJc w:val="left"/>
+      <w:pPr>
+        <w:tabs>
+          <w:tab w:val="num" w:pos="2160"/>
+        </w:tabs>
+        <w:ind w:left="2160" w:hanging="360"/>
+      </w:pPr>
+    </w:lvl>
+    <w:lvl w:ilvl="3" w:tentative="1">
+      <w:start w:val="1"/>
+      <w:numFmt w:val="decimal"/>
+      <w:lvlText w:val="%4."/>
+      <w:lvlJc w:val="left"/>
+      <w:pPr>
+        <w:tabs>
+          <w:tab w:val="num" w:pos="2880"/>
+        </w:tabs>
+        <w:ind w:left="2880" w:hanging="360"/>
+      </w:pPr>
+    </w:lvl>
+    <w:lvl w:ilvl="4" w:tentative="1">
+      <w:start w:val="1"/>
+      <w:numFmt w:val="decimal"/>
+      <w:lvlText w:val="%5."/>
+      <w:lvlJc w:val="left"/>
+      <w:pPr>
+        <w:tabs>
+          <w:tab w:val="num" w:pos="3600"/>
+        </w:tabs>
+        <w:ind w:left="3600" w:hanging="360"/>
+      </w:pPr>
+    </w:lvl>
+    <w:lvl w:ilvl="5" w:tentative="1">
+      <w:start w:val="1"/>
+      <w:numFmt w:val="decimal"/>
+      <w:lvlText w:val="%6."/>
+      <w:lvlJc w:val="left"/>
+      <w:pPr>
+        <w:tabs>
+          <w:tab w:val="num" w:pos="4320"/>
+        </w:tabs>
+        <w:ind w:left="4320" w:hanging="360"/>
+      </w:pPr>
+    </w:lvl>
+    <w:lvl w:ilvl="6" w:tentative="1">
+      <w:start w:val="1"/>
+      <w:numFmt w:val="decimal"/>
+      <w:lvlText w:val="%7."/>
+      <w:lvlJc w:val="left"/>
+      <w:pPr>
+        <w:tabs>
+          <w:tab w:val="num" w:pos="5040"/>
+        </w:tabs>
+        <w:ind w:left="5040" w:hanging="360"/>
+      </w:pPr>
+    </w:lvl>
+    <w:lvl w:ilvl="7" w:tentative="1">
+      <w:start w:val="1"/>
+      <w:numFmt w:val="decimal"/>
+      <w:lvlText w:val="%8."/>
+      <w:lvlJc w:val="left"/>
+      <w:pPr>
+        <w:tabs>
+          <w:tab w:val="num" w:pos="5760"/>
+        </w:tabs>
+        <w:ind w:left="5760" w:hanging="360"/>
+      </w:pPr>
+    </w:lvl>
+    <w:lvl w:ilvl="8" w:tentative="1">
+      <w:start w:val="1"/>
+      <w:numFmt w:val="decimal"/>
+      <w:lvlText w:val="%9."/>
+      <w:lvlJc w:val="left"/>
+      <w:pPr>
+        <w:tabs>
+          <w:tab w:val="num" w:pos="6480"/>
+        </w:tabs>
+        <w:ind w:left="6480" w:hanging="360"/>
+      </w:pPr>
+    </w:lvl>
+  </w:abstractNum>
+  <w:num w:numId="1" w16cid:durableId="24335306">
+    <w:abstractNumId w:val="6"/>
+  </w:num>
+  <w:num w:numId="2" w16cid:durableId="683558867">
+    <w:abstractNumId w:val="0"/>
+  </w:num>
+  <w:num w:numId="3" w16cid:durableId="645090428">
+    <w:abstractNumId w:val="7"/>
+  </w:num>
+  <w:num w:numId="4" w16cid:durableId="1844123505">
+    <w:abstractNumId w:val="14"/>
+  </w:num>
+  <w:num w:numId="5" w16cid:durableId="184296691">
+    <w:abstractNumId w:val="1"/>
+  </w:num>
+  <w:num w:numId="6" w16cid:durableId="1823110692">
+    <w:abstractNumId w:val="12"/>
+  </w:num>
+  <w:num w:numId="7" w16cid:durableId="1326593398">
+    <w:abstractNumId w:val="8"/>
+  </w:num>
+  <w:num w:numId="8" w16cid:durableId="533080823">
+    <w:abstractNumId w:val="11"/>
+  </w:num>
+  <w:num w:numId="9" w16cid:durableId="266887591">
+    <w:abstractNumId w:val="2"/>
+  </w:num>
+  <w:num w:numId="10" w16cid:durableId="242491631">
+    <w:abstractNumId w:val="5"/>
+  </w:num>
+  <w:num w:numId="11" w16cid:durableId="645821354">
+    <w:abstractNumId w:val="9"/>
+  </w:num>
+  <w:num w:numId="12" w16cid:durableId="1973554969">
+    <w:abstractNumId w:val="4"/>
+  </w:num>
+  <w:num w:numId="13" w16cid:durableId="299042551">
+    <w:abstractNumId w:val="16"/>
+  </w:num>
+  <w:num w:numId="14" w16cid:durableId="1008219229">
+    <w:abstractNumId w:val="17"/>
+  </w:num>
+  <w:num w:numId="15" w16cid:durableId="1657418667">
+    <w:abstractNumId w:val="3"/>
+  </w:num>
+  <w:num w:numId="16" w16cid:durableId="140537810">
+    <w:abstractNumId w:val="19"/>
+  </w:num>
+  <w:num w:numId="17" w16cid:durableId="1149786350">
+    <w:abstractNumId w:val="10"/>
+  </w:num>
+  <w:num w:numId="18" w16cid:durableId="1321956889">
     <w:abstractNumId w:val="15"/>
   </w:num>
-  <w:num w:numId="2" w16cid:durableId="1696300125">
-    <w:abstractNumId w:val="19"/>
-  </w:num>
-  <w:num w:numId="3" w16cid:durableId="2128692725">
-    <w:abstractNumId w:val="10"/>
-  </w:num>
-  <w:num w:numId="4" w16cid:durableId="1393045154">
-    <w:abstractNumId w:val="1"/>
-  </w:num>
-  <w:num w:numId="5" w16cid:durableId="163320192">
-    <w:abstractNumId w:val="6"/>
-  </w:num>
-  <w:num w:numId="6" w16cid:durableId="1310667831">
-    <w:abstractNumId w:val="14"/>
-  </w:num>
-  <w:num w:numId="7" w16cid:durableId="1048604011">
-    <w:abstractNumId w:val="11"/>
-  </w:num>
-  <w:num w:numId="8" w16cid:durableId="1497111106">
-    <w:abstractNumId w:val="12"/>
-  </w:num>
-  <w:num w:numId="9" w16cid:durableId="189953629">
-    <w:abstractNumId w:val="18"/>
-  </w:num>
-  <w:num w:numId="10" w16cid:durableId="576984820">
-    <w:abstractNumId w:val="3"/>
-  </w:num>
-  <w:num w:numId="11" w16cid:durableId="688526845">
-    <w:abstractNumId w:val="8"/>
-  </w:num>
-  <w:num w:numId="12" w16cid:durableId="187528476">
-    <w:abstractNumId w:val="9"/>
-  </w:num>
-  <w:num w:numId="13" w16cid:durableId="1884058792">
-    <w:abstractNumId w:val="0"/>
-  </w:num>
-  <w:num w:numId="14" w16cid:durableId="882450668">
-    <w:abstractNumId w:val="7"/>
-  </w:num>
-  <w:num w:numId="15" w16cid:durableId="1698894260">
-    <w:abstractNumId w:val="4"/>
-  </w:num>
-  <w:num w:numId="16" w16cid:durableId="1469786262">
+  <w:num w:numId="19" w16cid:durableId="1854952222">
     <w:abstractNumId w:val="13"/>
   </w:num>
-  <w:num w:numId="17" w16cid:durableId="1312175537">
-    <w:abstractNumId w:val="5"/>
-  </w:num>
-  <w:num w:numId="18" w16cid:durableId="1272664816">
-    <w:abstractNumId w:val="2"/>
-  </w:num>
-  <w:num w:numId="19" w16cid:durableId="221331412">
-    <w:abstractNumId w:val="17"/>
-  </w:num>
-  <w:num w:numId="20" w16cid:durableId="1315917534">
-    <w:abstractNumId w:val="16"/>
+  <w:num w:numId="20" w16cid:durableId="778918526">
+    <w:abstractNumId w:val="18"/>
   </w:num>
 </w:numbering>
 </file>

</xml_diff>

<commit_message>
Drift-dok: AIO WP Migration deaktiveret (cbcit.dk) + Let's Encrypt origin-cert paa datagaarden.dk (audit-fund 8+9, 28/10)
Co-Authored-By: Claude Fable 5.1 <noreply@anthropic.com>
</commit_message>
<xml_diff>
--- a/drift/07-break-glass-adgang.docx
+++ b/drift/07-break-glass-adgang.docx
@@ -231,7 +231,7 @@
       <w:pPr>
         <w:pStyle w:val="NormalWeb"/>
         <w:shd w:val="clear" w:color="auto" w:fill="F7FBFA"/>
-        <w:divId w:val="479662942"/>
+        <w:divId w:val="625352151"/>
         <w:rPr>
           <w:rFonts w:ascii="Calibri" w:hAnsi="Calibri" w:cs="Calibri"/>
           <w:sz w:val="21"/>
@@ -301,7 +301,7 @@
       <w:pPr>
         <w:pStyle w:val="NormalWeb"/>
         <w:shd w:val="clear" w:color="auto" w:fill="F7FBFA"/>
-        <w:divId w:val="479662942"/>
+        <w:divId w:val="625352151"/>
         <w:rPr>
           <w:rFonts w:ascii="Calibri" w:hAnsi="Calibri" w:cs="Calibri"/>
           <w:sz w:val="21"/>
@@ -381,7 +381,7 @@
           <w:sz w:val="21"/>
           <w:szCs w:val="21"/>
         </w:rPr>
-        <w:pict w14:anchorId="3861EC35">
+        <w:pict w14:anchorId="6ACA989D">
           <v:rect id="_x0000_i1025" style="width:0;height:1.5pt" o:hralign="center" o:hrstd="t" o:hr="t" fillcolor="#a0a0a0" stroked="f"/>
         </w:pict>
       </w:r>
@@ -714,7 +714,7 @@
           <w:sz w:val="21"/>
           <w:szCs w:val="21"/>
         </w:rPr>
-        <w:pict w14:anchorId="1FAF83CC">
+        <w:pict w14:anchorId="794DAA1B">
           <v:rect id="_x0000_i1026" style="width:0;height:1.5pt" o:hralign="center" o:hrstd="t" o:hr="t" fillcolor="#a0a0a0" stroked="f"/>
         </w:pict>
       </w:r>
@@ -808,7 +808,6 @@
                 <w:sz w:val="18"/>
                 <w:szCs w:val="18"/>
               </w:rPr>
-              <w:lastRenderedPageBreak/>
               <w:t>Lag</w:t>
             </w:r>
           </w:p>
@@ -2291,7 +2290,7 @@
           <w:sz w:val="21"/>
           <w:szCs w:val="21"/>
         </w:rPr>
-        <w:pict w14:anchorId="2B5FFB15">
+        <w:pict w14:anchorId="3383BD61">
           <v:rect id="_x0000_i1027" style="width:0;height:1.5pt" o:hralign="center" o:hrstd="t" o:hr="t" fillcolor="#a0a0a0" stroked="f"/>
         </w:pict>
       </w:r>
@@ -2526,7 +2525,6 @@
           <w:sz w:val="21"/>
           <w:szCs w:val="21"/>
         </w:rPr>
-        <w:lastRenderedPageBreak/>
         <w:t xml:space="preserve">[ ] </w:t>
       </w:r>
       <w:r>
@@ -3299,7 +3297,7 @@
           <w:sz w:val="21"/>
           <w:szCs w:val="21"/>
         </w:rPr>
-        <w:pict w14:anchorId="1C302388">
+        <w:pict w14:anchorId="6004F78C">
           <v:rect id="_x0000_i1028" style="width:0;height:1.5pt" o:hralign="center" o:hrstd="t" o:hr="t" fillcolor="#a0a0a0" stroked="f"/>
         </w:pict>
       </w:r>
@@ -3631,7 +3629,7 @@
           <w:sz w:val="21"/>
           <w:szCs w:val="21"/>
         </w:rPr>
-        <w:pict w14:anchorId="7DCFD625">
+        <w:pict w14:anchorId="39999060">
           <v:rect id="_x0000_i1029" style="width:0;height:1.5pt" o:hralign="center" o:hrstd="t" o:hr="t" fillcolor="#a0a0a0" stroked="f"/>
         </w:pict>
       </w:r>
@@ -3647,7 +3645,6 @@
         <w:rPr>
           <w:rFonts w:ascii="Calibri" w:eastAsia="Times New Roman" w:hAnsi="Calibri" w:cs="Calibri"/>
         </w:rPr>
-        <w:lastRenderedPageBreak/>
         <w:t>4. Trin-for-trin: Genskab SSH-adgang</w:t>
       </w:r>
     </w:p>
@@ -3947,7 +3944,7 @@
           <w:sz w:val="21"/>
           <w:szCs w:val="21"/>
         </w:rPr>
-        <w:pict w14:anchorId="29573D0F">
+        <w:pict w14:anchorId="53447689">
           <v:rect id="_x0000_i1030" style="width:0;height:1.5pt" o:hralign="center" o:hrstd="t" o:hr="t" fillcolor="#a0a0a0" stroked="f"/>
         </w:pict>
       </w:r>
@@ -4399,7 +4396,6 @@
                 <w:sz w:val="18"/>
                 <w:szCs w:val="18"/>
               </w:rPr>
-              <w:lastRenderedPageBreak/>
               <w:t>Hvad</w:t>
             </w:r>
           </w:p>
@@ -5647,7 +5643,7 @@
           <w:sz w:val="21"/>
           <w:szCs w:val="21"/>
         </w:rPr>
-        <w:pict w14:anchorId="12CE266B">
+        <w:pict w14:anchorId="04844070">
           <v:rect id="_x0000_i1031" style="width:0;height:1.5pt" o:hralign="center" o:hrstd="t" o:hr="t" fillcolor="#a0a0a0" stroked="f"/>
         </w:pict>
       </w:r>
@@ -7154,7 +7150,7 @@
           <w:sz w:val="21"/>
           <w:szCs w:val="21"/>
         </w:rPr>
-        <w:pict w14:anchorId="09A492AB">
+        <w:pict w14:anchorId="60A8B3EB">
           <v:rect id="_x0000_i1032" style="width:0;height:1.5pt" o:hralign="center" o:hrstd="t" o:hr="t" fillcolor="#a0a0a0" stroked="f"/>
         </w:pict>
       </w:r>
@@ -7694,7 +7690,7 @@
           <w:sz w:val="21"/>
           <w:szCs w:val="21"/>
         </w:rPr>
-        <w:pict w14:anchorId="099B5BA7">
+        <w:pict w14:anchorId="430B3728">
           <v:rect id="_x0000_i1033" style="width:0;height:1.5pt" o:hralign="center" o:hrstd="t" o:hr="t" fillcolor="#a0a0a0" stroked="f"/>
         </w:pict>
       </w:r>
@@ -7934,7 +7930,7 @@
       <w:pPr>
         <w:pStyle w:val="NormalWeb"/>
         <w:shd w:val="clear" w:color="auto" w:fill="F7FBFA"/>
-        <w:divId w:val="1938323347"/>
+        <w:divId w:val="832069316"/>
         <w:rPr>
           <w:rFonts w:ascii="Calibri" w:hAnsi="Calibri" w:cs="Calibri"/>
           <w:sz w:val="21"/>
@@ -8387,7 +8383,7 @@
           <w:sz w:val="21"/>
           <w:szCs w:val="21"/>
         </w:rPr>
-        <w:pict w14:anchorId="2817CB9E">
+        <w:pict w14:anchorId="204FCBE1">
           <v:rect id="_x0000_i1034" style="width:0;height:1.5pt" o:hralign="center" o:hrstd="t" o:hr="t" fillcolor="#a0a0a0" stroked="f"/>
         </w:pict>
       </w:r>
@@ -9299,7 +9295,7 @@
           <w:sz w:val="21"/>
           <w:szCs w:val="21"/>
         </w:rPr>
-        <w:pict w14:anchorId="33EB3DD9">
+        <w:pict w14:anchorId="304D421E">
           <v:rect id="_x0000_i1035" style="width:0;height:1.5pt" o:hralign="center" o:hrstd="t" o:hr="t" fillcolor="#a0a0a0" stroked="f"/>
         </w:pict>
       </w:r>
@@ -9937,7 +9933,7 @@
           <w:sz w:val="21"/>
           <w:szCs w:val="21"/>
         </w:rPr>
-        <w:t xml:space="preserve">gennemføres af de enkelte admins inden fristerne (kravet er sat på alle tre sites) · datagaarden-ansatte nedgraderes fra administrator til editor (Datagaardens egen admin) · mail-DNS (SPF-oprydning cbcit.dk, DMARC → quarantine, DMARC + Brevo-DKIM for datagaarden.dk) · deaktivér All-in-One WP Migration på cbcit.dk · CF Origin-cert til datagaarden.dk · fjern TeamViewerQS.exe fra datagaarden.dk/Support · slet </w:t>
+        <w:t xml:space="preserve">gennemføres af de enkelte admins inden fristerne (kravet er sat på alle tre sites) · datagaarden-ansatte nedgraderes fra administrator til editor (Datagaardens egen admin) · mail-DNS (SPF-oprydning cbcit.dk, DMARC → quarantine, DMARC + Brevo-DKIM for datagaarden.dk) · CF Configuration Rule "SSL: Strict" pr. host (alle tre origins har nu gyldige certs; kræver dashboard eller Config-Rules-scope på tokenet) · fjern TeamViewerQS.exe fra datagaarden.dk/Support · slet </w:t>
       </w:r>
       <w:r>
         <w:rPr>
@@ -9968,7 +9964,7 @@
           <w:sz w:val="21"/>
           <w:szCs w:val="21"/>
         </w:rPr>
-        <w:pict w14:anchorId="62B07251">
+        <w:pict w14:anchorId="1EEE4866">
           <v:rect id="_x0000_i1036" style="width:0;height:1.5pt" o:hralign="center" o:hrstd="t" o:hr="t" fillcolor="#a0a0a0" stroked="f"/>
         </w:pict>
       </w:r>
@@ -10226,7 +10222,7 @@
       <w:pPr>
         <w:pStyle w:val="NormalWeb"/>
         <w:shd w:val="clear" w:color="auto" w:fill="F7FBFA"/>
-        <w:divId w:val="2144273544"/>
+        <w:divId w:val="2065135135"/>
         <w:rPr>
           <w:rFonts w:ascii="Calibri" w:hAnsi="Calibri" w:cs="Calibri"/>
           <w:sz w:val="21"/>
@@ -10256,7 +10252,7 @@
           <w:sz w:val="21"/>
           <w:szCs w:val="21"/>
         </w:rPr>
-        <w:pict w14:anchorId="261E6804">
+        <w:pict w14:anchorId="365C402E">
           <v:rect id="_x0000_i1037" style="width:0;height:1.5pt" o:hralign="center" o:hrstd="t" o:hr="t" fillcolor="#a0a0a0" stroked="f"/>
         </w:pict>
       </w:r>
@@ -10822,7 +10818,7 @@
           <w:sz w:val="21"/>
           <w:szCs w:val="21"/>
         </w:rPr>
-        <w:pict w14:anchorId="77892C14">
+        <w:pict w14:anchorId="0C16F75C">
           <v:rect id="_x0000_i1038" style="width:0;height:1.5pt" o:hralign="center" o:hrstd="t" o:hr="t" fillcolor="#a0a0a0" stroked="f"/>
         </w:pict>
       </w:r>
@@ -10867,9 +10863,9 @@
 <file path=word/numbering.xml><?xml version="1.0" encoding="utf-8"?>
 <w:numbering xmlns:wpc="http://schemas.microsoft.com/office/word/2010/wordprocessingCanvas" xmlns:cx="http://schemas.microsoft.com/office/drawing/2014/chartex" xmlns:cx1="http://schemas.microsoft.com/office/drawing/2015/9/8/chartex" xmlns:cx2="http://schemas.microsoft.com/office/drawing/2015/10/21/chartex" xmlns:cx3="http://schemas.microsoft.com/office/drawing/2016/5/9/chartex" xmlns:cx4="http://schemas.microsoft.com/office/drawing/2016/5/10/chartex" xmlns:cx5="http://schemas.microsoft.com/office/drawing/2016/5/11/chartex" xmlns:cx6="http://schemas.microsoft.com/office/drawing/2016/5/12/chartex" xmlns:cx7="http://schemas.microsoft.com/office/drawing/2016/5/13/chartex" xmlns:cx8="http://schemas.microsoft.com/office/drawing/2016/5/14/chartex" xmlns:mc="http://schemas.openxmlformats.org/markup-compatibility/2006" xmlns:aink="http://schemas.microsoft.com/office/drawing/2016/ink" xmlns:am3d="http://schemas.microsoft.com/office/drawing/2017/model3d" xmlns:o="urn:schemas-microsoft-com:office:office" xmlns:oel="http://schemas.microsoft.com/office/2019/extlst" xmlns:r="http://schemas.openxmlformats.org/officeDocument/2006/relationships" xmlns:m="http://schemas.openxmlformats.org/officeDocument/2006/math" xmlns:v="urn:schemas-microsoft-com:vml" xmlns:wp14="http://schemas.microsoft.com/office/word/2010/wordprocessingDrawing" xmlns:wp="http://schemas.openxmlformats.org/drawingml/2006/wordprocessingDrawing" xmlns:w10="urn:schemas-microsoft-com:office:word" xmlns:w="http://schemas.openxmlformats.org/wordprocessingml/2006/main" xmlns:w14="http://schemas.microsoft.com/office/word/2010/wordml" xmlns:w15="http://schemas.microsoft.com/office/word/2012/wordml" xmlns:w16cex="http://schemas.microsoft.com/office/word/2018/wordml/cex" xmlns:w16cid="http://schemas.microsoft.com/office/word/2016/wordml/cid" xmlns:w16="http://schemas.microsoft.com/office/word/2018/wordml" xmlns:w16du="http://schemas.microsoft.com/office/word/2023/wordml/word16du" xmlns:w16sdtdh="http://schemas.microsoft.com/office/word/2020/wordml/sdtdatahash" xmlns:w16sdtfl="http://schemas.microsoft.com/office/word/2024/wordml/sdtformatlock" xmlns:w16se="http://schemas.microsoft.com/office/word/2015/wordml/symex" xmlns:wpg="http://schemas.microsoft.com/office/word/2010/wordprocessingGroup" xmlns:wpi="http://schemas.microsoft.com/office/word/2010/wordprocessingInk" xmlns:wne="http://schemas.microsoft.com/office/word/2006/wordml" xmlns:wps="http://schemas.microsoft.com/office/word/2010/wordprocessingShape" mc:Ignorable="w14 w15 w16se w16cid w16 w16cex w16sdtdh w16sdtfl w16du wp14">
   <w:abstractNum w:abstractNumId="0" w15:restartNumberingAfterBreak="0">
-    <w:nsid w:val="061F0C62"/>
+    <w:nsid w:val="033B1EC3"/>
     <w:multiLevelType w:val="multilevel"/>
-    <w:tmpl w:val="558C35AC"/>
+    <w:tmpl w:val="C8C2735A"/>
     <w:lvl w:ilvl="0">
       <w:start w:val="1"/>
       <w:numFmt w:val="bullet"/>
@@ -11016,122 +11012,9 @@
     </w:lvl>
   </w:abstractNum>
   <w:abstractNum w:abstractNumId="1" w15:restartNumberingAfterBreak="0">
-    <w:nsid w:val="0A982823"/>
+    <w:nsid w:val="03934D76"/>
     <w:multiLevelType w:val="multilevel"/>
-    <w:tmpl w:val="F5160BF4"/>
-    <w:lvl w:ilvl="0">
-      <w:start w:val="1"/>
-      <w:numFmt w:val="decimal"/>
-      <w:lvlText w:val="%1."/>
-      <w:lvlJc w:val="left"/>
-      <w:pPr>
-        <w:tabs>
-          <w:tab w:val="num" w:pos="720"/>
-        </w:tabs>
-        <w:ind w:left="720" w:hanging="360"/>
-      </w:pPr>
-    </w:lvl>
-    <w:lvl w:ilvl="1" w:tentative="1">
-      <w:start w:val="1"/>
-      <w:numFmt w:val="decimal"/>
-      <w:lvlText w:val="%2."/>
-      <w:lvlJc w:val="left"/>
-      <w:pPr>
-        <w:tabs>
-          <w:tab w:val="num" w:pos="1440"/>
-        </w:tabs>
-        <w:ind w:left="1440" w:hanging="360"/>
-      </w:pPr>
-    </w:lvl>
-    <w:lvl w:ilvl="2" w:tentative="1">
-      <w:start w:val="1"/>
-      <w:numFmt w:val="decimal"/>
-      <w:lvlText w:val="%3."/>
-      <w:lvlJc w:val="left"/>
-      <w:pPr>
-        <w:tabs>
-          <w:tab w:val="num" w:pos="2160"/>
-        </w:tabs>
-        <w:ind w:left="2160" w:hanging="360"/>
-      </w:pPr>
-    </w:lvl>
-    <w:lvl w:ilvl="3" w:tentative="1">
-      <w:start w:val="1"/>
-      <w:numFmt w:val="decimal"/>
-      <w:lvlText w:val="%4."/>
-      <w:lvlJc w:val="left"/>
-      <w:pPr>
-        <w:tabs>
-          <w:tab w:val="num" w:pos="2880"/>
-        </w:tabs>
-        <w:ind w:left="2880" w:hanging="360"/>
-      </w:pPr>
-    </w:lvl>
-    <w:lvl w:ilvl="4" w:tentative="1">
-      <w:start w:val="1"/>
-      <w:numFmt w:val="decimal"/>
-      <w:lvlText w:val="%5."/>
-      <w:lvlJc w:val="left"/>
-      <w:pPr>
-        <w:tabs>
-          <w:tab w:val="num" w:pos="3600"/>
-        </w:tabs>
-        <w:ind w:left="3600" w:hanging="360"/>
-      </w:pPr>
-    </w:lvl>
-    <w:lvl w:ilvl="5" w:tentative="1">
-      <w:start w:val="1"/>
-      <w:numFmt w:val="decimal"/>
-      <w:lvlText w:val="%6."/>
-      <w:lvlJc w:val="left"/>
-      <w:pPr>
-        <w:tabs>
-          <w:tab w:val="num" w:pos="4320"/>
-        </w:tabs>
-        <w:ind w:left="4320" w:hanging="360"/>
-      </w:pPr>
-    </w:lvl>
-    <w:lvl w:ilvl="6" w:tentative="1">
-      <w:start w:val="1"/>
-      <w:numFmt w:val="decimal"/>
-      <w:lvlText w:val="%7."/>
-      <w:lvlJc w:val="left"/>
-      <w:pPr>
-        <w:tabs>
-          <w:tab w:val="num" w:pos="5040"/>
-        </w:tabs>
-        <w:ind w:left="5040" w:hanging="360"/>
-      </w:pPr>
-    </w:lvl>
-    <w:lvl w:ilvl="7" w:tentative="1">
-      <w:start w:val="1"/>
-      <w:numFmt w:val="decimal"/>
-      <w:lvlText w:val="%8."/>
-      <w:lvlJc w:val="left"/>
-      <w:pPr>
-        <w:tabs>
-          <w:tab w:val="num" w:pos="5760"/>
-        </w:tabs>
-        <w:ind w:left="5760" w:hanging="360"/>
-      </w:pPr>
-    </w:lvl>
-    <w:lvl w:ilvl="8" w:tentative="1">
-      <w:start w:val="1"/>
-      <w:numFmt w:val="decimal"/>
-      <w:lvlText w:val="%9."/>
-      <w:lvlJc w:val="left"/>
-      <w:pPr>
-        <w:tabs>
-          <w:tab w:val="num" w:pos="6480"/>
-        </w:tabs>
-        <w:ind w:left="6480" w:hanging="360"/>
-      </w:pPr>
-    </w:lvl>
-  </w:abstractNum>
-  <w:abstractNum w:abstractNumId="2" w15:restartNumberingAfterBreak="0">
-    <w:nsid w:val="12A61B05"/>
-    <w:multiLevelType w:val="multilevel"/>
-    <w:tmpl w:val="89F63A1E"/>
+    <w:tmpl w:val="E93C4BDE"/>
     <w:lvl w:ilvl="0">
       <w:start w:val="1"/>
       <w:numFmt w:val="bullet"/>
@@ -11277,123 +11160,10 @@
       </w:rPr>
     </w:lvl>
   </w:abstractNum>
-  <w:abstractNum w:abstractNumId="3" w15:restartNumberingAfterBreak="0">
-    <w:nsid w:val="13BA710B"/>
+  <w:abstractNum w:abstractNumId="2" w15:restartNumberingAfterBreak="0">
+    <w:nsid w:val="09970A99"/>
     <w:multiLevelType w:val="multilevel"/>
-    <w:tmpl w:val="0EB81CAE"/>
-    <w:lvl w:ilvl="0">
-      <w:start w:val="1"/>
-      <w:numFmt w:val="decimal"/>
-      <w:lvlText w:val="%1."/>
-      <w:lvlJc w:val="left"/>
-      <w:pPr>
-        <w:tabs>
-          <w:tab w:val="num" w:pos="720"/>
-        </w:tabs>
-        <w:ind w:left="720" w:hanging="360"/>
-      </w:pPr>
-    </w:lvl>
-    <w:lvl w:ilvl="1" w:tentative="1">
-      <w:start w:val="1"/>
-      <w:numFmt w:val="decimal"/>
-      <w:lvlText w:val="%2."/>
-      <w:lvlJc w:val="left"/>
-      <w:pPr>
-        <w:tabs>
-          <w:tab w:val="num" w:pos="1440"/>
-        </w:tabs>
-        <w:ind w:left="1440" w:hanging="360"/>
-      </w:pPr>
-    </w:lvl>
-    <w:lvl w:ilvl="2" w:tentative="1">
-      <w:start w:val="1"/>
-      <w:numFmt w:val="decimal"/>
-      <w:lvlText w:val="%3."/>
-      <w:lvlJc w:val="left"/>
-      <w:pPr>
-        <w:tabs>
-          <w:tab w:val="num" w:pos="2160"/>
-        </w:tabs>
-        <w:ind w:left="2160" w:hanging="360"/>
-      </w:pPr>
-    </w:lvl>
-    <w:lvl w:ilvl="3" w:tentative="1">
-      <w:start w:val="1"/>
-      <w:numFmt w:val="decimal"/>
-      <w:lvlText w:val="%4."/>
-      <w:lvlJc w:val="left"/>
-      <w:pPr>
-        <w:tabs>
-          <w:tab w:val="num" w:pos="2880"/>
-        </w:tabs>
-        <w:ind w:left="2880" w:hanging="360"/>
-      </w:pPr>
-    </w:lvl>
-    <w:lvl w:ilvl="4" w:tentative="1">
-      <w:start w:val="1"/>
-      <w:numFmt w:val="decimal"/>
-      <w:lvlText w:val="%5."/>
-      <w:lvlJc w:val="left"/>
-      <w:pPr>
-        <w:tabs>
-          <w:tab w:val="num" w:pos="3600"/>
-        </w:tabs>
-        <w:ind w:left="3600" w:hanging="360"/>
-      </w:pPr>
-    </w:lvl>
-    <w:lvl w:ilvl="5" w:tentative="1">
-      <w:start w:val="1"/>
-      <w:numFmt w:val="decimal"/>
-      <w:lvlText w:val="%6."/>
-      <w:lvlJc w:val="left"/>
-      <w:pPr>
-        <w:tabs>
-          <w:tab w:val="num" w:pos="4320"/>
-        </w:tabs>
-        <w:ind w:left="4320" w:hanging="360"/>
-      </w:pPr>
-    </w:lvl>
-    <w:lvl w:ilvl="6" w:tentative="1">
-      <w:start w:val="1"/>
-      <w:numFmt w:val="decimal"/>
-      <w:lvlText w:val="%7."/>
-      <w:lvlJc w:val="left"/>
-      <w:pPr>
-        <w:tabs>
-          <w:tab w:val="num" w:pos="5040"/>
-        </w:tabs>
-        <w:ind w:left="5040" w:hanging="360"/>
-      </w:pPr>
-    </w:lvl>
-    <w:lvl w:ilvl="7" w:tentative="1">
-      <w:start w:val="1"/>
-      <w:numFmt w:val="decimal"/>
-      <w:lvlText w:val="%8."/>
-      <w:lvlJc w:val="left"/>
-      <w:pPr>
-        <w:tabs>
-          <w:tab w:val="num" w:pos="5760"/>
-        </w:tabs>
-        <w:ind w:left="5760" w:hanging="360"/>
-      </w:pPr>
-    </w:lvl>
-    <w:lvl w:ilvl="8" w:tentative="1">
-      <w:start w:val="1"/>
-      <w:numFmt w:val="decimal"/>
-      <w:lvlText w:val="%9."/>
-      <w:lvlJc w:val="left"/>
-      <w:pPr>
-        <w:tabs>
-          <w:tab w:val="num" w:pos="6480"/>
-        </w:tabs>
-        <w:ind w:left="6480" w:hanging="360"/>
-      </w:pPr>
-    </w:lvl>
-  </w:abstractNum>
-  <w:abstractNum w:abstractNumId="4" w15:restartNumberingAfterBreak="0">
-    <w:nsid w:val="13E7488D"/>
-    <w:multiLevelType w:val="multilevel"/>
-    <w:tmpl w:val="3196C172"/>
+    <w:tmpl w:val="96C48226"/>
     <w:lvl w:ilvl="0">
       <w:start w:val="1"/>
       <w:numFmt w:val="bullet"/>
@@ -11539,10 +11309,123 @@
       </w:rPr>
     </w:lvl>
   </w:abstractNum>
-  <w:abstractNum w:abstractNumId="5" w15:restartNumberingAfterBreak="0">
-    <w:nsid w:val="15B73D0C"/>
+  <w:abstractNum w:abstractNumId="3" w15:restartNumberingAfterBreak="0">
+    <w:nsid w:val="10007537"/>
     <w:multiLevelType w:val="multilevel"/>
-    <w:tmpl w:val="5C6878B4"/>
+    <w:tmpl w:val="1A686F6C"/>
+    <w:lvl w:ilvl="0">
+      <w:start w:val="1"/>
+      <w:numFmt w:val="decimal"/>
+      <w:lvlText w:val="%1."/>
+      <w:lvlJc w:val="left"/>
+      <w:pPr>
+        <w:tabs>
+          <w:tab w:val="num" w:pos="720"/>
+        </w:tabs>
+        <w:ind w:left="720" w:hanging="360"/>
+      </w:pPr>
+    </w:lvl>
+    <w:lvl w:ilvl="1" w:tentative="1">
+      <w:start w:val="1"/>
+      <w:numFmt w:val="decimal"/>
+      <w:lvlText w:val="%2."/>
+      <w:lvlJc w:val="left"/>
+      <w:pPr>
+        <w:tabs>
+          <w:tab w:val="num" w:pos="1440"/>
+        </w:tabs>
+        <w:ind w:left="1440" w:hanging="360"/>
+      </w:pPr>
+    </w:lvl>
+    <w:lvl w:ilvl="2" w:tentative="1">
+      <w:start w:val="1"/>
+      <w:numFmt w:val="decimal"/>
+      <w:lvlText w:val="%3."/>
+      <w:lvlJc w:val="left"/>
+      <w:pPr>
+        <w:tabs>
+          <w:tab w:val="num" w:pos="2160"/>
+        </w:tabs>
+        <w:ind w:left="2160" w:hanging="360"/>
+      </w:pPr>
+    </w:lvl>
+    <w:lvl w:ilvl="3" w:tentative="1">
+      <w:start w:val="1"/>
+      <w:numFmt w:val="decimal"/>
+      <w:lvlText w:val="%4."/>
+      <w:lvlJc w:val="left"/>
+      <w:pPr>
+        <w:tabs>
+          <w:tab w:val="num" w:pos="2880"/>
+        </w:tabs>
+        <w:ind w:left="2880" w:hanging="360"/>
+      </w:pPr>
+    </w:lvl>
+    <w:lvl w:ilvl="4" w:tentative="1">
+      <w:start w:val="1"/>
+      <w:numFmt w:val="decimal"/>
+      <w:lvlText w:val="%5."/>
+      <w:lvlJc w:val="left"/>
+      <w:pPr>
+        <w:tabs>
+          <w:tab w:val="num" w:pos="3600"/>
+        </w:tabs>
+        <w:ind w:left="3600" w:hanging="360"/>
+      </w:pPr>
+    </w:lvl>
+    <w:lvl w:ilvl="5" w:tentative="1">
+      <w:start w:val="1"/>
+      <w:numFmt w:val="decimal"/>
+      <w:lvlText w:val="%6."/>
+      <w:lvlJc w:val="left"/>
+      <w:pPr>
+        <w:tabs>
+          <w:tab w:val="num" w:pos="4320"/>
+        </w:tabs>
+        <w:ind w:left="4320" w:hanging="360"/>
+      </w:pPr>
+    </w:lvl>
+    <w:lvl w:ilvl="6" w:tentative="1">
+      <w:start w:val="1"/>
+      <w:numFmt w:val="decimal"/>
+      <w:lvlText w:val="%7."/>
+      <w:lvlJc w:val="left"/>
+      <w:pPr>
+        <w:tabs>
+          <w:tab w:val="num" w:pos="5040"/>
+        </w:tabs>
+        <w:ind w:left="5040" w:hanging="360"/>
+      </w:pPr>
+    </w:lvl>
+    <w:lvl w:ilvl="7" w:tentative="1">
+      <w:start w:val="1"/>
+      <w:numFmt w:val="decimal"/>
+      <w:lvlText w:val="%8."/>
+      <w:lvlJc w:val="left"/>
+      <w:pPr>
+        <w:tabs>
+          <w:tab w:val="num" w:pos="5760"/>
+        </w:tabs>
+        <w:ind w:left="5760" w:hanging="360"/>
+      </w:pPr>
+    </w:lvl>
+    <w:lvl w:ilvl="8" w:tentative="1">
+      <w:start w:val="1"/>
+      <w:numFmt w:val="decimal"/>
+      <w:lvlText w:val="%9."/>
+      <w:lvlJc w:val="left"/>
+      <w:pPr>
+        <w:tabs>
+          <w:tab w:val="num" w:pos="6480"/>
+        </w:tabs>
+        <w:ind w:left="6480" w:hanging="360"/>
+      </w:pPr>
+    </w:lvl>
+  </w:abstractNum>
+  <w:abstractNum w:abstractNumId="4" w15:restartNumberingAfterBreak="0">
+    <w:nsid w:val="133B6CDD"/>
+    <w:multiLevelType w:val="multilevel"/>
+    <w:tmpl w:val="556EF6AC"/>
     <w:lvl w:ilvl="0">
       <w:start w:val="1"/>
       <w:numFmt w:val="bullet"/>
@@ -11688,123 +11571,10 @@
       </w:rPr>
     </w:lvl>
   </w:abstractNum>
-  <w:abstractNum w:abstractNumId="6" w15:restartNumberingAfterBreak="0">
-    <w:nsid w:val="1BF65B59"/>
+  <w:abstractNum w:abstractNumId="5" w15:restartNumberingAfterBreak="0">
+    <w:nsid w:val="21A14F2A"/>
     <w:multiLevelType w:val="multilevel"/>
-    <w:tmpl w:val="8AE60924"/>
-    <w:lvl w:ilvl="0">
-      <w:start w:val="1"/>
-      <w:numFmt w:val="decimal"/>
-      <w:lvlText w:val="%1."/>
-      <w:lvlJc w:val="left"/>
-      <w:pPr>
-        <w:tabs>
-          <w:tab w:val="num" w:pos="720"/>
-        </w:tabs>
-        <w:ind w:left="720" w:hanging="360"/>
-      </w:pPr>
-    </w:lvl>
-    <w:lvl w:ilvl="1" w:tentative="1">
-      <w:start w:val="1"/>
-      <w:numFmt w:val="decimal"/>
-      <w:lvlText w:val="%2."/>
-      <w:lvlJc w:val="left"/>
-      <w:pPr>
-        <w:tabs>
-          <w:tab w:val="num" w:pos="1440"/>
-        </w:tabs>
-        <w:ind w:left="1440" w:hanging="360"/>
-      </w:pPr>
-    </w:lvl>
-    <w:lvl w:ilvl="2" w:tentative="1">
-      <w:start w:val="1"/>
-      <w:numFmt w:val="decimal"/>
-      <w:lvlText w:val="%3."/>
-      <w:lvlJc w:val="left"/>
-      <w:pPr>
-        <w:tabs>
-          <w:tab w:val="num" w:pos="2160"/>
-        </w:tabs>
-        <w:ind w:left="2160" w:hanging="360"/>
-      </w:pPr>
-    </w:lvl>
-    <w:lvl w:ilvl="3" w:tentative="1">
-      <w:start w:val="1"/>
-      <w:numFmt w:val="decimal"/>
-      <w:lvlText w:val="%4."/>
-      <w:lvlJc w:val="left"/>
-      <w:pPr>
-        <w:tabs>
-          <w:tab w:val="num" w:pos="2880"/>
-        </w:tabs>
-        <w:ind w:left="2880" w:hanging="360"/>
-      </w:pPr>
-    </w:lvl>
-    <w:lvl w:ilvl="4" w:tentative="1">
-      <w:start w:val="1"/>
-      <w:numFmt w:val="decimal"/>
-      <w:lvlText w:val="%5."/>
-      <w:lvlJc w:val="left"/>
-      <w:pPr>
-        <w:tabs>
-          <w:tab w:val="num" w:pos="3600"/>
-        </w:tabs>
-        <w:ind w:left="3600" w:hanging="360"/>
-      </w:pPr>
-    </w:lvl>
-    <w:lvl w:ilvl="5" w:tentative="1">
-      <w:start w:val="1"/>
-      <w:numFmt w:val="decimal"/>
-      <w:lvlText w:val="%6."/>
-      <w:lvlJc w:val="left"/>
-      <w:pPr>
-        <w:tabs>
-          <w:tab w:val="num" w:pos="4320"/>
-        </w:tabs>
-        <w:ind w:left="4320" w:hanging="360"/>
-      </w:pPr>
-    </w:lvl>
-    <w:lvl w:ilvl="6" w:tentative="1">
-      <w:start w:val="1"/>
-      <w:numFmt w:val="decimal"/>
-      <w:lvlText w:val="%7."/>
-      <w:lvlJc w:val="left"/>
-      <w:pPr>
-        <w:tabs>
-          <w:tab w:val="num" w:pos="5040"/>
-        </w:tabs>
-        <w:ind w:left="5040" w:hanging="360"/>
-      </w:pPr>
-    </w:lvl>
-    <w:lvl w:ilvl="7" w:tentative="1">
-      <w:start w:val="1"/>
-      <w:numFmt w:val="decimal"/>
-      <w:lvlText w:val="%8."/>
-      <w:lvlJc w:val="left"/>
-      <w:pPr>
-        <w:tabs>
-          <w:tab w:val="num" w:pos="5760"/>
-        </w:tabs>
-        <w:ind w:left="5760" w:hanging="360"/>
-      </w:pPr>
-    </w:lvl>
-    <w:lvl w:ilvl="8" w:tentative="1">
-      <w:start w:val="1"/>
-      <w:numFmt w:val="decimal"/>
-      <w:lvlText w:val="%9."/>
-      <w:lvlJc w:val="left"/>
-      <w:pPr>
-        <w:tabs>
-          <w:tab w:val="num" w:pos="6480"/>
-        </w:tabs>
-        <w:ind w:left="6480" w:hanging="360"/>
-      </w:pPr>
-    </w:lvl>
-  </w:abstractNum>
-  <w:abstractNum w:abstractNumId="7" w15:restartNumberingAfterBreak="0">
-    <w:nsid w:val="1DFF70D4"/>
-    <w:multiLevelType w:val="multilevel"/>
-    <w:tmpl w:val="A066DB72"/>
+    <w:tmpl w:val="8304B088"/>
     <w:lvl w:ilvl="0">
       <w:start w:val="1"/>
       <w:numFmt w:val="bullet"/>
@@ -11950,10 +11720,10 @@
       </w:rPr>
     </w:lvl>
   </w:abstractNum>
-  <w:abstractNum w:abstractNumId="8" w15:restartNumberingAfterBreak="0">
-    <w:nsid w:val="1F49788C"/>
+  <w:abstractNum w:abstractNumId="6" w15:restartNumberingAfterBreak="0">
+    <w:nsid w:val="22623F91"/>
     <w:multiLevelType w:val="multilevel"/>
-    <w:tmpl w:val="C51EB51C"/>
+    <w:tmpl w:val="CEE4AC28"/>
     <w:lvl w:ilvl="0">
       <w:start w:val="1"/>
       <w:numFmt w:val="bullet"/>
@@ -12099,10 +11869,10 @@
       </w:rPr>
     </w:lvl>
   </w:abstractNum>
-  <w:abstractNum w:abstractNumId="9" w15:restartNumberingAfterBreak="0">
-    <w:nsid w:val="21765D8D"/>
+  <w:abstractNum w:abstractNumId="7" w15:restartNumberingAfterBreak="0">
+    <w:nsid w:val="258A47C0"/>
     <w:multiLevelType w:val="multilevel"/>
-    <w:tmpl w:val="739A3DC0"/>
+    <w:tmpl w:val="99003558"/>
     <w:lvl w:ilvl="0">
       <w:start w:val="1"/>
       <w:numFmt w:val="bullet"/>
@@ -12248,123 +12018,10 @@
       </w:rPr>
     </w:lvl>
   </w:abstractNum>
-  <w:abstractNum w:abstractNumId="10" w15:restartNumberingAfterBreak="0">
-    <w:nsid w:val="243240BA"/>
+  <w:abstractNum w:abstractNumId="8" w15:restartNumberingAfterBreak="0">
+    <w:nsid w:val="286A29AB"/>
     <w:multiLevelType w:val="multilevel"/>
-    <w:tmpl w:val="DCC28FAE"/>
-    <w:lvl w:ilvl="0">
-      <w:start w:val="1"/>
-      <w:numFmt w:val="decimal"/>
-      <w:lvlText w:val="%1."/>
-      <w:lvlJc w:val="left"/>
-      <w:pPr>
-        <w:tabs>
-          <w:tab w:val="num" w:pos="720"/>
-        </w:tabs>
-        <w:ind w:left="720" w:hanging="360"/>
-      </w:pPr>
-    </w:lvl>
-    <w:lvl w:ilvl="1" w:tentative="1">
-      <w:start w:val="1"/>
-      <w:numFmt w:val="decimal"/>
-      <w:lvlText w:val="%2."/>
-      <w:lvlJc w:val="left"/>
-      <w:pPr>
-        <w:tabs>
-          <w:tab w:val="num" w:pos="1440"/>
-        </w:tabs>
-        <w:ind w:left="1440" w:hanging="360"/>
-      </w:pPr>
-    </w:lvl>
-    <w:lvl w:ilvl="2" w:tentative="1">
-      <w:start w:val="1"/>
-      <w:numFmt w:val="decimal"/>
-      <w:lvlText w:val="%3."/>
-      <w:lvlJc w:val="left"/>
-      <w:pPr>
-        <w:tabs>
-          <w:tab w:val="num" w:pos="2160"/>
-        </w:tabs>
-        <w:ind w:left="2160" w:hanging="360"/>
-      </w:pPr>
-    </w:lvl>
-    <w:lvl w:ilvl="3" w:tentative="1">
-      <w:start w:val="1"/>
-      <w:numFmt w:val="decimal"/>
-      <w:lvlText w:val="%4."/>
-      <w:lvlJc w:val="left"/>
-      <w:pPr>
-        <w:tabs>
-          <w:tab w:val="num" w:pos="2880"/>
-        </w:tabs>
-        <w:ind w:left="2880" w:hanging="360"/>
-      </w:pPr>
-    </w:lvl>
-    <w:lvl w:ilvl="4" w:tentative="1">
-      <w:start w:val="1"/>
-      <w:numFmt w:val="decimal"/>
-      <w:lvlText w:val="%5."/>
-      <w:lvlJc w:val="left"/>
-      <w:pPr>
-        <w:tabs>
-          <w:tab w:val="num" w:pos="3600"/>
-        </w:tabs>
-        <w:ind w:left="3600" w:hanging="360"/>
-      </w:pPr>
-    </w:lvl>
-    <w:lvl w:ilvl="5" w:tentative="1">
-      <w:start w:val="1"/>
-      <w:numFmt w:val="decimal"/>
-      <w:lvlText w:val="%6."/>
-      <w:lvlJc w:val="left"/>
-      <w:pPr>
-        <w:tabs>
-          <w:tab w:val="num" w:pos="4320"/>
-        </w:tabs>
-        <w:ind w:left="4320" w:hanging="360"/>
-      </w:pPr>
-    </w:lvl>
-    <w:lvl w:ilvl="6" w:tentative="1">
-      <w:start w:val="1"/>
-      <w:numFmt w:val="decimal"/>
-      <w:lvlText w:val="%7."/>
-      <w:lvlJc w:val="left"/>
-      <w:pPr>
-        <w:tabs>
-          <w:tab w:val="num" w:pos="5040"/>
-        </w:tabs>
-        <w:ind w:left="5040" w:hanging="360"/>
-      </w:pPr>
-    </w:lvl>
-    <w:lvl w:ilvl="7" w:tentative="1">
-      <w:start w:val="1"/>
-      <w:numFmt w:val="decimal"/>
-      <w:lvlText w:val="%8."/>
-      <w:lvlJc w:val="left"/>
-      <w:pPr>
-        <w:tabs>
-          <w:tab w:val="num" w:pos="5760"/>
-        </w:tabs>
-        <w:ind w:left="5760" w:hanging="360"/>
-      </w:pPr>
-    </w:lvl>
-    <w:lvl w:ilvl="8" w:tentative="1">
-      <w:start w:val="1"/>
-      <w:numFmt w:val="decimal"/>
-      <w:lvlText w:val="%9."/>
-      <w:lvlJc w:val="left"/>
-      <w:pPr>
-        <w:tabs>
-          <w:tab w:val="num" w:pos="6480"/>
-        </w:tabs>
-        <w:ind w:left="6480" w:hanging="360"/>
-      </w:pPr>
-    </w:lvl>
-  </w:abstractNum>
-  <w:abstractNum w:abstractNumId="11" w15:restartNumberingAfterBreak="0">
-    <w:nsid w:val="38C33D4A"/>
-    <w:multiLevelType w:val="multilevel"/>
-    <w:tmpl w:val="231C4B2C"/>
+    <w:tmpl w:val="6BB44AD8"/>
     <w:lvl w:ilvl="0">
       <w:start w:val="1"/>
       <w:numFmt w:val="bullet"/>
@@ -12510,10 +12167,10 @@
       </w:rPr>
     </w:lvl>
   </w:abstractNum>
-  <w:abstractNum w:abstractNumId="12" w15:restartNumberingAfterBreak="0">
-    <w:nsid w:val="456F7938"/>
+  <w:abstractNum w:abstractNumId="9" w15:restartNumberingAfterBreak="0">
+    <w:nsid w:val="28C71D4A"/>
     <w:multiLevelType w:val="multilevel"/>
-    <w:tmpl w:val="6298B67A"/>
+    <w:tmpl w:val="CEEA5CE6"/>
     <w:lvl w:ilvl="0">
       <w:start w:val="1"/>
       <w:numFmt w:val="bullet"/>
@@ -12659,10 +12316,123 @@
       </w:rPr>
     </w:lvl>
   </w:abstractNum>
-  <w:abstractNum w:abstractNumId="13" w15:restartNumberingAfterBreak="0">
-    <w:nsid w:val="5E912196"/>
+  <w:abstractNum w:abstractNumId="10" w15:restartNumberingAfterBreak="0">
+    <w:nsid w:val="2ADA2090"/>
     <w:multiLevelType w:val="multilevel"/>
-    <w:tmpl w:val="3F504A0A"/>
+    <w:tmpl w:val="E344474C"/>
+    <w:lvl w:ilvl="0">
+      <w:start w:val="1"/>
+      <w:numFmt w:val="decimal"/>
+      <w:lvlText w:val="%1."/>
+      <w:lvlJc w:val="left"/>
+      <w:pPr>
+        <w:tabs>
+          <w:tab w:val="num" w:pos="720"/>
+        </w:tabs>
+        <w:ind w:left="720" w:hanging="360"/>
+      </w:pPr>
+    </w:lvl>
+    <w:lvl w:ilvl="1" w:tentative="1">
+      <w:start w:val="1"/>
+      <w:numFmt w:val="decimal"/>
+      <w:lvlText w:val="%2."/>
+      <w:lvlJc w:val="left"/>
+      <w:pPr>
+        <w:tabs>
+          <w:tab w:val="num" w:pos="1440"/>
+        </w:tabs>
+        <w:ind w:left="1440" w:hanging="360"/>
+      </w:pPr>
+    </w:lvl>
+    <w:lvl w:ilvl="2" w:tentative="1">
+      <w:start w:val="1"/>
+      <w:numFmt w:val="decimal"/>
+      <w:lvlText w:val="%3."/>
+      <w:lvlJc w:val="left"/>
+      <w:pPr>
+        <w:tabs>
+          <w:tab w:val="num" w:pos="2160"/>
+        </w:tabs>
+        <w:ind w:left="2160" w:hanging="360"/>
+      </w:pPr>
+    </w:lvl>
+    <w:lvl w:ilvl="3" w:tentative="1">
+      <w:start w:val="1"/>
+      <w:numFmt w:val="decimal"/>
+      <w:lvlText w:val="%4."/>
+      <w:lvlJc w:val="left"/>
+      <w:pPr>
+        <w:tabs>
+          <w:tab w:val="num" w:pos="2880"/>
+        </w:tabs>
+        <w:ind w:left="2880" w:hanging="360"/>
+      </w:pPr>
+    </w:lvl>
+    <w:lvl w:ilvl="4" w:tentative="1">
+      <w:start w:val="1"/>
+      <w:numFmt w:val="decimal"/>
+      <w:lvlText w:val="%5."/>
+      <w:lvlJc w:val="left"/>
+      <w:pPr>
+        <w:tabs>
+          <w:tab w:val="num" w:pos="3600"/>
+        </w:tabs>
+        <w:ind w:left="3600" w:hanging="360"/>
+      </w:pPr>
+    </w:lvl>
+    <w:lvl w:ilvl="5" w:tentative="1">
+      <w:start w:val="1"/>
+      <w:numFmt w:val="decimal"/>
+      <w:lvlText w:val="%6."/>
+      <w:lvlJc w:val="left"/>
+      <w:pPr>
+        <w:tabs>
+          <w:tab w:val="num" w:pos="4320"/>
+        </w:tabs>
+        <w:ind w:left="4320" w:hanging="360"/>
+      </w:pPr>
+    </w:lvl>
+    <w:lvl w:ilvl="6" w:tentative="1">
+      <w:start w:val="1"/>
+      <w:numFmt w:val="decimal"/>
+      <w:lvlText w:val="%7."/>
+      <w:lvlJc w:val="left"/>
+      <w:pPr>
+        <w:tabs>
+          <w:tab w:val="num" w:pos="5040"/>
+        </w:tabs>
+        <w:ind w:left="5040" w:hanging="360"/>
+      </w:pPr>
+    </w:lvl>
+    <w:lvl w:ilvl="7" w:tentative="1">
+      <w:start w:val="1"/>
+      <w:numFmt w:val="decimal"/>
+      <w:lvlText w:val="%8."/>
+      <w:lvlJc w:val="left"/>
+      <w:pPr>
+        <w:tabs>
+          <w:tab w:val="num" w:pos="5760"/>
+        </w:tabs>
+        <w:ind w:left="5760" w:hanging="360"/>
+      </w:pPr>
+    </w:lvl>
+    <w:lvl w:ilvl="8" w:tentative="1">
+      <w:start w:val="1"/>
+      <w:numFmt w:val="decimal"/>
+      <w:lvlText w:val="%9."/>
+      <w:lvlJc w:val="left"/>
+      <w:pPr>
+        <w:tabs>
+          <w:tab w:val="num" w:pos="6480"/>
+        </w:tabs>
+        <w:ind w:left="6480" w:hanging="360"/>
+      </w:pPr>
+    </w:lvl>
+  </w:abstractNum>
+  <w:abstractNum w:abstractNumId="11" w15:restartNumberingAfterBreak="0">
+    <w:nsid w:val="33C00BF4"/>
+    <w:multiLevelType w:val="multilevel"/>
+    <w:tmpl w:val="8CF29190"/>
     <w:lvl w:ilvl="0">
       <w:start w:val="1"/>
       <w:numFmt w:val="bullet"/>
@@ -12808,10 +12578,10 @@
       </w:rPr>
     </w:lvl>
   </w:abstractNum>
-  <w:abstractNum w:abstractNumId="14" w15:restartNumberingAfterBreak="0">
-    <w:nsid w:val="654A1001"/>
+  <w:abstractNum w:abstractNumId="12" w15:restartNumberingAfterBreak="0">
+    <w:nsid w:val="382514A4"/>
     <w:multiLevelType w:val="multilevel"/>
-    <w:tmpl w:val="37423168"/>
+    <w:tmpl w:val="FE0824EC"/>
     <w:lvl w:ilvl="0">
       <w:start w:val="1"/>
       <w:numFmt w:val="bullet"/>
@@ -12957,10 +12727,123 @@
       </w:rPr>
     </w:lvl>
   </w:abstractNum>
-  <w:abstractNum w:abstractNumId="15" w15:restartNumberingAfterBreak="0">
-    <w:nsid w:val="683C250E"/>
+  <w:abstractNum w:abstractNumId="13" w15:restartNumberingAfterBreak="0">
+    <w:nsid w:val="3DA111EA"/>
     <w:multiLevelType w:val="multilevel"/>
-    <w:tmpl w:val="77069A8C"/>
+    <w:tmpl w:val="E042D350"/>
+    <w:lvl w:ilvl="0">
+      <w:start w:val="1"/>
+      <w:numFmt w:val="decimal"/>
+      <w:lvlText w:val="%1."/>
+      <w:lvlJc w:val="left"/>
+      <w:pPr>
+        <w:tabs>
+          <w:tab w:val="num" w:pos="720"/>
+        </w:tabs>
+        <w:ind w:left="720" w:hanging="360"/>
+      </w:pPr>
+    </w:lvl>
+    <w:lvl w:ilvl="1" w:tentative="1">
+      <w:start w:val="1"/>
+      <w:numFmt w:val="decimal"/>
+      <w:lvlText w:val="%2."/>
+      <w:lvlJc w:val="left"/>
+      <w:pPr>
+        <w:tabs>
+          <w:tab w:val="num" w:pos="1440"/>
+        </w:tabs>
+        <w:ind w:left="1440" w:hanging="360"/>
+      </w:pPr>
+    </w:lvl>
+    <w:lvl w:ilvl="2" w:tentative="1">
+      <w:start w:val="1"/>
+      <w:numFmt w:val="decimal"/>
+      <w:lvlText w:val="%3."/>
+      <w:lvlJc w:val="left"/>
+      <w:pPr>
+        <w:tabs>
+          <w:tab w:val="num" w:pos="2160"/>
+        </w:tabs>
+        <w:ind w:left="2160" w:hanging="360"/>
+      </w:pPr>
+    </w:lvl>
+    <w:lvl w:ilvl="3" w:tentative="1">
+      <w:start w:val="1"/>
+      <w:numFmt w:val="decimal"/>
+      <w:lvlText w:val="%4."/>
+      <w:lvlJc w:val="left"/>
+      <w:pPr>
+        <w:tabs>
+          <w:tab w:val="num" w:pos="2880"/>
+        </w:tabs>
+        <w:ind w:left="2880" w:hanging="360"/>
+      </w:pPr>
+    </w:lvl>
+    <w:lvl w:ilvl="4" w:tentative="1">
+      <w:start w:val="1"/>
+      <w:numFmt w:val="decimal"/>
+      <w:lvlText w:val="%5."/>
+      <w:lvlJc w:val="left"/>
+      <w:pPr>
+        <w:tabs>
+          <w:tab w:val="num" w:pos="3600"/>
+        </w:tabs>
+        <w:ind w:left="3600" w:hanging="360"/>
+      </w:pPr>
+    </w:lvl>
+    <w:lvl w:ilvl="5" w:tentative="1">
+      <w:start w:val="1"/>
+      <w:numFmt w:val="decimal"/>
+      <w:lvlText w:val="%6."/>
+      <w:lvlJc w:val="left"/>
+      <w:pPr>
+        <w:tabs>
+          <w:tab w:val="num" w:pos="4320"/>
+        </w:tabs>
+        <w:ind w:left="4320" w:hanging="360"/>
+      </w:pPr>
+    </w:lvl>
+    <w:lvl w:ilvl="6" w:tentative="1">
+      <w:start w:val="1"/>
+      <w:numFmt w:val="decimal"/>
+      <w:lvlText w:val="%7."/>
+      <w:lvlJc w:val="left"/>
+      <w:pPr>
+        <w:tabs>
+          <w:tab w:val="num" w:pos="5040"/>
+        </w:tabs>
+        <w:ind w:left="5040" w:hanging="360"/>
+      </w:pPr>
+    </w:lvl>
+    <w:lvl w:ilvl="7" w:tentative="1">
+      <w:start w:val="1"/>
+      <w:numFmt w:val="decimal"/>
+      <w:lvlText w:val="%8."/>
+      <w:lvlJc w:val="left"/>
+      <w:pPr>
+        <w:tabs>
+          <w:tab w:val="num" w:pos="5760"/>
+        </w:tabs>
+        <w:ind w:left="5760" w:hanging="360"/>
+      </w:pPr>
+    </w:lvl>
+    <w:lvl w:ilvl="8" w:tentative="1">
+      <w:start w:val="1"/>
+      <w:numFmt w:val="decimal"/>
+      <w:lvlText w:val="%9."/>
+      <w:lvlJc w:val="left"/>
+      <w:pPr>
+        <w:tabs>
+          <w:tab w:val="num" w:pos="6480"/>
+        </w:tabs>
+        <w:ind w:left="6480" w:hanging="360"/>
+      </w:pPr>
+    </w:lvl>
+  </w:abstractNum>
+  <w:abstractNum w:abstractNumId="14" w15:restartNumberingAfterBreak="0">
+    <w:nsid w:val="44F77D40"/>
+    <w:multiLevelType w:val="multilevel"/>
+    <w:tmpl w:val="AC9ECDBA"/>
     <w:lvl w:ilvl="0">
       <w:start w:val="1"/>
       <w:numFmt w:val="bullet"/>
@@ -13106,10 +12989,10 @@
       </w:rPr>
     </w:lvl>
   </w:abstractNum>
-  <w:abstractNum w:abstractNumId="16" w15:restartNumberingAfterBreak="0">
-    <w:nsid w:val="69965DE8"/>
+  <w:abstractNum w:abstractNumId="15" w15:restartNumberingAfterBreak="0">
+    <w:nsid w:val="46002ABA"/>
     <w:multiLevelType w:val="multilevel"/>
-    <w:tmpl w:val="938CFB80"/>
+    <w:tmpl w:val="CDACD800"/>
     <w:lvl w:ilvl="0">
       <w:start w:val="1"/>
       <w:numFmt w:val="bullet"/>
@@ -13255,10 +13138,10 @@
       </w:rPr>
     </w:lvl>
   </w:abstractNum>
-  <w:abstractNum w:abstractNumId="17" w15:restartNumberingAfterBreak="0">
-    <w:nsid w:val="69EE1C9C"/>
+  <w:abstractNum w:abstractNumId="16" w15:restartNumberingAfterBreak="0">
+    <w:nsid w:val="4A431F67"/>
     <w:multiLevelType w:val="multilevel"/>
-    <w:tmpl w:val="7DFE1CC0"/>
+    <w:tmpl w:val="EC3A1D38"/>
     <w:lvl w:ilvl="0">
       <w:start w:val="1"/>
       <w:numFmt w:val="bullet"/>
@@ -13404,10 +13287,236 @@
       </w:rPr>
     </w:lvl>
   </w:abstractNum>
+  <w:abstractNum w:abstractNumId="17" w15:restartNumberingAfterBreak="0">
+    <w:nsid w:val="63F33F70"/>
+    <w:multiLevelType w:val="multilevel"/>
+    <w:tmpl w:val="9B0A6FF8"/>
+    <w:lvl w:ilvl="0">
+      <w:start w:val="1"/>
+      <w:numFmt w:val="decimal"/>
+      <w:lvlText w:val="%1."/>
+      <w:lvlJc w:val="left"/>
+      <w:pPr>
+        <w:tabs>
+          <w:tab w:val="num" w:pos="720"/>
+        </w:tabs>
+        <w:ind w:left="720" w:hanging="360"/>
+      </w:pPr>
+    </w:lvl>
+    <w:lvl w:ilvl="1" w:tentative="1">
+      <w:start w:val="1"/>
+      <w:numFmt w:val="decimal"/>
+      <w:lvlText w:val="%2."/>
+      <w:lvlJc w:val="left"/>
+      <w:pPr>
+        <w:tabs>
+          <w:tab w:val="num" w:pos="1440"/>
+        </w:tabs>
+        <w:ind w:left="1440" w:hanging="360"/>
+      </w:pPr>
+    </w:lvl>
+    <w:lvl w:ilvl="2" w:tentative="1">
+      <w:start w:val="1"/>
+      <w:numFmt w:val="decimal"/>
+      <w:lvlText w:val="%3."/>
+      <w:lvlJc w:val="left"/>
+      <w:pPr>
+        <w:tabs>
+          <w:tab w:val="num" w:pos="2160"/>
+        </w:tabs>
+        <w:ind w:left="2160" w:hanging="360"/>
+      </w:pPr>
+    </w:lvl>
+    <w:lvl w:ilvl="3" w:tentative="1">
+      <w:start w:val="1"/>
+      <w:numFmt w:val="decimal"/>
+      <w:lvlText w:val="%4."/>
+      <w:lvlJc w:val="left"/>
+      <w:pPr>
+        <w:tabs>
+          <w:tab w:val="num" w:pos="2880"/>
+        </w:tabs>
+        <w:ind w:left="2880" w:hanging="360"/>
+      </w:pPr>
+    </w:lvl>
+    <w:lvl w:ilvl="4" w:tentative="1">
+      <w:start w:val="1"/>
+      <w:numFmt w:val="decimal"/>
+      <w:lvlText w:val="%5."/>
+      <w:lvlJc w:val="left"/>
+      <w:pPr>
+        <w:tabs>
+          <w:tab w:val="num" w:pos="3600"/>
+        </w:tabs>
+        <w:ind w:left="3600" w:hanging="360"/>
+      </w:pPr>
+    </w:lvl>
+    <w:lvl w:ilvl="5" w:tentative="1">
+      <w:start w:val="1"/>
+      <w:numFmt w:val="decimal"/>
+      <w:lvlText w:val="%6."/>
+      <w:lvlJc w:val="left"/>
+      <w:pPr>
+        <w:tabs>
+          <w:tab w:val="num" w:pos="4320"/>
+        </w:tabs>
+        <w:ind w:left="4320" w:hanging="360"/>
+      </w:pPr>
+    </w:lvl>
+    <w:lvl w:ilvl="6" w:tentative="1">
+      <w:start w:val="1"/>
+      <w:numFmt w:val="decimal"/>
+      <w:lvlText w:val="%7."/>
+      <w:lvlJc w:val="left"/>
+      <w:pPr>
+        <w:tabs>
+          <w:tab w:val="num" w:pos="5040"/>
+        </w:tabs>
+        <w:ind w:left="5040" w:hanging="360"/>
+      </w:pPr>
+    </w:lvl>
+    <w:lvl w:ilvl="7" w:tentative="1">
+      <w:start w:val="1"/>
+      <w:numFmt w:val="decimal"/>
+      <w:lvlText w:val="%8."/>
+      <w:lvlJc w:val="left"/>
+      <w:pPr>
+        <w:tabs>
+          <w:tab w:val="num" w:pos="5760"/>
+        </w:tabs>
+        <w:ind w:left="5760" w:hanging="360"/>
+      </w:pPr>
+    </w:lvl>
+    <w:lvl w:ilvl="8" w:tentative="1">
+      <w:start w:val="1"/>
+      <w:numFmt w:val="decimal"/>
+      <w:lvlText w:val="%9."/>
+      <w:lvlJc w:val="left"/>
+      <w:pPr>
+        <w:tabs>
+          <w:tab w:val="num" w:pos="6480"/>
+        </w:tabs>
+        <w:ind w:left="6480" w:hanging="360"/>
+      </w:pPr>
+    </w:lvl>
+  </w:abstractNum>
   <w:abstractNum w:abstractNumId="18" w15:restartNumberingAfterBreak="0">
-    <w:nsid w:val="6EE34E1A"/>
+    <w:nsid w:val="69BA4B48"/>
     <w:multiLevelType w:val="multilevel"/>
-    <w:tmpl w:val="19B46CC0"/>
+    <w:tmpl w:val="A65C814A"/>
+    <w:lvl w:ilvl="0">
+      <w:start w:val="1"/>
+      <w:numFmt w:val="decimal"/>
+      <w:lvlText w:val="%1."/>
+      <w:lvlJc w:val="left"/>
+      <w:pPr>
+        <w:tabs>
+          <w:tab w:val="num" w:pos="720"/>
+        </w:tabs>
+        <w:ind w:left="720" w:hanging="360"/>
+      </w:pPr>
+    </w:lvl>
+    <w:lvl w:ilvl="1" w:tentative="1">
+      <w:start w:val="1"/>
+      <w:numFmt w:val="decimal"/>
+      <w:lvlText w:val="%2."/>
+      <w:lvlJc w:val="left"/>
+      <w:pPr>
+        <w:tabs>
+          <w:tab w:val="num" w:pos="1440"/>
+        </w:tabs>
+        <w:ind w:left="1440" w:hanging="360"/>
+      </w:pPr>
+    </w:lvl>
+    <w:lvl w:ilvl="2" w:tentative="1">
+      <w:start w:val="1"/>
+      <w:numFmt w:val="decimal"/>
+      <w:lvlText w:val="%3."/>
+      <w:lvlJc w:val="left"/>
+      <w:pPr>
+        <w:tabs>
+          <w:tab w:val="num" w:pos="2160"/>
+        </w:tabs>
+        <w:ind w:left="2160" w:hanging="360"/>
+      </w:pPr>
+    </w:lvl>
+    <w:lvl w:ilvl="3" w:tentative="1">
+      <w:start w:val="1"/>
+      <w:numFmt w:val="decimal"/>
+      <w:lvlText w:val="%4."/>
+      <w:lvlJc w:val="left"/>
+      <w:pPr>
+        <w:tabs>
+          <w:tab w:val="num" w:pos="2880"/>
+        </w:tabs>
+        <w:ind w:left="2880" w:hanging="360"/>
+      </w:pPr>
+    </w:lvl>
+    <w:lvl w:ilvl="4" w:tentative="1">
+      <w:start w:val="1"/>
+      <w:numFmt w:val="decimal"/>
+      <w:lvlText w:val="%5."/>
+      <w:lvlJc w:val="left"/>
+      <w:pPr>
+        <w:tabs>
+          <w:tab w:val="num" w:pos="3600"/>
+        </w:tabs>
+        <w:ind w:left="3600" w:hanging="360"/>
+      </w:pPr>
+    </w:lvl>
+    <w:lvl w:ilvl="5" w:tentative="1">
+      <w:start w:val="1"/>
+      <w:numFmt w:val="decimal"/>
+      <w:lvlText w:val="%6."/>
+      <w:lvlJc w:val="left"/>
+      <w:pPr>
+        <w:tabs>
+          <w:tab w:val="num" w:pos="4320"/>
+        </w:tabs>
+        <w:ind w:left="4320" w:hanging="360"/>
+      </w:pPr>
+    </w:lvl>
+    <w:lvl w:ilvl="6" w:tentative="1">
+      <w:start w:val="1"/>
+      <w:numFmt w:val="decimal"/>
+      <w:lvlText w:val="%7."/>
+      <w:lvlJc w:val="left"/>
+      <w:pPr>
+        <w:tabs>
+          <w:tab w:val="num" w:pos="5040"/>
+        </w:tabs>
+        <w:ind w:left="5040" w:hanging="360"/>
+      </w:pPr>
+    </w:lvl>
+    <w:lvl w:ilvl="7" w:tentative="1">
+      <w:start w:val="1"/>
+      <w:numFmt w:val="decimal"/>
+      <w:lvlText w:val="%8."/>
+      <w:lvlJc w:val="left"/>
+      <w:pPr>
+        <w:tabs>
+          <w:tab w:val="num" w:pos="5760"/>
+        </w:tabs>
+        <w:ind w:left="5760" w:hanging="360"/>
+      </w:pPr>
+    </w:lvl>
+    <w:lvl w:ilvl="8" w:tentative="1">
+      <w:start w:val="1"/>
+      <w:numFmt w:val="decimal"/>
+      <w:lvlText w:val="%9."/>
+      <w:lvlJc w:val="left"/>
+      <w:pPr>
+        <w:tabs>
+          <w:tab w:val="num" w:pos="6480"/>
+        </w:tabs>
+        <w:ind w:left="6480" w:hanging="360"/>
+      </w:pPr>
+    </w:lvl>
+  </w:abstractNum>
+  <w:abstractNum w:abstractNumId="19" w15:restartNumberingAfterBreak="0">
+    <w:nsid w:val="78B228CE"/>
+    <w:multiLevelType w:val="multilevel"/>
+    <w:tmpl w:val="57EE9812"/>
     <w:lvl w:ilvl="0">
       <w:start w:val="1"/>
       <w:numFmt w:val="bullet"/>
@@ -13553,178 +13662,65 @@
       </w:rPr>
     </w:lvl>
   </w:abstractNum>
-  <w:abstractNum w:abstractNumId="19" w15:restartNumberingAfterBreak="0">
-    <w:nsid w:val="6F556780"/>
-    <w:multiLevelType w:val="multilevel"/>
-    <w:tmpl w:val="DCBCD2FE"/>
-    <w:lvl w:ilvl="0">
-      <w:start w:val="1"/>
-      <w:numFmt w:val="decimal"/>
-      <w:lvlText w:val="%1."/>
-      <w:lvlJc w:val="left"/>
-      <w:pPr>
-        <w:tabs>
-          <w:tab w:val="num" w:pos="720"/>
-        </w:tabs>
-        <w:ind w:left="720" w:hanging="360"/>
-      </w:pPr>
-    </w:lvl>
-    <w:lvl w:ilvl="1" w:tentative="1">
-      <w:start w:val="1"/>
-      <w:numFmt w:val="decimal"/>
-      <w:lvlText w:val="%2."/>
-      <w:lvlJc w:val="left"/>
-      <w:pPr>
-        <w:tabs>
-          <w:tab w:val="num" w:pos="1440"/>
-        </w:tabs>
-        <w:ind w:left="1440" w:hanging="360"/>
-      </w:pPr>
-    </w:lvl>
-    <w:lvl w:ilvl="2" w:tentative="1">
-      <w:start w:val="1"/>
-      <w:numFmt w:val="decimal"/>
-      <w:lvlText w:val="%3."/>
-      <w:lvlJc w:val="left"/>
-      <w:pPr>
-        <w:tabs>
-          <w:tab w:val="num" w:pos="2160"/>
-        </w:tabs>
-        <w:ind w:left="2160" w:hanging="360"/>
-      </w:pPr>
-    </w:lvl>
-    <w:lvl w:ilvl="3" w:tentative="1">
-      <w:start w:val="1"/>
-      <w:numFmt w:val="decimal"/>
-      <w:lvlText w:val="%4."/>
-      <w:lvlJc w:val="left"/>
-      <w:pPr>
-        <w:tabs>
-          <w:tab w:val="num" w:pos="2880"/>
-        </w:tabs>
-        <w:ind w:left="2880" w:hanging="360"/>
-      </w:pPr>
-    </w:lvl>
-    <w:lvl w:ilvl="4" w:tentative="1">
-      <w:start w:val="1"/>
-      <w:numFmt w:val="decimal"/>
-      <w:lvlText w:val="%5."/>
-      <w:lvlJc w:val="left"/>
-      <w:pPr>
-        <w:tabs>
-          <w:tab w:val="num" w:pos="3600"/>
-        </w:tabs>
-        <w:ind w:left="3600" w:hanging="360"/>
-      </w:pPr>
-    </w:lvl>
-    <w:lvl w:ilvl="5" w:tentative="1">
-      <w:start w:val="1"/>
-      <w:numFmt w:val="decimal"/>
-      <w:lvlText w:val="%6."/>
-      <w:lvlJc w:val="left"/>
-      <w:pPr>
-        <w:tabs>
-          <w:tab w:val="num" w:pos="4320"/>
-        </w:tabs>
-        <w:ind w:left="4320" w:hanging="360"/>
-      </w:pPr>
-    </w:lvl>
-    <w:lvl w:ilvl="6" w:tentative="1">
-      <w:start w:val="1"/>
-      <w:numFmt w:val="decimal"/>
-      <w:lvlText w:val="%7."/>
-      <w:lvlJc w:val="left"/>
-      <w:pPr>
-        <w:tabs>
-          <w:tab w:val="num" w:pos="5040"/>
-        </w:tabs>
-        <w:ind w:left="5040" w:hanging="360"/>
-      </w:pPr>
-    </w:lvl>
-    <w:lvl w:ilvl="7" w:tentative="1">
-      <w:start w:val="1"/>
-      <w:numFmt w:val="decimal"/>
-      <w:lvlText w:val="%8."/>
-      <w:lvlJc w:val="left"/>
-      <w:pPr>
-        <w:tabs>
-          <w:tab w:val="num" w:pos="5760"/>
-        </w:tabs>
-        <w:ind w:left="5760" w:hanging="360"/>
-      </w:pPr>
-    </w:lvl>
-    <w:lvl w:ilvl="8" w:tentative="1">
-      <w:start w:val="1"/>
-      <w:numFmt w:val="decimal"/>
-      <w:lvlText w:val="%9."/>
-      <w:lvlJc w:val="left"/>
-      <w:pPr>
-        <w:tabs>
-          <w:tab w:val="num" w:pos="6480"/>
-        </w:tabs>
-        <w:ind w:left="6480" w:hanging="360"/>
-      </w:pPr>
-    </w:lvl>
-  </w:abstractNum>
-  <w:num w:numId="1" w16cid:durableId="24335306">
+  <w:num w:numId="1" w16cid:durableId="2080205508">
+    <w:abstractNumId w:val="17"/>
+  </w:num>
+  <w:num w:numId="2" w16cid:durableId="1830093086">
+    <w:abstractNumId w:val="7"/>
+  </w:num>
+  <w:num w:numId="3" w16cid:durableId="99957688">
+    <w:abstractNumId w:val="1"/>
+  </w:num>
+  <w:num w:numId="4" w16cid:durableId="1941448979">
+    <w:abstractNumId w:val="12"/>
+  </w:num>
+  <w:num w:numId="5" w16cid:durableId="1063061057">
+    <w:abstractNumId w:val="18"/>
+  </w:num>
+  <w:num w:numId="6" w16cid:durableId="1249460158">
+    <w:abstractNumId w:val="2"/>
+  </w:num>
+  <w:num w:numId="7" w16cid:durableId="1416972922">
+    <w:abstractNumId w:val="4"/>
+  </w:num>
+  <w:num w:numId="8" w16cid:durableId="788625630">
+    <w:abstractNumId w:val="19"/>
+  </w:num>
+  <w:num w:numId="9" w16cid:durableId="960573117">
+    <w:abstractNumId w:val="9"/>
+  </w:num>
+  <w:num w:numId="10" w16cid:durableId="948002732">
+    <w:abstractNumId w:val="16"/>
+  </w:num>
+  <w:num w:numId="11" w16cid:durableId="184831059">
     <w:abstractNumId w:val="6"/>
   </w:num>
-  <w:num w:numId="2" w16cid:durableId="683558867">
+  <w:num w:numId="12" w16cid:durableId="12153">
+    <w:abstractNumId w:val="15"/>
+  </w:num>
+  <w:num w:numId="13" w16cid:durableId="1816331451">
     <w:abstractNumId w:val="0"/>
   </w:num>
-  <w:num w:numId="3" w16cid:durableId="645090428">
-    <w:abstractNumId w:val="7"/>
+  <w:num w:numId="14" w16cid:durableId="1767921289">
+    <w:abstractNumId w:val="5"/>
   </w:num>
-  <w:num w:numId="4" w16cid:durableId="1844123505">
+  <w:num w:numId="15" w16cid:durableId="1842352336">
+    <w:abstractNumId w:val="3"/>
+  </w:num>
+  <w:num w:numId="16" w16cid:durableId="1380745149">
+    <w:abstractNumId w:val="10"/>
+  </w:num>
+  <w:num w:numId="17" w16cid:durableId="488402568">
+    <w:abstractNumId w:val="13"/>
+  </w:num>
+  <w:num w:numId="18" w16cid:durableId="1545630255">
+    <w:abstractNumId w:val="8"/>
+  </w:num>
+  <w:num w:numId="19" w16cid:durableId="2080707564">
     <w:abstractNumId w:val="14"/>
   </w:num>
-  <w:num w:numId="5" w16cid:durableId="184296691">
-    <w:abstractNumId w:val="1"/>
-  </w:num>
-  <w:num w:numId="6" w16cid:durableId="1823110692">
-    <w:abstractNumId w:val="12"/>
-  </w:num>
-  <w:num w:numId="7" w16cid:durableId="1326593398">
-    <w:abstractNumId w:val="8"/>
-  </w:num>
-  <w:num w:numId="8" w16cid:durableId="533080823">
+  <w:num w:numId="20" w16cid:durableId="1722171096">
     <w:abstractNumId w:val="11"/>
-  </w:num>
-  <w:num w:numId="9" w16cid:durableId="266887591">
-    <w:abstractNumId w:val="2"/>
-  </w:num>
-  <w:num w:numId="10" w16cid:durableId="242491631">
-    <w:abstractNumId w:val="5"/>
-  </w:num>
-  <w:num w:numId="11" w16cid:durableId="645821354">
-    <w:abstractNumId w:val="9"/>
-  </w:num>
-  <w:num w:numId="12" w16cid:durableId="1973554969">
-    <w:abstractNumId w:val="4"/>
-  </w:num>
-  <w:num w:numId="13" w16cid:durableId="299042551">
-    <w:abstractNumId w:val="16"/>
-  </w:num>
-  <w:num w:numId="14" w16cid:durableId="1008219229">
-    <w:abstractNumId w:val="17"/>
-  </w:num>
-  <w:num w:numId="15" w16cid:durableId="1657418667">
-    <w:abstractNumId w:val="3"/>
-  </w:num>
-  <w:num w:numId="16" w16cid:durableId="140537810">
-    <w:abstractNumId w:val="19"/>
-  </w:num>
-  <w:num w:numId="17" w16cid:durableId="1149786350">
-    <w:abstractNumId w:val="10"/>
-  </w:num>
-  <w:num w:numId="18" w16cid:durableId="1321956889">
-    <w:abstractNumId w:val="15"/>
-  </w:num>
-  <w:num w:numId="19" w16cid:durableId="1854952222">
-    <w:abstractNumId w:val="13"/>
-  </w:num>
-  <w:num w:numId="20" w16cid:durableId="778918526">
-    <w:abstractNumId w:val="18"/>
   </w:num>
 </w:numbering>
 </file>

</xml_diff>

<commit_message>
Drift-dok: per-host SSL Strict paa datagaarden.dk via CF Configuration Rule (audit-fund 9 lukket, 28/10)
- 01 §4.3: zone Full bevidst; Strict pinnet pr. host for event/cbcit/api/datagaarden (regel 610ee39b...), rollback-kommando
- 02 §1: token-scope Config Rules Edit
- 07: Strict fjernet fra aabne punkter; docx regenereret (10 sider)

Co-Authored-By: Claude Fable 5.1 <noreply@anthropic.com>
</commit_message>
<xml_diff>
--- a/drift/07-break-glass-adgang.docx
+++ b/drift/07-break-glass-adgang.docx
@@ -231,7 +231,7 @@
       <w:pPr>
         <w:pStyle w:val="NormalWeb"/>
         <w:shd w:val="clear" w:color="auto" w:fill="F7FBFA"/>
-        <w:divId w:val="625352151"/>
+        <w:divId w:val="154685130"/>
         <w:rPr>
           <w:rFonts w:ascii="Calibri" w:hAnsi="Calibri" w:cs="Calibri"/>
           <w:sz w:val="21"/>
@@ -301,7 +301,7 @@
       <w:pPr>
         <w:pStyle w:val="NormalWeb"/>
         <w:shd w:val="clear" w:color="auto" w:fill="F7FBFA"/>
-        <w:divId w:val="625352151"/>
+        <w:divId w:val="154685130"/>
         <w:rPr>
           <w:rFonts w:ascii="Calibri" w:hAnsi="Calibri" w:cs="Calibri"/>
           <w:sz w:val="21"/>
@@ -381,7 +381,7 @@
           <w:sz w:val="21"/>
           <w:szCs w:val="21"/>
         </w:rPr>
-        <w:pict w14:anchorId="6ACA989D">
+        <w:pict w14:anchorId="42DDBC8E">
           <v:rect id="_x0000_i1025" style="width:0;height:1.5pt" o:hralign="center" o:hrstd="t" o:hr="t" fillcolor="#a0a0a0" stroked="f"/>
         </w:pict>
       </w:r>
@@ -714,7 +714,7 @@
           <w:sz w:val="21"/>
           <w:szCs w:val="21"/>
         </w:rPr>
-        <w:pict w14:anchorId="794DAA1B">
+        <w:pict w14:anchorId="4F977BBC">
           <v:rect id="_x0000_i1026" style="width:0;height:1.5pt" o:hralign="center" o:hrstd="t" o:hr="t" fillcolor="#a0a0a0" stroked="f"/>
         </w:pict>
       </w:r>
@@ -2290,7 +2290,7 @@
           <w:sz w:val="21"/>
           <w:szCs w:val="21"/>
         </w:rPr>
-        <w:pict w14:anchorId="3383BD61">
+        <w:pict w14:anchorId="0172C793">
           <v:rect id="_x0000_i1027" style="width:0;height:1.5pt" o:hralign="center" o:hrstd="t" o:hr="t" fillcolor="#a0a0a0" stroked="f"/>
         </w:pict>
       </w:r>
@@ -3297,7 +3297,7 @@
           <w:sz w:val="21"/>
           <w:szCs w:val="21"/>
         </w:rPr>
-        <w:pict w14:anchorId="6004F78C">
+        <w:pict w14:anchorId="2B5EF193">
           <v:rect id="_x0000_i1028" style="width:0;height:1.5pt" o:hralign="center" o:hrstd="t" o:hr="t" fillcolor="#a0a0a0" stroked="f"/>
         </w:pict>
       </w:r>
@@ -3629,7 +3629,7 @@
           <w:sz w:val="21"/>
           <w:szCs w:val="21"/>
         </w:rPr>
-        <w:pict w14:anchorId="39999060">
+        <w:pict w14:anchorId="74665D75">
           <v:rect id="_x0000_i1029" style="width:0;height:1.5pt" o:hralign="center" o:hrstd="t" o:hr="t" fillcolor="#a0a0a0" stroked="f"/>
         </w:pict>
       </w:r>
@@ -3944,7 +3944,7 @@
           <w:sz w:val="21"/>
           <w:szCs w:val="21"/>
         </w:rPr>
-        <w:pict w14:anchorId="53447689">
+        <w:pict w14:anchorId="161C3AAB">
           <v:rect id="_x0000_i1030" style="width:0;height:1.5pt" o:hralign="center" o:hrstd="t" o:hr="t" fillcolor="#a0a0a0" stroked="f"/>
         </w:pict>
       </w:r>
@@ -5643,7 +5643,7 @@
           <w:sz w:val="21"/>
           <w:szCs w:val="21"/>
         </w:rPr>
-        <w:pict w14:anchorId="04844070">
+        <w:pict w14:anchorId="5403763B">
           <v:rect id="_x0000_i1031" style="width:0;height:1.5pt" o:hralign="center" o:hrstd="t" o:hr="t" fillcolor="#a0a0a0" stroked="f"/>
         </w:pict>
       </w:r>
@@ -7150,7 +7150,7 @@
           <w:sz w:val="21"/>
           <w:szCs w:val="21"/>
         </w:rPr>
-        <w:pict w14:anchorId="60A8B3EB">
+        <w:pict w14:anchorId="23DB938C">
           <v:rect id="_x0000_i1032" style="width:0;height:1.5pt" o:hralign="center" o:hrstd="t" o:hr="t" fillcolor="#a0a0a0" stroked="f"/>
         </w:pict>
       </w:r>
@@ -7690,7 +7690,7 @@
           <w:sz w:val="21"/>
           <w:szCs w:val="21"/>
         </w:rPr>
-        <w:pict w14:anchorId="430B3728">
+        <w:pict w14:anchorId="39B81ABB">
           <v:rect id="_x0000_i1033" style="width:0;height:1.5pt" o:hralign="center" o:hrstd="t" o:hr="t" fillcolor="#a0a0a0" stroked="f"/>
         </w:pict>
       </w:r>
@@ -7930,7 +7930,7 @@
       <w:pPr>
         <w:pStyle w:val="NormalWeb"/>
         <w:shd w:val="clear" w:color="auto" w:fill="F7FBFA"/>
-        <w:divId w:val="832069316"/>
+        <w:divId w:val="1020476608"/>
         <w:rPr>
           <w:rFonts w:ascii="Calibri" w:hAnsi="Calibri" w:cs="Calibri"/>
           <w:sz w:val="21"/>
@@ -8383,7 +8383,7 @@
           <w:sz w:val="21"/>
           <w:szCs w:val="21"/>
         </w:rPr>
-        <w:pict w14:anchorId="204FCBE1">
+        <w:pict w14:anchorId="66E64C9A">
           <v:rect id="_x0000_i1034" style="width:0;height:1.5pt" o:hralign="center" o:hrstd="t" o:hr="t" fillcolor="#a0a0a0" stroked="f"/>
         </w:pict>
       </w:r>
@@ -9295,7 +9295,7 @@
           <w:sz w:val="21"/>
           <w:szCs w:val="21"/>
         </w:rPr>
-        <w:pict w14:anchorId="304D421E">
+        <w:pict w14:anchorId="2C159387">
           <v:rect id="_x0000_i1035" style="width:0;height:1.5pt" o:hralign="center" o:hrstd="t" o:hr="t" fillcolor="#a0a0a0" stroked="f"/>
         </w:pict>
       </w:r>
@@ -9925,15 +9925,7 @@
           <w:sz w:val="21"/>
           <w:szCs w:val="21"/>
         </w:rPr>
-        <w:t xml:space="preserve"> </w:t>
-      </w:r>
-      <w:r>
-        <w:rPr>
-          <w:rFonts w:ascii="Calibri" w:eastAsia="Times New Roman" w:hAnsi="Calibri" w:cs="Calibri"/>
-          <w:sz w:val="21"/>
-          <w:szCs w:val="21"/>
-        </w:rPr>
-        <w:t xml:space="preserve">gennemføres af de enkelte admins inden fristerne (kravet er sat på alle tre sites) · datagaarden-ansatte nedgraderes fra administrator til editor (Datagaardens egen admin) · mail-DNS (SPF-oprydning cbcit.dk, DMARC → quarantine, DMARC + Brevo-DKIM for datagaarden.dk) · CF Configuration Rule "SSL: Strict" pr. host (alle tre origins har nu gyldige certs; kræver dashboard eller Config-Rules-scope på tokenet) · fjern TeamViewerQS.exe fra datagaarden.dk/Support · slet </w:t>
+        <w:t xml:space="preserve"> gennemføres af de enkelte admins inden fristerne (kravet er sat på alle tre sites) · datagaarden-ansatte nedgraderes fra administrator til editor (Datagaardens egen admin) · mail-DNS (SPF-oprydning cbcit.dk, DMARC → quarantine, DMARC + Brevo-DKIM for datagaarden.dk) · fjern TeamViewerQS.exe fra datagaarden.dk/Support · slet </w:t>
       </w:r>
       <w:r>
         <w:rPr>
@@ -9964,7 +9956,7 @@
           <w:sz w:val="21"/>
           <w:szCs w:val="21"/>
         </w:rPr>
-        <w:pict w14:anchorId="1EEE4866">
+        <w:pict w14:anchorId="52C964E1">
           <v:rect id="_x0000_i1036" style="width:0;height:1.5pt" o:hralign="center" o:hrstd="t" o:hr="t" fillcolor="#a0a0a0" stroked="f"/>
         </w:pict>
       </w:r>
@@ -10222,7 +10214,7 @@
       <w:pPr>
         <w:pStyle w:val="NormalWeb"/>
         <w:shd w:val="clear" w:color="auto" w:fill="F7FBFA"/>
-        <w:divId w:val="2065135135"/>
+        <w:divId w:val="22560836"/>
         <w:rPr>
           <w:rFonts w:ascii="Calibri" w:hAnsi="Calibri" w:cs="Calibri"/>
           <w:sz w:val="21"/>
@@ -10252,7 +10244,7 @@
           <w:sz w:val="21"/>
           <w:szCs w:val="21"/>
         </w:rPr>
-        <w:pict w14:anchorId="365C402E">
+        <w:pict w14:anchorId="132FE67B">
           <v:rect id="_x0000_i1037" style="width:0;height:1.5pt" o:hralign="center" o:hrstd="t" o:hr="t" fillcolor="#a0a0a0" stroked="f"/>
         </w:pict>
       </w:r>
@@ -10818,7 +10810,7 @@
           <w:sz w:val="21"/>
           <w:szCs w:val="21"/>
         </w:rPr>
-        <w:pict w14:anchorId="0C16F75C">
+        <w:pict w14:anchorId="2FA9AEE3">
           <v:rect id="_x0000_i1038" style="width:0;height:1.5pt" o:hralign="center" o:hrstd="t" o:hr="t" fillcolor="#a0a0a0" stroked="f"/>
         </w:pict>
       </w:r>
@@ -10863,9 +10855,9 @@
 <file path=word/numbering.xml><?xml version="1.0" encoding="utf-8"?>
 <w:numbering xmlns:wpc="http://schemas.microsoft.com/office/word/2010/wordprocessingCanvas" xmlns:cx="http://schemas.microsoft.com/office/drawing/2014/chartex" xmlns:cx1="http://schemas.microsoft.com/office/drawing/2015/9/8/chartex" xmlns:cx2="http://schemas.microsoft.com/office/drawing/2015/10/21/chartex" xmlns:cx3="http://schemas.microsoft.com/office/drawing/2016/5/9/chartex" xmlns:cx4="http://schemas.microsoft.com/office/drawing/2016/5/10/chartex" xmlns:cx5="http://schemas.microsoft.com/office/drawing/2016/5/11/chartex" xmlns:cx6="http://schemas.microsoft.com/office/drawing/2016/5/12/chartex" xmlns:cx7="http://schemas.microsoft.com/office/drawing/2016/5/13/chartex" xmlns:cx8="http://schemas.microsoft.com/office/drawing/2016/5/14/chartex" xmlns:mc="http://schemas.openxmlformats.org/markup-compatibility/2006" xmlns:aink="http://schemas.microsoft.com/office/drawing/2016/ink" xmlns:am3d="http://schemas.microsoft.com/office/drawing/2017/model3d" xmlns:o="urn:schemas-microsoft-com:office:office" xmlns:oel="http://schemas.microsoft.com/office/2019/extlst" xmlns:r="http://schemas.openxmlformats.org/officeDocument/2006/relationships" xmlns:m="http://schemas.openxmlformats.org/officeDocument/2006/math" xmlns:v="urn:schemas-microsoft-com:vml" xmlns:wp14="http://schemas.microsoft.com/office/word/2010/wordprocessingDrawing" xmlns:wp="http://schemas.openxmlformats.org/drawingml/2006/wordprocessingDrawing" xmlns:w10="urn:schemas-microsoft-com:office:word" xmlns:w="http://schemas.openxmlformats.org/wordprocessingml/2006/main" xmlns:w14="http://schemas.microsoft.com/office/word/2010/wordml" xmlns:w15="http://schemas.microsoft.com/office/word/2012/wordml" xmlns:w16cex="http://schemas.microsoft.com/office/word/2018/wordml/cex" xmlns:w16cid="http://schemas.microsoft.com/office/word/2016/wordml/cid" xmlns:w16="http://schemas.microsoft.com/office/word/2018/wordml" xmlns:w16du="http://schemas.microsoft.com/office/word/2023/wordml/word16du" xmlns:w16sdtdh="http://schemas.microsoft.com/office/word/2020/wordml/sdtdatahash" xmlns:w16sdtfl="http://schemas.microsoft.com/office/word/2024/wordml/sdtformatlock" xmlns:w16se="http://schemas.microsoft.com/office/word/2015/wordml/symex" xmlns:wpg="http://schemas.microsoft.com/office/word/2010/wordprocessingGroup" xmlns:wpi="http://schemas.microsoft.com/office/word/2010/wordprocessingInk" xmlns:wne="http://schemas.microsoft.com/office/word/2006/wordml" xmlns:wps="http://schemas.microsoft.com/office/word/2010/wordprocessingShape" mc:Ignorable="w14 w15 w16se w16cid w16 w16cex w16sdtdh w16sdtfl w16du wp14">
   <w:abstractNum w:abstractNumId="0" w15:restartNumberingAfterBreak="0">
-    <w:nsid w:val="033B1EC3"/>
+    <w:nsid w:val="005852EC"/>
     <w:multiLevelType w:val="multilevel"/>
-    <w:tmpl w:val="C8C2735A"/>
+    <w:tmpl w:val="F11C5F26"/>
     <w:lvl w:ilvl="0">
       <w:start w:val="1"/>
       <w:numFmt w:val="bullet"/>
@@ -11012,9 +11004,9 @@
     </w:lvl>
   </w:abstractNum>
   <w:abstractNum w:abstractNumId="1" w15:restartNumberingAfterBreak="0">
-    <w:nsid w:val="03934D76"/>
+    <w:nsid w:val="089A1BDB"/>
     <w:multiLevelType w:val="multilevel"/>
-    <w:tmpl w:val="E93C4BDE"/>
+    <w:tmpl w:val="C916CAD4"/>
     <w:lvl w:ilvl="0">
       <w:start w:val="1"/>
       <w:numFmt w:val="bullet"/>
@@ -11161,9 +11153,122 @@
     </w:lvl>
   </w:abstractNum>
   <w:abstractNum w:abstractNumId="2" w15:restartNumberingAfterBreak="0">
-    <w:nsid w:val="09970A99"/>
+    <w:nsid w:val="0A0512C2"/>
     <w:multiLevelType w:val="multilevel"/>
-    <w:tmpl w:val="96C48226"/>
+    <w:tmpl w:val="846458B0"/>
+    <w:lvl w:ilvl="0">
+      <w:start w:val="1"/>
+      <w:numFmt w:val="decimal"/>
+      <w:lvlText w:val="%1."/>
+      <w:lvlJc w:val="left"/>
+      <w:pPr>
+        <w:tabs>
+          <w:tab w:val="num" w:pos="720"/>
+        </w:tabs>
+        <w:ind w:left="720" w:hanging="360"/>
+      </w:pPr>
+    </w:lvl>
+    <w:lvl w:ilvl="1" w:tentative="1">
+      <w:start w:val="1"/>
+      <w:numFmt w:val="decimal"/>
+      <w:lvlText w:val="%2."/>
+      <w:lvlJc w:val="left"/>
+      <w:pPr>
+        <w:tabs>
+          <w:tab w:val="num" w:pos="1440"/>
+        </w:tabs>
+        <w:ind w:left="1440" w:hanging="360"/>
+      </w:pPr>
+    </w:lvl>
+    <w:lvl w:ilvl="2" w:tentative="1">
+      <w:start w:val="1"/>
+      <w:numFmt w:val="decimal"/>
+      <w:lvlText w:val="%3."/>
+      <w:lvlJc w:val="left"/>
+      <w:pPr>
+        <w:tabs>
+          <w:tab w:val="num" w:pos="2160"/>
+        </w:tabs>
+        <w:ind w:left="2160" w:hanging="360"/>
+      </w:pPr>
+    </w:lvl>
+    <w:lvl w:ilvl="3" w:tentative="1">
+      <w:start w:val="1"/>
+      <w:numFmt w:val="decimal"/>
+      <w:lvlText w:val="%4."/>
+      <w:lvlJc w:val="left"/>
+      <w:pPr>
+        <w:tabs>
+          <w:tab w:val="num" w:pos="2880"/>
+        </w:tabs>
+        <w:ind w:left="2880" w:hanging="360"/>
+      </w:pPr>
+    </w:lvl>
+    <w:lvl w:ilvl="4" w:tentative="1">
+      <w:start w:val="1"/>
+      <w:numFmt w:val="decimal"/>
+      <w:lvlText w:val="%5."/>
+      <w:lvlJc w:val="left"/>
+      <w:pPr>
+        <w:tabs>
+          <w:tab w:val="num" w:pos="3600"/>
+        </w:tabs>
+        <w:ind w:left="3600" w:hanging="360"/>
+      </w:pPr>
+    </w:lvl>
+    <w:lvl w:ilvl="5" w:tentative="1">
+      <w:start w:val="1"/>
+      <w:numFmt w:val="decimal"/>
+      <w:lvlText w:val="%6."/>
+      <w:lvlJc w:val="left"/>
+      <w:pPr>
+        <w:tabs>
+          <w:tab w:val="num" w:pos="4320"/>
+        </w:tabs>
+        <w:ind w:left="4320" w:hanging="360"/>
+      </w:pPr>
+    </w:lvl>
+    <w:lvl w:ilvl="6" w:tentative="1">
+      <w:start w:val="1"/>
+      <w:numFmt w:val="decimal"/>
+      <w:lvlText w:val="%7."/>
+      <w:lvlJc w:val="left"/>
+      <w:pPr>
+        <w:tabs>
+          <w:tab w:val="num" w:pos="5040"/>
+        </w:tabs>
+        <w:ind w:left="5040" w:hanging="360"/>
+      </w:pPr>
+    </w:lvl>
+    <w:lvl w:ilvl="7" w:tentative="1">
+      <w:start w:val="1"/>
+      <w:numFmt w:val="decimal"/>
+      <w:lvlText w:val="%8."/>
+      <w:lvlJc w:val="left"/>
+      <w:pPr>
+        <w:tabs>
+          <w:tab w:val="num" w:pos="5760"/>
+        </w:tabs>
+        <w:ind w:left="5760" w:hanging="360"/>
+      </w:pPr>
+    </w:lvl>
+    <w:lvl w:ilvl="8" w:tentative="1">
+      <w:start w:val="1"/>
+      <w:numFmt w:val="decimal"/>
+      <w:lvlText w:val="%9."/>
+      <w:lvlJc w:val="left"/>
+      <w:pPr>
+        <w:tabs>
+          <w:tab w:val="num" w:pos="6480"/>
+        </w:tabs>
+        <w:ind w:left="6480" w:hanging="360"/>
+      </w:pPr>
+    </w:lvl>
+  </w:abstractNum>
+  <w:abstractNum w:abstractNumId="3" w15:restartNumberingAfterBreak="0">
+    <w:nsid w:val="0A453C8E"/>
+    <w:multiLevelType w:val="multilevel"/>
+    <w:tmpl w:val="A5C05E4E"/>
     <w:lvl w:ilvl="0">
       <w:start w:val="1"/>
       <w:numFmt w:val="bullet"/>
@@ -11309,123 +11414,10 @@
       </w:rPr>
     </w:lvl>
   </w:abstractNum>
-  <w:abstractNum w:abstractNumId="3" w15:restartNumberingAfterBreak="0">
-    <w:nsid w:val="10007537"/>
+  <w:abstractNum w:abstractNumId="4" w15:restartNumberingAfterBreak="0">
+    <w:nsid w:val="0AD65655"/>
     <w:multiLevelType w:val="multilevel"/>
-    <w:tmpl w:val="1A686F6C"/>
-    <w:lvl w:ilvl="0">
-      <w:start w:val="1"/>
-      <w:numFmt w:val="decimal"/>
-      <w:lvlText w:val="%1."/>
-      <w:lvlJc w:val="left"/>
-      <w:pPr>
-        <w:tabs>
-          <w:tab w:val="num" w:pos="720"/>
-        </w:tabs>
-        <w:ind w:left="720" w:hanging="360"/>
-      </w:pPr>
-    </w:lvl>
-    <w:lvl w:ilvl="1" w:tentative="1">
-      <w:start w:val="1"/>
-      <w:numFmt w:val="decimal"/>
-      <w:lvlText w:val="%2."/>
-      <w:lvlJc w:val="left"/>
-      <w:pPr>
-        <w:tabs>
-          <w:tab w:val="num" w:pos="1440"/>
-        </w:tabs>
-        <w:ind w:left="1440" w:hanging="360"/>
-      </w:pPr>
-    </w:lvl>
-    <w:lvl w:ilvl="2" w:tentative="1">
-      <w:start w:val="1"/>
-      <w:numFmt w:val="decimal"/>
-      <w:lvlText w:val="%3."/>
-      <w:lvlJc w:val="left"/>
-      <w:pPr>
-        <w:tabs>
-          <w:tab w:val="num" w:pos="2160"/>
-        </w:tabs>
-        <w:ind w:left="2160" w:hanging="360"/>
-      </w:pPr>
-    </w:lvl>
-    <w:lvl w:ilvl="3" w:tentative="1">
-      <w:start w:val="1"/>
-      <w:numFmt w:val="decimal"/>
-      <w:lvlText w:val="%4."/>
-      <w:lvlJc w:val="left"/>
-      <w:pPr>
-        <w:tabs>
-          <w:tab w:val="num" w:pos="2880"/>
-        </w:tabs>
-        <w:ind w:left="2880" w:hanging="360"/>
-      </w:pPr>
-    </w:lvl>
-    <w:lvl w:ilvl="4" w:tentative="1">
-      <w:start w:val="1"/>
-      <w:numFmt w:val="decimal"/>
-      <w:lvlText w:val="%5."/>
-      <w:lvlJc w:val="left"/>
-      <w:pPr>
-        <w:tabs>
-          <w:tab w:val="num" w:pos="3600"/>
-        </w:tabs>
-        <w:ind w:left="3600" w:hanging="360"/>
-      </w:pPr>
-    </w:lvl>
-    <w:lvl w:ilvl="5" w:tentative="1">
-      <w:start w:val="1"/>
-      <w:numFmt w:val="decimal"/>
-      <w:lvlText w:val="%6."/>
-      <w:lvlJc w:val="left"/>
-      <w:pPr>
-        <w:tabs>
-          <w:tab w:val="num" w:pos="4320"/>
-        </w:tabs>
-        <w:ind w:left="4320" w:hanging="360"/>
-      </w:pPr>
-    </w:lvl>
-    <w:lvl w:ilvl="6" w:tentative="1">
-      <w:start w:val="1"/>
-      <w:numFmt w:val="decimal"/>
-      <w:lvlText w:val="%7."/>
-      <w:lvlJc w:val="left"/>
-      <w:pPr>
-        <w:tabs>
-          <w:tab w:val="num" w:pos="5040"/>
-        </w:tabs>
-        <w:ind w:left="5040" w:hanging="360"/>
-      </w:pPr>
-    </w:lvl>
-    <w:lvl w:ilvl="7" w:tentative="1">
-      <w:start w:val="1"/>
-      <w:numFmt w:val="decimal"/>
-      <w:lvlText w:val="%8."/>
-      <w:lvlJc w:val="left"/>
-      <w:pPr>
-        <w:tabs>
-          <w:tab w:val="num" w:pos="5760"/>
-        </w:tabs>
-        <w:ind w:left="5760" w:hanging="360"/>
-      </w:pPr>
-    </w:lvl>
-    <w:lvl w:ilvl="8" w:tentative="1">
-      <w:start w:val="1"/>
-      <w:numFmt w:val="decimal"/>
-      <w:lvlText w:val="%9."/>
-      <w:lvlJc w:val="left"/>
-      <w:pPr>
-        <w:tabs>
-          <w:tab w:val="num" w:pos="6480"/>
-        </w:tabs>
-        <w:ind w:left="6480" w:hanging="360"/>
-      </w:pPr>
-    </w:lvl>
-  </w:abstractNum>
-  <w:abstractNum w:abstractNumId="4" w15:restartNumberingAfterBreak="0">
-    <w:nsid w:val="133B6CDD"/>
-    <w:multiLevelType w:val="multilevel"/>
-    <w:tmpl w:val="556EF6AC"/>
+    <w:tmpl w:val="8A0EE042"/>
     <w:lvl w:ilvl="0">
       <w:start w:val="1"/>
       <w:numFmt w:val="bullet"/>
@@ -11572,9 +11564,9 @@
     </w:lvl>
   </w:abstractNum>
   <w:abstractNum w:abstractNumId="5" w15:restartNumberingAfterBreak="0">
-    <w:nsid w:val="21A14F2A"/>
+    <w:nsid w:val="0C943295"/>
     <w:multiLevelType w:val="multilevel"/>
-    <w:tmpl w:val="8304B088"/>
+    <w:tmpl w:val="6BC03DC2"/>
     <w:lvl w:ilvl="0">
       <w:start w:val="1"/>
       <w:numFmt w:val="bullet"/>
@@ -11721,9 +11713,9 @@
     </w:lvl>
   </w:abstractNum>
   <w:abstractNum w:abstractNumId="6" w15:restartNumberingAfterBreak="0">
-    <w:nsid w:val="22623F91"/>
+    <w:nsid w:val="146B7153"/>
     <w:multiLevelType w:val="multilevel"/>
-    <w:tmpl w:val="CEE4AC28"/>
+    <w:tmpl w:val="BE682DC4"/>
     <w:lvl w:ilvl="0">
       <w:start w:val="1"/>
       <w:numFmt w:val="bullet"/>
@@ -11870,9 +11862,9 @@
     </w:lvl>
   </w:abstractNum>
   <w:abstractNum w:abstractNumId="7" w15:restartNumberingAfterBreak="0">
-    <w:nsid w:val="258A47C0"/>
+    <w:nsid w:val="19601C45"/>
     <w:multiLevelType w:val="multilevel"/>
-    <w:tmpl w:val="99003558"/>
+    <w:tmpl w:val="861A15E8"/>
     <w:lvl w:ilvl="0">
       <w:start w:val="1"/>
       <w:numFmt w:val="bullet"/>
@@ -12019,9 +12011,235 @@
     </w:lvl>
   </w:abstractNum>
   <w:abstractNum w:abstractNumId="8" w15:restartNumberingAfterBreak="0">
-    <w:nsid w:val="286A29AB"/>
+    <w:nsid w:val="1DDC3CFC"/>
     <w:multiLevelType w:val="multilevel"/>
-    <w:tmpl w:val="6BB44AD8"/>
+    <w:tmpl w:val="8C3C4888"/>
+    <w:lvl w:ilvl="0">
+      <w:start w:val="1"/>
+      <w:numFmt w:val="decimal"/>
+      <w:lvlText w:val="%1."/>
+      <w:lvlJc w:val="left"/>
+      <w:pPr>
+        <w:tabs>
+          <w:tab w:val="num" w:pos="720"/>
+        </w:tabs>
+        <w:ind w:left="720" w:hanging="360"/>
+      </w:pPr>
+    </w:lvl>
+    <w:lvl w:ilvl="1" w:tentative="1">
+      <w:start w:val="1"/>
+      <w:numFmt w:val="decimal"/>
+      <w:lvlText w:val="%2."/>
+      <w:lvlJc w:val="left"/>
+      <w:pPr>
+        <w:tabs>
+          <w:tab w:val="num" w:pos="1440"/>
+        </w:tabs>
+        <w:ind w:left="1440" w:hanging="360"/>
+      </w:pPr>
+    </w:lvl>
+    <w:lvl w:ilvl="2" w:tentative="1">
+      <w:start w:val="1"/>
+      <w:numFmt w:val="decimal"/>
+      <w:lvlText w:val="%3."/>
+      <w:lvlJc w:val="left"/>
+      <w:pPr>
+        <w:tabs>
+          <w:tab w:val="num" w:pos="2160"/>
+        </w:tabs>
+        <w:ind w:left="2160" w:hanging="360"/>
+      </w:pPr>
+    </w:lvl>
+    <w:lvl w:ilvl="3" w:tentative="1">
+      <w:start w:val="1"/>
+      <w:numFmt w:val="decimal"/>
+      <w:lvlText w:val="%4."/>
+      <w:lvlJc w:val="left"/>
+      <w:pPr>
+        <w:tabs>
+          <w:tab w:val="num" w:pos="2880"/>
+        </w:tabs>
+        <w:ind w:left="2880" w:hanging="360"/>
+      </w:pPr>
+    </w:lvl>
+    <w:lvl w:ilvl="4" w:tentative="1">
+      <w:start w:val="1"/>
+      <w:numFmt w:val="decimal"/>
+      <w:lvlText w:val="%5."/>
+      <w:lvlJc w:val="left"/>
+      <w:pPr>
+        <w:tabs>
+          <w:tab w:val="num" w:pos="3600"/>
+        </w:tabs>
+        <w:ind w:left="3600" w:hanging="360"/>
+      </w:pPr>
+    </w:lvl>
+    <w:lvl w:ilvl="5" w:tentative="1">
+      <w:start w:val="1"/>
+      <w:numFmt w:val="decimal"/>
+      <w:lvlText w:val="%6."/>
+      <w:lvlJc w:val="left"/>
+      <w:pPr>
+        <w:tabs>
+          <w:tab w:val="num" w:pos="4320"/>
+        </w:tabs>
+        <w:ind w:left="4320" w:hanging="360"/>
+      </w:pPr>
+    </w:lvl>
+    <w:lvl w:ilvl="6" w:tentative="1">
+      <w:start w:val="1"/>
+      <w:numFmt w:val="decimal"/>
+      <w:lvlText w:val="%7."/>
+      <w:lvlJc w:val="left"/>
+      <w:pPr>
+        <w:tabs>
+          <w:tab w:val="num" w:pos="5040"/>
+        </w:tabs>
+        <w:ind w:left="5040" w:hanging="360"/>
+      </w:pPr>
+    </w:lvl>
+    <w:lvl w:ilvl="7" w:tentative="1">
+      <w:start w:val="1"/>
+      <w:numFmt w:val="decimal"/>
+      <w:lvlText w:val="%8."/>
+      <w:lvlJc w:val="left"/>
+      <w:pPr>
+        <w:tabs>
+          <w:tab w:val="num" w:pos="5760"/>
+        </w:tabs>
+        <w:ind w:left="5760" w:hanging="360"/>
+      </w:pPr>
+    </w:lvl>
+    <w:lvl w:ilvl="8" w:tentative="1">
+      <w:start w:val="1"/>
+      <w:numFmt w:val="decimal"/>
+      <w:lvlText w:val="%9."/>
+      <w:lvlJc w:val="left"/>
+      <w:pPr>
+        <w:tabs>
+          <w:tab w:val="num" w:pos="6480"/>
+        </w:tabs>
+        <w:ind w:left="6480" w:hanging="360"/>
+      </w:pPr>
+    </w:lvl>
+  </w:abstractNum>
+  <w:abstractNum w:abstractNumId="9" w15:restartNumberingAfterBreak="0">
+    <w:nsid w:val="1E210CD0"/>
+    <w:multiLevelType w:val="multilevel"/>
+    <w:tmpl w:val="6EC84634"/>
+    <w:lvl w:ilvl="0">
+      <w:start w:val="1"/>
+      <w:numFmt w:val="decimal"/>
+      <w:lvlText w:val="%1."/>
+      <w:lvlJc w:val="left"/>
+      <w:pPr>
+        <w:tabs>
+          <w:tab w:val="num" w:pos="720"/>
+        </w:tabs>
+        <w:ind w:left="720" w:hanging="360"/>
+      </w:pPr>
+    </w:lvl>
+    <w:lvl w:ilvl="1" w:tentative="1">
+      <w:start w:val="1"/>
+      <w:numFmt w:val="decimal"/>
+      <w:lvlText w:val="%2."/>
+      <w:lvlJc w:val="left"/>
+      <w:pPr>
+        <w:tabs>
+          <w:tab w:val="num" w:pos="1440"/>
+        </w:tabs>
+        <w:ind w:left="1440" w:hanging="360"/>
+      </w:pPr>
+    </w:lvl>
+    <w:lvl w:ilvl="2" w:tentative="1">
+      <w:start w:val="1"/>
+      <w:numFmt w:val="decimal"/>
+      <w:lvlText w:val="%3."/>
+      <w:lvlJc w:val="left"/>
+      <w:pPr>
+        <w:tabs>
+          <w:tab w:val="num" w:pos="2160"/>
+        </w:tabs>
+        <w:ind w:left="2160" w:hanging="360"/>
+      </w:pPr>
+    </w:lvl>
+    <w:lvl w:ilvl="3" w:tentative="1">
+      <w:start w:val="1"/>
+      <w:numFmt w:val="decimal"/>
+      <w:lvlText w:val="%4."/>
+      <w:lvlJc w:val="left"/>
+      <w:pPr>
+        <w:tabs>
+          <w:tab w:val="num" w:pos="2880"/>
+        </w:tabs>
+        <w:ind w:left="2880" w:hanging="360"/>
+      </w:pPr>
+    </w:lvl>
+    <w:lvl w:ilvl="4" w:tentative="1">
+      <w:start w:val="1"/>
+      <w:numFmt w:val="decimal"/>
+      <w:lvlText w:val="%5."/>
+      <w:lvlJc w:val="left"/>
+      <w:pPr>
+        <w:tabs>
+          <w:tab w:val="num" w:pos="3600"/>
+        </w:tabs>
+        <w:ind w:left="3600" w:hanging="360"/>
+      </w:pPr>
+    </w:lvl>
+    <w:lvl w:ilvl="5" w:tentative="1">
+      <w:start w:val="1"/>
+      <w:numFmt w:val="decimal"/>
+      <w:lvlText w:val="%6."/>
+      <w:lvlJc w:val="left"/>
+      <w:pPr>
+        <w:tabs>
+          <w:tab w:val="num" w:pos="4320"/>
+        </w:tabs>
+        <w:ind w:left="4320" w:hanging="360"/>
+      </w:pPr>
+    </w:lvl>
+    <w:lvl w:ilvl="6" w:tentative="1">
+      <w:start w:val="1"/>
+      <w:numFmt w:val="decimal"/>
+      <w:lvlText w:val="%7."/>
+      <w:lvlJc w:val="left"/>
+      <w:pPr>
+        <w:tabs>
+          <w:tab w:val="num" w:pos="5040"/>
+        </w:tabs>
+        <w:ind w:left="5040" w:hanging="360"/>
+      </w:pPr>
+    </w:lvl>
+    <w:lvl w:ilvl="7" w:tentative="1">
+      <w:start w:val="1"/>
+      <w:numFmt w:val="decimal"/>
+      <w:lvlText w:val="%8."/>
+      <w:lvlJc w:val="left"/>
+      <w:pPr>
+        <w:tabs>
+          <w:tab w:val="num" w:pos="5760"/>
+        </w:tabs>
+        <w:ind w:left="5760" w:hanging="360"/>
+      </w:pPr>
+    </w:lvl>
+    <w:lvl w:ilvl="8" w:tentative="1">
+      <w:start w:val="1"/>
+      <w:numFmt w:val="decimal"/>
+      <w:lvlText w:val="%9."/>
+      <w:lvlJc w:val="left"/>
+      <w:pPr>
+        <w:tabs>
+          <w:tab w:val="num" w:pos="6480"/>
+        </w:tabs>
+        <w:ind w:left="6480" w:hanging="360"/>
+      </w:pPr>
+    </w:lvl>
+  </w:abstractNum>
+  <w:abstractNum w:abstractNumId="10" w15:restartNumberingAfterBreak="0">
+    <w:nsid w:val="2AA95E99"/>
+    <w:multiLevelType w:val="multilevel"/>
+    <w:tmpl w:val="A676667A"/>
     <w:lvl w:ilvl="0">
       <w:start w:val="1"/>
       <w:numFmt w:val="bullet"/>
@@ -12167,10 +12385,236 @@
       </w:rPr>
     </w:lvl>
   </w:abstractNum>
-  <w:abstractNum w:abstractNumId="9" w15:restartNumberingAfterBreak="0">
-    <w:nsid w:val="28C71D4A"/>
+  <w:abstractNum w:abstractNumId="11" w15:restartNumberingAfterBreak="0">
+    <w:nsid w:val="33ED595B"/>
     <w:multiLevelType w:val="multilevel"/>
-    <w:tmpl w:val="CEEA5CE6"/>
+    <w:tmpl w:val="8A3A6294"/>
+    <w:lvl w:ilvl="0">
+      <w:start w:val="1"/>
+      <w:numFmt w:val="decimal"/>
+      <w:lvlText w:val="%1."/>
+      <w:lvlJc w:val="left"/>
+      <w:pPr>
+        <w:tabs>
+          <w:tab w:val="num" w:pos="720"/>
+        </w:tabs>
+        <w:ind w:left="720" w:hanging="360"/>
+      </w:pPr>
+    </w:lvl>
+    <w:lvl w:ilvl="1" w:tentative="1">
+      <w:start w:val="1"/>
+      <w:numFmt w:val="decimal"/>
+      <w:lvlText w:val="%2."/>
+      <w:lvlJc w:val="left"/>
+      <w:pPr>
+        <w:tabs>
+          <w:tab w:val="num" w:pos="1440"/>
+        </w:tabs>
+        <w:ind w:left="1440" w:hanging="360"/>
+      </w:pPr>
+    </w:lvl>
+    <w:lvl w:ilvl="2" w:tentative="1">
+      <w:start w:val="1"/>
+      <w:numFmt w:val="decimal"/>
+      <w:lvlText w:val="%3."/>
+      <w:lvlJc w:val="left"/>
+      <w:pPr>
+        <w:tabs>
+          <w:tab w:val="num" w:pos="2160"/>
+        </w:tabs>
+        <w:ind w:left="2160" w:hanging="360"/>
+      </w:pPr>
+    </w:lvl>
+    <w:lvl w:ilvl="3" w:tentative="1">
+      <w:start w:val="1"/>
+      <w:numFmt w:val="decimal"/>
+      <w:lvlText w:val="%4."/>
+      <w:lvlJc w:val="left"/>
+      <w:pPr>
+        <w:tabs>
+          <w:tab w:val="num" w:pos="2880"/>
+        </w:tabs>
+        <w:ind w:left="2880" w:hanging="360"/>
+      </w:pPr>
+    </w:lvl>
+    <w:lvl w:ilvl="4" w:tentative="1">
+      <w:start w:val="1"/>
+      <w:numFmt w:val="decimal"/>
+      <w:lvlText w:val="%5."/>
+      <w:lvlJc w:val="left"/>
+      <w:pPr>
+        <w:tabs>
+          <w:tab w:val="num" w:pos="3600"/>
+        </w:tabs>
+        <w:ind w:left="3600" w:hanging="360"/>
+      </w:pPr>
+    </w:lvl>
+    <w:lvl w:ilvl="5" w:tentative="1">
+      <w:start w:val="1"/>
+      <w:numFmt w:val="decimal"/>
+      <w:lvlText w:val="%6."/>
+      <w:lvlJc w:val="left"/>
+      <w:pPr>
+        <w:tabs>
+          <w:tab w:val="num" w:pos="4320"/>
+        </w:tabs>
+        <w:ind w:left="4320" w:hanging="360"/>
+      </w:pPr>
+    </w:lvl>
+    <w:lvl w:ilvl="6" w:tentative="1">
+      <w:start w:val="1"/>
+      <w:numFmt w:val="decimal"/>
+      <w:lvlText w:val="%7."/>
+      <w:lvlJc w:val="left"/>
+      <w:pPr>
+        <w:tabs>
+          <w:tab w:val="num" w:pos="5040"/>
+        </w:tabs>
+        <w:ind w:left="5040" w:hanging="360"/>
+      </w:pPr>
+    </w:lvl>
+    <w:lvl w:ilvl="7" w:tentative="1">
+      <w:start w:val="1"/>
+      <w:numFmt w:val="decimal"/>
+      <w:lvlText w:val="%8."/>
+      <w:lvlJc w:val="left"/>
+      <w:pPr>
+        <w:tabs>
+          <w:tab w:val="num" w:pos="5760"/>
+        </w:tabs>
+        <w:ind w:left="5760" w:hanging="360"/>
+      </w:pPr>
+    </w:lvl>
+    <w:lvl w:ilvl="8" w:tentative="1">
+      <w:start w:val="1"/>
+      <w:numFmt w:val="decimal"/>
+      <w:lvlText w:val="%9."/>
+      <w:lvlJc w:val="left"/>
+      <w:pPr>
+        <w:tabs>
+          <w:tab w:val="num" w:pos="6480"/>
+        </w:tabs>
+        <w:ind w:left="6480" w:hanging="360"/>
+      </w:pPr>
+    </w:lvl>
+  </w:abstractNum>
+  <w:abstractNum w:abstractNumId="12" w15:restartNumberingAfterBreak="0">
+    <w:nsid w:val="3BC40600"/>
+    <w:multiLevelType w:val="multilevel"/>
+    <w:tmpl w:val="4134BD0A"/>
+    <w:lvl w:ilvl="0">
+      <w:start w:val="1"/>
+      <w:numFmt w:val="decimal"/>
+      <w:lvlText w:val="%1."/>
+      <w:lvlJc w:val="left"/>
+      <w:pPr>
+        <w:tabs>
+          <w:tab w:val="num" w:pos="720"/>
+        </w:tabs>
+        <w:ind w:left="720" w:hanging="360"/>
+      </w:pPr>
+    </w:lvl>
+    <w:lvl w:ilvl="1" w:tentative="1">
+      <w:start w:val="1"/>
+      <w:numFmt w:val="decimal"/>
+      <w:lvlText w:val="%2."/>
+      <w:lvlJc w:val="left"/>
+      <w:pPr>
+        <w:tabs>
+          <w:tab w:val="num" w:pos="1440"/>
+        </w:tabs>
+        <w:ind w:left="1440" w:hanging="360"/>
+      </w:pPr>
+    </w:lvl>
+    <w:lvl w:ilvl="2" w:tentative="1">
+      <w:start w:val="1"/>
+      <w:numFmt w:val="decimal"/>
+      <w:lvlText w:val="%3."/>
+      <w:lvlJc w:val="left"/>
+      <w:pPr>
+        <w:tabs>
+          <w:tab w:val="num" w:pos="2160"/>
+        </w:tabs>
+        <w:ind w:left="2160" w:hanging="360"/>
+      </w:pPr>
+    </w:lvl>
+    <w:lvl w:ilvl="3" w:tentative="1">
+      <w:start w:val="1"/>
+      <w:numFmt w:val="decimal"/>
+      <w:lvlText w:val="%4."/>
+      <w:lvlJc w:val="left"/>
+      <w:pPr>
+        <w:tabs>
+          <w:tab w:val="num" w:pos="2880"/>
+        </w:tabs>
+        <w:ind w:left="2880" w:hanging="360"/>
+      </w:pPr>
+    </w:lvl>
+    <w:lvl w:ilvl="4" w:tentative="1">
+      <w:start w:val="1"/>
+      <w:numFmt w:val="decimal"/>
+      <w:lvlText w:val="%5."/>
+      <w:lvlJc w:val="left"/>
+      <w:pPr>
+        <w:tabs>
+          <w:tab w:val="num" w:pos="3600"/>
+        </w:tabs>
+        <w:ind w:left="3600" w:hanging="360"/>
+      </w:pPr>
+    </w:lvl>
+    <w:lvl w:ilvl="5" w:tentative="1">
+      <w:start w:val="1"/>
+      <w:numFmt w:val="decimal"/>
+      <w:lvlText w:val="%6."/>
+      <w:lvlJc w:val="left"/>
+      <w:pPr>
+        <w:tabs>
+          <w:tab w:val="num" w:pos="4320"/>
+        </w:tabs>
+        <w:ind w:left="4320" w:hanging="360"/>
+      </w:pPr>
+    </w:lvl>
+    <w:lvl w:ilvl="6" w:tentative="1">
+      <w:start w:val="1"/>
+      <w:numFmt w:val="decimal"/>
+      <w:lvlText w:val="%7."/>
+      <w:lvlJc w:val="left"/>
+      <w:pPr>
+        <w:tabs>
+          <w:tab w:val="num" w:pos="5040"/>
+        </w:tabs>
+        <w:ind w:left="5040" w:hanging="360"/>
+      </w:pPr>
+    </w:lvl>
+    <w:lvl w:ilvl="7" w:tentative="1">
+      <w:start w:val="1"/>
+      <w:numFmt w:val="decimal"/>
+      <w:lvlText w:val="%8."/>
+      <w:lvlJc w:val="left"/>
+      <w:pPr>
+        <w:tabs>
+          <w:tab w:val="num" w:pos="5760"/>
+        </w:tabs>
+        <w:ind w:left="5760" w:hanging="360"/>
+      </w:pPr>
+    </w:lvl>
+    <w:lvl w:ilvl="8" w:tentative="1">
+      <w:start w:val="1"/>
+      <w:numFmt w:val="decimal"/>
+      <w:lvlText w:val="%9."/>
+      <w:lvlJc w:val="left"/>
+      <w:pPr>
+        <w:tabs>
+          <w:tab w:val="num" w:pos="6480"/>
+        </w:tabs>
+        <w:ind w:left="6480" w:hanging="360"/>
+      </w:pPr>
+    </w:lvl>
+  </w:abstractNum>
+  <w:abstractNum w:abstractNumId="13" w15:restartNumberingAfterBreak="0">
+    <w:nsid w:val="3D202743"/>
+    <w:multiLevelType w:val="multilevel"/>
+    <w:tmpl w:val="C1F091CE"/>
     <w:lvl w:ilvl="0">
       <w:start w:val="1"/>
       <w:numFmt w:val="bullet"/>
@@ -12316,123 +12760,10 @@
       </w:rPr>
     </w:lvl>
   </w:abstractNum>
-  <w:abstractNum w:abstractNumId="10" w15:restartNumberingAfterBreak="0">
-    <w:nsid w:val="2ADA2090"/>
+  <w:abstractNum w:abstractNumId="14" w15:restartNumberingAfterBreak="0">
+    <w:nsid w:val="403748D8"/>
     <w:multiLevelType w:val="multilevel"/>
-    <w:tmpl w:val="E344474C"/>
-    <w:lvl w:ilvl="0">
-      <w:start w:val="1"/>
-      <w:numFmt w:val="decimal"/>
-      <w:lvlText w:val="%1."/>
-      <w:lvlJc w:val="left"/>
-      <w:pPr>
-        <w:tabs>
-          <w:tab w:val="num" w:pos="720"/>
-        </w:tabs>
-        <w:ind w:left="720" w:hanging="360"/>
-      </w:pPr>
-    </w:lvl>
-    <w:lvl w:ilvl="1" w:tentative="1">
-      <w:start w:val="1"/>
-      <w:numFmt w:val="decimal"/>
-      <w:lvlText w:val="%2."/>
-      <w:lvlJc w:val="left"/>
-      <w:pPr>
-        <w:tabs>
-          <w:tab w:val="num" w:pos="1440"/>
-        </w:tabs>
-        <w:ind w:left="1440" w:hanging="360"/>
-      </w:pPr>
-    </w:lvl>
-    <w:lvl w:ilvl="2" w:tentative="1">
-      <w:start w:val="1"/>
-      <w:numFmt w:val="decimal"/>
-      <w:lvlText w:val="%3."/>
-      <w:lvlJc w:val="left"/>
-      <w:pPr>
-        <w:tabs>
-          <w:tab w:val="num" w:pos="2160"/>
-        </w:tabs>
-        <w:ind w:left="2160" w:hanging="360"/>
-      </w:pPr>
-    </w:lvl>
-    <w:lvl w:ilvl="3" w:tentative="1">
-      <w:start w:val="1"/>
-      <w:numFmt w:val="decimal"/>
-      <w:lvlText w:val="%4."/>
-      <w:lvlJc w:val="left"/>
-      <w:pPr>
-        <w:tabs>
-          <w:tab w:val="num" w:pos="2880"/>
-        </w:tabs>
-        <w:ind w:left="2880" w:hanging="360"/>
-      </w:pPr>
-    </w:lvl>
-    <w:lvl w:ilvl="4" w:tentative="1">
-      <w:start w:val="1"/>
-      <w:numFmt w:val="decimal"/>
-      <w:lvlText w:val="%5."/>
-      <w:lvlJc w:val="left"/>
-      <w:pPr>
-        <w:tabs>
-          <w:tab w:val="num" w:pos="3600"/>
-        </w:tabs>
-        <w:ind w:left="3600" w:hanging="360"/>
-      </w:pPr>
-    </w:lvl>
-    <w:lvl w:ilvl="5" w:tentative="1">
-      <w:start w:val="1"/>
-      <w:numFmt w:val="decimal"/>
-      <w:lvlText w:val="%6."/>
-      <w:lvlJc w:val="left"/>
-      <w:pPr>
-        <w:tabs>
-          <w:tab w:val="num" w:pos="4320"/>
-        </w:tabs>
-        <w:ind w:left="4320" w:hanging="360"/>
-      </w:pPr>
-    </w:lvl>
-    <w:lvl w:ilvl="6" w:tentative="1">
-      <w:start w:val="1"/>
-      <w:numFmt w:val="decimal"/>
-      <w:lvlText w:val="%7."/>
-      <w:lvlJc w:val="left"/>
-      <w:pPr>
-        <w:tabs>
-          <w:tab w:val="num" w:pos="5040"/>
-        </w:tabs>
-        <w:ind w:left="5040" w:hanging="360"/>
-      </w:pPr>
-    </w:lvl>
-    <w:lvl w:ilvl="7" w:tentative="1">
-      <w:start w:val="1"/>
-      <w:numFmt w:val="decimal"/>
-      <w:lvlText w:val="%8."/>
-      <w:lvlJc w:val="left"/>
-      <w:pPr>
-        <w:tabs>
-          <w:tab w:val="num" w:pos="5760"/>
-        </w:tabs>
-        <w:ind w:left="5760" w:hanging="360"/>
-      </w:pPr>
-    </w:lvl>
-    <w:lvl w:ilvl="8" w:tentative="1">
-      <w:start w:val="1"/>
-      <w:numFmt w:val="decimal"/>
-      <w:lvlText w:val="%9."/>
-      <w:lvlJc w:val="left"/>
-      <w:pPr>
-        <w:tabs>
-          <w:tab w:val="num" w:pos="6480"/>
-        </w:tabs>
-        <w:ind w:left="6480" w:hanging="360"/>
-      </w:pPr>
-    </w:lvl>
-  </w:abstractNum>
-  <w:abstractNum w:abstractNumId="11" w15:restartNumberingAfterBreak="0">
-    <w:nsid w:val="33C00BF4"/>
-    <w:multiLevelType w:val="multilevel"/>
-    <w:tmpl w:val="8CF29190"/>
+    <w:tmpl w:val="AEB28C7A"/>
     <w:lvl w:ilvl="0">
       <w:start w:val="1"/>
       <w:numFmt w:val="bullet"/>
@@ -12578,10 +12909,10 @@
       </w:rPr>
     </w:lvl>
   </w:abstractNum>
-  <w:abstractNum w:abstractNumId="12" w15:restartNumberingAfterBreak="0">
-    <w:nsid w:val="382514A4"/>
+  <w:abstractNum w:abstractNumId="15" w15:restartNumberingAfterBreak="0">
+    <w:nsid w:val="5C6B48DE"/>
     <w:multiLevelType w:val="multilevel"/>
-    <w:tmpl w:val="FE0824EC"/>
+    <w:tmpl w:val="63542696"/>
     <w:lvl w:ilvl="0">
       <w:start w:val="1"/>
       <w:numFmt w:val="bullet"/>
@@ -12727,123 +13058,10 @@
       </w:rPr>
     </w:lvl>
   </w:abstractNum>
-  <w:abstractNum w:abstractNumId="13" w15:restartNumberingAfterBreak="0">
-    <w:nsid w:val="3DA111EA"/>
+  <w:abstractNum w:abstractNumId="16" w15:restartNumberingAfterBreak="0">
+    <w:nsid w:val="5D752B84"/>
     <w:multiLevelType w:val="multilevel"/>
-    <w:tmpl w:val="E042D350"/>
-    <w:lvl w:ilvl="0">
-      <w:start w:val="1"/>
-      <w:numFmt w:val="decimal"/>
-      <w:lvlText w:val="%1."/>
-      <w:lvlJc w:val="left"/>
-      <w:pPr>
-        <w:tabs>
-          <w:tab w:val="num" w:pos="720"/>
-        </w:tabs>
-        <w:ind w:left="720" w:hanging="360"/>
-      </w:pPr>
-    </w:lvl>
-    <w:lvl w:ilvl="1" w:tentative="1">
-      <w:start w:val="1"/>
-      <w:numFmt w:val="decimal"/>
-      <w:lvlText w:val="%2."/>
-      <w:lvlJc w:val="left"/>
-      <w:pPr>
-        <w:tabs>
-          <w:tab w:val="num" w:pos="1440"/>
-        </w:tabs>
-        <w:ind w:left="1440" w:hanging="360"/>
-      </w:pPr>
-    </w:lvl>
-    <w:lvl w:ilvl="2" w:tentative="1">
-      <w:start w:val="1"/>
-      <w:numFmt w:val="decimal"/>
-      <w:lvlText w:val="%3."/>
-      <w:lvlJc w:val="left"/>
-      <w:pPr>
-        <w:tabs>
-          <w:tab w:val="num" w:pos="2160"/>
-        </w:tabs>
-        <w:ind w:left="2160" w:hanging="360"/>
-      </w:pPr>
-    </w:lvl>
-    <w:lvl w:ilvl="3" w:tentative="1">
-      <w:start w:val="1"/>
-      <w:numFmt w:val="decimal"/>
-      <w:lvlText w:val="%4."/>
-      <w:lvlJc w:val="left"/>
-      <w:pPr>
-        <w:tabs>
-          <w:tab w:val="num" w:pos="2880"/>
-        </w:tabs>
-        <w:ind w:left="2880" w:hanging="360"/>
-      </w:pPr>
-    </w:lvl>
-    <w:lvl w:ilvl="4" w:tentative="1">
-      <w:start w:val="1"/>
-      <w:numFmt w:val="decimal"/>
-      <w:lvlText w:val="%5."/>
-      <w:lvlJc w:val="left"/>
-      <w:pPr>
-        <w:tabs>
-          <w:tab w:val="num" w:pos="3600"/>
-        </w:tabs>
-        <w:ind w:left="3600" w:hanging="360"/>
-      </w:pPr>
-    </w:lvl>
-    <w:lvl w:ilvl="5" w:tentative="1">
-      <w:start w:val="1"/>
-      <w:numFmt w:val="decimal"/>
-      <w:lvlText w:val="%6."/>
-      <w:lvlJc w:val="left"/>
-      <w:pPr>
-        <w:tabs>
-          <w:tab w:val="num" w:pos="4320"/>
-        </w:tabs>
-        <w:ind w:left="4320" w:hanging="360"/>
-      </w:pPr>
-    </w:lvl>
-    <w:lvl w:ilvl="6" w:tentative="1">
-      <w:start w:val="1"/>
-      <w:numFmt w:val="decimal"/>
-      <w:lvlText w:val="%7."/>
-      <w:lvlJc w:val="left"/>
-      <w:pPr>
-        <w:tabs>
-          <w:tab w:val="num" w:pos="5040"/>
-        </w:tabs>
-        <w:ind w:left="5040" w:hanging="360"/>
-      </w:pPr>
-    </w:lvl>
-    <w:lvl w:ilvl="7" w:tentative="1">
-      <w:start w:val="1"/>
-      <w:numFmt w:val="decimal"/>
-      <w:lvlText w:val="%8."/>
-      <w:lvlJc w:val="left"/>
-      <w:pPr>
-        <w:tabs>
-          <w:tab w:val="num" w:pos="5760"/>
-        </w:tabs>
-        <w:ind w:left="5760" w:hanging="360"/>
-      </w:pPr>
-    </w:lvl>
-    <w:lvl w:ilvl="8" w:tentative="1">
-      <w:start w:val="1"/>
-      <w:numFmt w:val="decimal"/>
-      <w:lvlText w:val="%9."/>
-      <w:lvlJc w:val="left"/>
-      <w:pPr>
-        <w:tabs>
-          <w:tab w:val="num" w:pos="6480"/>
-        </w:tabs>
-        <w:ind w:left="6480" w:hanging="360"/>
-      </w:pPr>
-    </w:lvl>
-  </w:abstractNum>
-  <w:abstractNum w:abstractNumId="14" w15:restartNumberingAfterBreak="0">
-    <w:nsid w:val="44F77D40"/>
-    <w:multiLevelType w:val="multilevel"/>
-    <w:tmpl w:val="AC9ECDBA"/>
+    <w:tmpl w:val="38A0BED2"/>
     <w:lvl w:ilvl="0">
       <w:start w:val="1"/>
       <w:numFmt w:val="bullet"/>
@@ -12989,10 +13207,10 @@
       </w:rPr>
     </w:lvl>
   </w:abstractNum>
-  <w:abstractNum w:abstractNumId="15" w15:restartNumberingAfterBreak="0">
-    <w:nsid w:val="46002ABA"/>
+  <w:abstractNum w:abstractNumId="17" w15:restartNumberingAfterBreak="0">
+    <w:nsid w:val="646D6922"/>
     <w:multiLevelType w:val="multilevel"/>
-    <w:tmpl w:val="CDACD800"/>
+    <w:tmpl w:val="01B87260"/>
     <w:lvl w:ilvl="0">
       <w:start w:val="1"/>
       <w:numFmt w:val="bullet"/>
@@ -13138,10 +13356,10 @@
       </w:rPr>
     </w:lvl>
   </w:abstractNum>
-  <w:abstractNum w:abstractNumId="16" w15:restartNumberingAfterBreak="0">
-    <w:nsid w:val="4A431F67"/>
+  <w:abstractNum w:abstractNumId="18" w15:restartNumberingAfterBreak="0">
+    <w:nsid w:val="6F4A4937"/>
     <w:multiLevelType w:val="multilevel"/>
-    <w:tmpl w:val="EC3A1D38"/>
+    <w:tmpl w:val="FFA4BEB8"/>
     <w:lvl w:ilvl="0">
       <w:start w:val="1"/>
       <w:numFmt w:val="bullet"/>
@@ -13287,236 +13505,10 @@
       </w:rPr>
     </w:lvl>
   </w:abstractNum>
-  <w:abstractNum w:abstractNumId="17" w15:restartNumberingAfterBreak="0">
-    <w:nsid w:val="63F33F70"/>
+  <w:abstractNum w:abstractNumId="19" w15:restartNumberingAfterBreak="0">
+    <w:nsid w:val="79AA4534"/>
     <w:multiLevelType w:val="multilevel"/>
-    <w:tmpl w:val="9B0A6FF8"/>
-    <w:lvl w:ilvl="0">
-      <w:start w:val="1"/>
-      <w:numFmt w:val="decimal"/>
-      <w:lvlText w:val="%1."/>
-      <w:lvlJc w:val="left"/>
-      <w:pPr>
-        <w:tabs>
-          <w:tab w:val="num" w:pos="720"/>
-        </w:tabs>
-        <w:ind w:left="720" w:hanging="360"/>
-      </w:pPr>
-    </w:lvl>
-    <w:lvl w:ilvl="1" w:tentative="1">
-      <w:start w:val="1"/>
-      <w:numFmt w:val="decimal"/>
-      <w:lvlText w:val="%2."/>
-      <w:lvlJc w:val="left"/>
-      <w:pPr>
-        <w:tabs>
-          <w:tab w:val="num" w:pos="1440"/>
-        </w:tabs>
-        <w:ind w:left="1440" w:hanging="360"/>
-      </w:pPr>
-    </w:lvl>
-    <w:lvl w:ilvl="2" w:tentative="1">
-      <w:start w:val="1"/>
-      <w:numFmt w:val="decimal"/>
-      <w:lvlText w:val="%3."/>
-      <w:lvlJc w:val="left"/>
-      <w:pPr>
-        <w:tabs>
-          <w:tab w:val="num" w:pos="2160"/>
-        </w:tabs>
-        <w:ind w:left="2160" w:hanging="360"/>
-      </w:pPr>
-    </w:lvl>
-    <w:lvl w:ilvl="3" w:tentative="1">
-      <w:start w:val="1"/>
-      <w:numFmt w:val="decimal"/>
-      <w:lvlText w:val="%4."/>
-      <w:lvlJc w:val="left"/>
-      <w:pPr>
-        <w:tabs>
-          <w:tab w:val="num" w:pos="2880"/>
-        </w:tabs>
-        <w:ind w:left="2880" w:hanging="360"/>
-      </w:pPr>
-    </w:lvl>
-    <w:lvl w:ilvl="4" w:tentative="1">
-      <w:start w:val="1"/>
-      <w:numFmt w:val="decimal"/>
-      <w:lvlText w:val="%5."/>
-      <w:lvlJc w:val="left"/>
-      <w:pPr>
-        <w:tabs>
-          <w:tab w:val="num" w:pos="3600"/>
-        </w:tabs>
-        <w:ind w:left="3600" w:hanging="360"/>
-      </w:pPr>
-    </w:lvl>
-    <w:lvl w:ilvl="5" w:tentative="1">
-      <w:start w:val="1"/>
-      <w:numFmt w:val="decimal"/>
-      <w:lvlText w:val="%6."/>
-      <w:lvlJc w:val="left"/>
-      <w:pPr>
-        <w:tabs>
-          <w:tab w:val="num" w:pos="4320"/>
-        </w:tabs>
-        <w:ind w:left="4320" w:hanging="360"/>
-      </w:pPr>
-    </w:lvl>
-    <w:lvl w:ilvl="6" w:tentative="1">
-      <w:start w:val="1"/>
-      <w:numFmt w:val="decimal"/>
-      <w:lvlText w:val="%7."/>
-      <w:lvlJc w:val="left"/>
-      <w:pPr>
-        <w:tabs>
-          <w:tab w:val="num" w:pos="5040"/>
-        </w:tabs>
-        <w:ind w:left="5040" w:hanging="360"/>
-      </w:pPr>
-    </w:lvl>
-    <w:lvl w:ilvl="7" w:tentative="1">
-      <w:start w:val="1"/>
-      <w:numFmt w:val="decimal"/>
-      <w:lvlText w:val="%8."/>
-      <w:lvlJc w:val="left"/>
-      <w:pPr>
-        <w:tabs>
-          <w:tab w:val="num" w:pos="5760"/>
-        </w:tabs>
-        <w:ind w:left="5760" w:hanging="360"/>
-      </w:pPr>
-    </w:lvl>
-    <w:lvl w:ilvl="8" w:tentative="1">
-      <w:start w:val="1"/>
-      <w:numFmt w:val="decimal"/>
-      <w:lvlText w:val="%9."/>
-      <w:lvlJc w:val="left"/>
-      <w:pPr>
-        <w:tabs>
-          <w:tab w:val="num" w:pos="6480"/>
-        </w:tabs>
-        <w:ind w:left="6480" w:hanging="360"/>
-      </w:pPr>
-    </w:lvl>
-  </w:abstractNum>
-  <w:abstractNum w:abstractNumId="18" w15:restartNumberingAfterBreak="0">
-    <w:nsid w:val="69BA4B48"/>
-    <w:multiLevelType w:val="multilevel"/>
-    <w:tmpl w:val="A65C814A"/>
-    <w:lvl w:ilvl="0">
-      <w:start w:val="1"/>
-      <w:numFmt w:val="decimal"/>
-      <w:lvlText w:val="%1."/>
-      <w:lvlJc w:val="left"/>
-      <w:pPr>
-        <w:tabs>
-          <w:tab w:val="num" w:pos="720"/>
-        </w:tabs>
-        <w:ind w:left="720" w:hanging="360"/>
-      </w:pPr>
-    </w:lvl>
-    <w:lvl w:ilvl="1" w:tentative="1">
-      <w:start w:val="1"/>
-      <w:numFmt w:val="decimal"/>
-      <w:lvlText w:val="%2."/>
-      <w:lvlJc w:val="left"/>
-      <w:pPr>
-        <w:tabs>
-          <w:tab w:val="num" w:pos="1440"/>
-        </w:tabs>
-        <w:ind w:left="1440" w:hanging="360"/>
-      </w:pPr>
-    </w:lvl>
-    <w:lvl w:ilvl="2" w:tentative="1">
-      <w:start w:val="1"/>
-      <w:numFmt w:val="decimal"/>
-      <w:lvlText w:val="%3."/>
-      <w:lvlJc w:val="left"/>
-      <w:pPr>
-        <w:tabs>
-          <w:tab w:val="num" w:pos="2160"/>
-        </w:tabs>
-        <w:ind w:left="2160" w:hanging="360"/>
-      </w:pPr>
-    </w:lvl>
-    <w:lvl w:ilvl="3" w:tentative="1">
-      <w:start w:val="1"/>
-      <w:numFmt w:val="decimal"/>
-      <w:lvlText w:val="%4."/>
-      <w:lvlJc w:val="left"/>
-      <w:pPr>
-        <w:tabs>
-          <w:tab w:val="num" w:pos="2880"/>
-        </w:tabs>
-        <w:ind w:left="2880" w:hanging="360"/>
-      </w:pPr>
-    </w:lvl>
-    <w:lvl w:ilvl="4" w:tentative="1">
-      <w:start w:val="1"/>
-      <w:numFmt w:val="decimal"/>
-      <w:lvlText w:val="%5."/>
-      <w:lvlJc w:val="left"/>
-      <w:pPr>
-        <w:tabs>
-          <w:tab w:val="num" w:pos="3600"/>
-        </w:tabs>
-        <w:ind w:left="3600" w:hanging="360"/>
-      </w:pPr>
-    </w:lvl>
-    <w:lvl w:ilvl="5" w:tentative="1">
-      <w:start w:val="1"/>
-      <w:numFmt w:val="decimal"/>
-      <w:lvlText w:val="%6."/>
-      <w:lvlJc w:val="left"/>
-      <w:pPr>
-        <w:tabs>
-          <w:tab w:val="num" w:pos="4320"/>
-        </w:tabs>
-        <w:ind w:left="4320" w:hanging="360"/>
-      </w:pPr>
-    </w:lvl>
-    <w:lvl w:ilvl="6" w:tentative="1">
-      <w:start w:val="1"/>
-      <w:numFmt w:val="decimal"/>
-      <w:lvlText w:val="%7."/>
-      <w:lvlJc w:val="left"/>
-      <w:pPr>
-        <w:tabs>
-          <w:tab w:val="num" w:pos="5040"/>
-        </w:tabs>
-        <w:ind w:left="5040" w:hanging="360"/>
-      </w:pPr>
-    </w:lvl>
-    <w:lvl w:ilvl="7" w:tentative="1">
-      <w:start w:val="1"/>
-      <w:numFmt w:val="decimal"/>
-      <w:lvlText w:val="%8."/>
-      <w:lvlJc w:val="left"/>
-      <w:pPr>
-        <w:tabs>
-          <w:tab w:val="num" w:pos="5760"/>
-        </w:tabs>
-        <w:ind w:left="5760" w:hanging="360"/>
-      </w:pPr>
-    </w:lvl>
-    <w:lvl w:ilvl="8" w:tentative="1">
-      <w:start w:val="1"/>
-      <w:numFmt w:val="decimal"/>
-      <w:lvlText w:val="%9."/>
-      <w:lvlJc w:val="left"/>
-      <w:pPr>
-        <w:tabs>
-          <w:tab w:val="num" w:pos="6480"/>
-        </w:tabs>
-        <w:ind w:left="6480" w:hanging="360"/>
-      </w:pPr>
-    </w:lvl>
-  </w:abstractNum>
-  <w:abstractNum w:abstractNumId="19" w15:restartNumberingAfterBreak="0">
-    <w:nsid w:val="78B228CE"/>
-    <w:multiLevelType w:val="multilevel"/>
-    <w:tmpl w:val="57EE9812"/>
+    <w:tmpl w:val="3A3EB048"/>
     <w:lvl w:ilvl="0">
       <w:start w:val="1"/>
       <w:numFmt w:val="bullet"/>
@@ -13662,65 +13654,65 @@
       </w:rPr>
     </w:lvl>
   </w:abstractNum>
-  <w:num w:numId="1" w16cid:durableId="2080205508">
+  <w:num w:numId="1" w16cid:durableId="1805655120">
+    <w:abstractNumId w:val="12"/>
+  </w:num>
+  <w:num w:numId="2" w16cid:durableId="507907309">
+    <w:abstractNumId w:val="3"/>
+  </w:num>
+  <w:num w:numId="3" w16cid:durableId="321355158">
+    <w:abstractNumId w:val="6"/>
+  </w:num>
+  <w:num w:numId="4" w16cid:durableId="1350109398">
+    <w:abstractNumId w:val="14"/>
+  </w:num>
+  <w:num w:numId="5" w16cid:durableId="151991099">
+    <w:abstractNumId w:val="8"/>
+  </w:num>
+  <w:num w:numId="6" w16cid:durableId="916280725">
     <w:abstractNumId w:val="17"/>
   </w:num>
-  <w:num w:numId="2" w16cid:durableId="1830093086">
+  <w:num w:numId="7" w16cid:durableId="1692489109">
+    <w:abstractNumId w:val="4"/>
+  </w:num>
+  <w:num w:numId="8" w16cid:durableId="394012136">
+    <w:abstractNumId w:val="19"/>
+  </w:num>
+  <w:num w:numId="9" w16cid:durableId="2032028669">
+    <w:abstractNumId w:val="16"/>
+  </w:num>
+  <w:num w:numId="10" w16cid:durableId="1234896164">
+    <w:abstractNumId w:val="15"/>
+  </w:num>
+  <w:num w:numId="11" w16cid:durableId="494493248">
+    <w:abstractNumId w:val="18"/>
+  </w:num>
+  <w:num w:numId="12" w16cid:durableId="1420103187">
+    <w:abstractNumId w:val="5"/>
+  </w:num>
+  <w:num w:numId="13" w16cid:durableId="1534657829">
     <w:abstractNumId w:val="7"/>
   </w:num>
-  <w:num w:numId="3" w16cid:durableId="99957688">
-    <w:abstractNumId w:val="1"/>
+  <w:num w:numId="14" w16cid:durableId="1515724586">
+    <w:abstractNumId w:val="0"/>
   </w:num>
-  <w:num w:numId="4" w16cid:durableId="1941448979">
-    <w:abstractNumId w:val="12"/>
+  <w:num w:numId="15" w16cid:durableId="712851034">
+    <w:abstractNumId w:val="11"/>
   </w:num>
-  <w:num w:numId="5" w16cid:durableId="1063061057">
-    <w:abstractNumId w:val="18"/>
+  <w:num w:numId="16" w16cid:durableId="1118599236">
+    <w:abstractNumId w:val="9"/>
   </w:num>
-  <w:num w:numId="6" w16cid:durableId="1249460158">
+  <w:num w:numId="17" w16cid:durableId="1457914690">
     <w:abstractNumId w:val="2"/>
   </w:num>
-  <w:num w:numId="7" w16cid:durableId="1416972922">
-    <w:abstractNumId w:val="4"/>
-  </w:num>
-  <w:num w:numId="8" w16cid:durableId="788625630">
-    <w:abstractNumId w:val="19"/>
-  </w:num>
-  <w:num w:numId="9" w16cid:durableId="960573117">
-    <w:abstractNumId w:val="9"/>
-  </w:num>
-  <w:num w:numId="10" w16cid:durableId="948002732">
-    <w:abstractNumId w:val="16"/>
-  </w:num>
-  <w:num w:numId="11" w16cid:durableId="184831059">
-    <w:abstractNumId w:val="6"/>
-  </w:num>
-  <w:num w:numId="12" w16cid:durableId="12153">
-    <w:abstractNumId w:val="15"/>
-  </w:num>
-  <w:num w:numId="13" w16cid:durableId="1816331451">
-    <w:abstractNumId w:val="0"/>
-  </w:num>
-  <w:num w:numId="14" w16cid:durableId="1767921289">
-    <w:abstractNumId w:val="5"/>
-  </w:num>
-  <w:num w:numId="15" w16cid:durableId="1842352336">
-    <w:abstractNumId w:val="3"/>
-  </w:num>
-  <w:num w:numId="16" w16cid:durableId="1380745149">
+  <w:num w:numId="18" w16cid:durableId="1888372288">
     <w:abstractNumId w:val="10"/>
   </w:num>
-  <w:num w:numId="17" w16cid:durableId="488402568">
+  <w:num w:numId="19" w16cid:durableId="2032217537">
     <w:abstractNumId w:val="13"/>
   </w:num>
-  <w:num w:numId="18" w16cid:durableId="1545630255">
-    <w:abstractNumId w:val="8"/>
-  </w:num>
-  <w:num w:numId="19" w16cid:durableId="2080707564">
-    <w:abstractNumId w:val="14"/>
-  </w:num>
-  <w:num w:numId="20" w16cid:durableId="1722171096">
-    <w:abstractNumId w:val="11"/>
+  <w:num w:numId="20" w16cid:durableId="1591425865">
+    <w:abstractNumId w:val="1"/>
   </w:num>
 </w:numbering>
 </file>

</xml_diff>

<commit_message>
Drift-dok: SPF-oprydning cbcit.dk + spf.cbcit.dk-makro udfoert via CF DNS API (audit-fund 7 trin 1+2, 29/10)
Co-Authored-By: Claude Fable 5.1 <noreply@anthropic.com>
</commit_message>
<xml_diff>
--- a/drift/07-break-glass-adgang.docx
+++ b/drift/07-break-glass-adgang.docx
@@ -231,7 +231,7 @@
       <w:pPr>
         <w:pStyle w:val="NormalWeb"/>
         <w:shd w:val="clear" w:color="auto" w:fill="F7FBFA"/>
-        <w:divId w:val="154685130"/>
+        <w:divId w:val="2057511054"/>
         <w:rPr>
           <w:rFonts w:ascii="Calibri" w:hAnsi="Calibri" w:cs="Calibri"/>
           <w:sz w:val="21"/>
@@ -301,7 +301,7 @@
       <w:pPr>
         <w:pStyle w:val="NormalWeb"/>
         <w:shd w:val="clear" w:color="auto" w:fill="F7FBFA"/>
-        <w:divId w:val="154685130"/>
+        <w:divId w:val="2057511054"/>
         <w:rPr>
           <w:rFonts w:ascii="Calibri" w:hAnsi="Calibri" w:cs="Calibri"/>
           <w:sz w:val="21"/>
@@ -381,7 +381,7 @@
           <w:sz w:val="21"/>
           <w:szCs w:val="21"/>
         </w:rPr>
-        <w:pict w14:anchorId="42DDBC8E">
+        <w:pict w14:anchorId="2197D240">
           <v:rect id="_x0000_i1025" style="width:0;height:1.5pt" o:hralign="center" o:hrstd="t" o:hr="t" fillcolor="#a0a0a0" stroked="f"/>
         </w:pict>
       </w:r>
@@ -714,7 +714,7 @@
           <w:sz w:val="21"/>
           <w:szCs w:val="21"/>
         </w:rPr>
-        <w:pict w14:anchorId="4F977BBC">
+        <w:pict w14:anchorId="586995C6">
           <v:rect id="_x0000_i1026" style="width:0;height:1.5pt" o:hralign="center" o:hrstd="t" o:hr="t" fillcolor="#a0a0a0" stroked="f"/>
         </w:pict>
       </w:r>
@@ -2290,7 +2290,7 @@
           <w:sz w:val="21"/>
           <w:szCs w:val="21"/>
         </w:rPr>
-        <w:pict w14:anchorId="0172C793">
+        <w:pict w14:anchorId="65A3B36E">
           <v:rect id="_x0000_i1027" style="width:0;height:1.5pt" o:hralign="center" o:hrstd="t" o:hr="t" fillcolor="#a0a0a0" stroked="f"/>
         </w:pict>
       </w:r>
@@ -3297,7 +3297,7 @@
           <w:sz w:val="21"/>
           <w:szCs w:val="21"/>
         </w:rPr>
-        <w:pict w14:anchorId="2B5EF193">
+        <w:pict w14:anchorId="54276F62">
           <v:rect id="_x0000_i1028" style="width:0;height:1.5pt" o:hralign="center" o:hrstd="t" o:hr="t" fillcolor="#a0a0a0" stroked="f"/>
         </w:pict>
       </w:r>
@@ -3629,7 +3629,7 @@
           <w:sz w:val="21"/>
           <w:szCs w:val="21"/>
         </w:rPr>
-        <w:pict w14:anchorId="74665D75">
+        <w:pict w14:anchorId="07E8D613">
           <v:rect id="_x0000_i1029" style="width:0;height:1.5pt" o:hralign="center" o:hrstd="t" o:hr="t" fillcolor="#a0a0a0" stroked="f"/>
         </w:pict>
       </w:r>
@@ -3944,7 +3944,7 @@
           <w:sz w:val="21"/>
           <w:szCs w:val="21"/>
         </w:rPr>
-        <w:pict w14:anchorId="161C3AAB">
+        <w:pict w14:anchorId="0A6957B8">
           <v:rect id="_x0000_i1030" style="width:0;height:1.5pt" o:hralign="center" o:hrstd="t" o:hr="t" fillcolor="#a0a0a0" stroked="f"/>
         </w:pict>
       </w:r>
@@ -5643,7 +5643,7 @@
           <w:sz w:val="21"/>
           <w:szCs w:val="21"/>
         </w:rPr>
-        <w:pict w14:anchorId="5403763B">
+        <w:pict w14:anchorId="0656E5E5">
           <v:rect id="_x0000_i1031" style="width:0;height:1.5pt" o:hralign="center" o:hrstd="t" o:hr="t" fillcolor="#a0a0a0" stroked="f"/>
         </w:pict>
       </w:r>
@@ -7150,7 +7150,7 @@
           <w:sz w:val="21"/>
           <w:szCs w:val="21"/>
         </w:rPr>
-        <w:pict w14:anchorId="23DB938C">
+        <w:pict w14:anchorId="4EBE3092">
           <v:rect id="_x0000_i1032" style="width:0;height:1.5pt" o:hralign="center" o:hrstd="t" o:hr="t" fillcolor="#a0a0a0" stroked="f"/>
         </w:pict>
       </w:r>
@@ -7690,7 +7690,7 @@
           <w:sz w:val="21"/>
           <w:szCs w:val="21"/>
         </w:rPr>
-        <w:pict w14:anchorId="39B81ABB">
+        <w:pict w14:anchorId="715A3B96">
           <v:rect id="_x0000_i1033" style="width:0;height:1.5pt" o:hralign="center" o:hrstd="t" o:hr="t" fillcolor="#a0a0a0" stroked="f"/>
         </w:pict>
       </w:r>
@@ -7930,7 +7930,7 @@
       <w:pPr>
         <w:pStyle w:val="NormalWeb"/>
         <w:shd w:val="clear" w:color="auto" w:fill="F7FBFA"/>
-        <w:divId w:val="1020476608"/>
+        <w:divId w:val="489752449"/>
         <w:rPr>
           <w:rFonts w:ascii="Calibri" w:hAnsi="Calibri" w:cs="Calibri"/>
           <w:sz w:val="21"/>
@@ -8383,7 +8383,7 @@
           <w:sz w:val="21"/>
           <w:szCs w:val="21"/>
         </w:rPr>
-        <w:pict w14:anchorId="66E64C9A">
+        <w:pict w14:anchorId="2DACCE92">
           <v:rect id="_x0000_i1034" style="width:0;height:1.5pt" o:hralign="center" o:hrstd="t" o:hr="t" fillcolor="#a0a0a0" stroked="f"/>
         </w:pict>
       </w:r>
@@ -9295,7 +9295,7 @@
           <w:sz w:val="21"/>
           <w:szCs w:val="21"/>
         </w:rPr>
-        <w:pict w14:anchorId="2C159387">
+        <w:pict w14:anchorId="597D923A">
           <v:rect id="_x0000_i1035" style="width:0;height:1.5pt" o:hralign="center" o:hrstd="t" o:hr="t" fillcolor="#a0a0a0" stroked="f"/>
         </w:pict>
       </w:r>
@@ -9925,7 +9925,24 @@
           <w:sz w:val="21"/>
           <w:szCs w:val="21"/>
         </w:rPr>
-        <w:t xml:space="preserve"> gennemføres af de enkelte admins inden fristerne (kravet er sat på alle tre sites) · datagaarden-ansatte nedgraderes fra administrator til editor (Datagaardens egen admin) · mail-DNS (SPF-oprydning cbcit.dk, DMARC → quarantine, DMARC + Brevo-DKIM for datagaarden.dk) · fjern TeamViewerQS.exe fra datagaarden.dk/Support · slet </w:t>
+        <w:t xml:space="preserve"> gennemføres af de enkelte admins inden fristerne (kravet er sat på alle tre sites) · datagaarden-ansatte nedgraderes fra administrator til editor (Datagaardens egen admin) · mail-DNS (SPF-oprydning cbcit.dk </w:t>
+      </w:r>
+      <w:r>
+        <w:rPr>
+          <w:rStyle w:val="Strk"/>
+          <w:rFonts w:ascii="Calibri" w:eastAsia="Times New Roman" w:hAnsi="Calibri" w:cs="Calibri"/>
+          <w:sz w:val="21"/>
+          <w:szCs w:val="21"/>
+        </w:rPr>
+        <w:t>udført 29/10</w:t>
+      </w:r>
+      <w:r>
+        <w:rPr>
+          <w:rFonts w:ascii="Calibri" w:eastAsia="Times New Roman" w:hAnsi="Calibri" w:cs="Calibri"/>
+          <w:sz w:val="21"/>
+          <w:szCs w:val="21"/>
+        </w:rPr>
+        <w:t xml:space="preserve">; udestår DMARC → quarantine efter header-test, DMARC + Brevo-DKIM for datagaarden.dk hos wwi/Brevo) · fjern TeamViewerQS.exe fra datagaarden.dk/Support · slet </w:t>
       </w:r>
       <w:r>
         <w:rPr>
@@ -9939,24 +9956,38 @@
           <w:sz w:val="21"/>
           <w:szCs w:val="21"/>
         </w:rPr>
-        <w:t>-dropboxen efter 2027-01-01 · ekstern uptime-/dead-man-monitor · OneDrive-backup + snapshot-rutine er personbundne (Johans M365-konto og PC).</w:t>
-      </w:r>
-    </w:p>
-    <w:p>
-      <w:pPr>
-        <w:rPr>
-          <w:rFonts w:ascii="Calibri" w:eastAsia="Times New Roman" w:hAnsi="Calibri" w:cs="Calibri"/>
-          <w:sz w:val="21"/>
-          <w:szCs w:val="21"/>
-        </w:rPr>
-      </w:pPr>
-      <w:r>
-        <w:rPr>
-          <w:rFonts w:ascii="Calibri" w:eastAsia="Times New Roman" w:hAnsi="Calibri" w:cs="Calibri"/>
-          <w:sz w:val="21"/>
-          <w:szCs w:val="21"/>
-        </w:rPr>
-        <w:pict w14:anchorId="52C964E1">
+        <w:t xml:space="preserve">-dropboxen OG fjern </w:t>
+      </w:r>
+      <w:r>
+        <w:rPr>
+          <w:rStyle w:val="HTML-kode"/>
+        </w:rPr>
+        <w:t>a:spf1.kobalt.dk</w:t>
+      </w:r>
+      <w:r>
+        <w:rPr>
+          <w:rFonts w:ascii="Calibri" w:eastAsia="Times New Roman" w:hAnsi="Calibri" w:cs="Calibri"/>
+          <w:sz w:val="21"/>
+          <w:szCs w:val="21"/>
+        </w:rPr>
+        <w:t xml:space="preserve"> fra begge SPF-records efter 2027-01-01 · ekstern uptime-/dead-man-monitor · OneDrive-backup + snapshot-rutine er personbundne (Johans M365-konto og PC).</w:t>
+      </w:r>
+    </w:p>
+    <w:p>
+      <w:pPr>
+        <w:rPr>
+          <w:rFonts w:ascii="Calibri" w:eastAsia="Times New Roman" w:hAnsi="Calibri" w:cs="Calibri"/>
+          <w:sz w:val="21"/>
+          <w:szCs w:val="21"/>
+        </w:rPr>
+      </w:pPr>
+      <w:r>
+        <w:rPr>
+          <w:rFonts w:ascii="Calibri" w:eastAsia="Times New Roman" w:hAnsi="Calibri" w:cs="Calibri"/>
+          <w:sz w:val="21"/>
+          <w:szCs w:val="21"/>
+        </w:rPr>
+        <w:pict w14:anchorId="415F9715">
           <v:rect id="_x0000_i1036" style="width:0;height:1.5pt" o:hralign="center" o:hrstd="t" o:hr="t" fillcolor="#a0a0a0" stroked="f"/>
         </w:pict>
       </w:r>
@@ -10214,7 +10245,7 @@
       <w:pPr>
         <w:pStyle w:val="NormalWeb"/>
         <w:shd w:val="clear" w:color="auto" w:fill="F7FBFA"/>
-        <w:divId w:val="22560836"/>
+        <w:divId w:val="116148416"/>
         <w:rPr>
           <w:rFonts w:ascii="Calibri" w:hAnsi="Calibri" w:cs="Calibri"/>
           <w:sz w:val="21"/>
@@ -10244,7 +10275,7 @@
           <w:sz w:val="21"/>
           <w:szCs w:val="21"/>
         </w:rPr>
-        <w:pict w14:anchorId="132FE67B">
+        <w:pict w14:anchorId="0B33DC92">
           <v:rect id="_x0000_i1037" style="width:0;height:1.5pt" o:hralign="center" o:hrstd="t" o:hr="t" fillcolor="#a0a0a0" stroked="f"/>
         </w:pict>
       </w:r>
@@ -10810,7 +10841,7 @@
           <w:sz w:val="21"/>
           <w:szCs w:val="21"/>
         </w:rPr>
-        <w:pict w14:anchorId="2FA9AEE3">
+        <w:pict w14:anchorId="5FA17BA5">
           <v:rect id="_x0000_i1038" style="width:0;height:1.5pt" o:hralign="center" o:hrstd="t" o:hr="t" fillcolor="#a0a0a0" stroked="f"/>
         </w:pict>
       </w:r>
@@ -10855,9 +10886,122 @@
 <file path=word/numbering.xml><?xml version="1.0" encoding="utf-8"?>
 <w:numbering xmlns:wpc="http://schemas.microsoft.com/office/word/2010/wordprocessingCanvas" xmlns:cx="http://schemas.microsoft.com/office/drawing/2014/chartex" xmlns:cx1="http://schemas.microsoft.com/office/drawing/2015/9/8/chartex" xmlns:cx2="http://schemas.microsoft.com/office/drawing/2015/10/21/chartex" xmlns:cx3="http://schemas.microsoft.com/office/drawing/2016/5/9/chartex" xmlns:cx4="http://schemas.microsoft.com/office/drawing/2016/5/10/chartex" xmlns:cx5="http://schemas.microsoft.com/office/drawing/2016/5/11/chartex" xmlns:cx6="http://schemas.microsoft.com/office/drawing/2016/5/12/chartex" xmlns:cx7="http://schemas.microsoft.com/office/drawing/2016/5/13/chartex" xmlns:cx8="http://schemas.microsoft.com/office/drawing/2016/5/14/chartex" xmlns:mc="http://schemas.openxmlformats.org/markup-compatibility/2006" xmlns:aink="http://schemas.microsoft.com/office/drawing/2016/ink" xmlns:am3d="http://schemas.microsoft.com/office/drawing/2017/model3d" xmlns:o="urn:schemas-microsoft-com:office:office" xmlns:oel="http://schemas.microsoft.com/office/2019/extlst" xmlns:r="http://schemas.openxmlformats.org/officeDocument/2006/relationships" xmlns:m="http://schemas.openxmlformats.org/officeDocument/2006/math" xmlns:v="urn:schemas-microsoft-com:vml" xmlns:wp14="http://schemas.microsoft.com/office/word/2010/wordprocessingDrawing" xmlns:wp="http://schemas.openxmlformats.org/drawingml/2006/wordprocessingDrawing" xmlns:w10="urn:schemas-microsoft-com:office:word" xmlns:w="http://schemas.openxmlformats.org/wordprocessingml/2006/main" xmlns:w14="http://schemas.microsoft.com/office/word/2010/wordml" xmlns:w15="http://schemas.microsoft.com/office/word/2012/wordml" xmlns:w16cex="http://schemas.microsoft.com/office/word/2018/wordml/cex" xmlns:w16cid="http://schemas.microsoft.com/office/word/2016/wordml/cid" xmlns:w16="http://schemas.microsoft.com/office/word/2018/wordml" xmlns:w16du="http://schemas.microsoft.com/office/word/2023/wordml/word16du" xmlns:w16sdtdh="http://schemas.microsoft.com/office/word/2020/wordml/sdtdatahash" xmlns:w16sdtfl="http://schemas.microsoft.com/office/word/2024/wordml/sdtformatlock" xmlns:w16se="http://schemas.microsoft.com/office/word/2015/wordml/symex" xmlns:wpg="http://schemas.microsoft.com/office/word/2010/wordprocessingGroup" xmlns:wpi="http://schemas.microsoft.com/office/word/2010/wordprocessingInk" xmlns:wne="http://schemas.microsoft.com/office/word/2006/wordml" xmlns:wps="http://schemas.microsoft.com/office/word/2010/wordprocessingShape" mc:Ignorable="w14 w15 w16se w16cid w16 w16cex w16sdtdh w16sdtfl w16du wp14">
   <w:abstractNum w:abstractNumId="0" w15:restartNumberingAfterBreak="0">
-    <w:nsid w:val="005852EC"/>
+    <w:nsid w:val="06187107"/>
     <w:multiLevelType w:val="multilevel"/>
-    <w:tmpl w:val="F11C5F26"/>
+    <w:tmpl w:val="67E2DA2A"/>
+    <w:lvl w:ilvl="0">
+      <w:start w:val="1"/>
+      <w:numFmt w:val="decimal"/>
+      <w:lvlText w:val="%1."/>
+      <w:lvlJc w:val="left"/>
+      <w:pPr>
+        <w:tabs>
+          <w:tab w:val="num" w:pos="720"/>
+        </w:tabs>
+        <w:ind w:left="720" w:hanging="360"/>
+      </w:pPr>
+    </w:lvl>
+    <w:lvl w:ilvl="1" w:tentative="1">
+      <w:start w:val="1"/>
+      <w:numFmt w:val="decimal"/>
+      <w:lvlText w:val="%2."/>
+      <w:lvlJc w:val="left"/>
+      <w:pPr>
+        <w:tabs>
+          <w:tab w:val="num" w:pos="1440"/>
+        </w:tabs>
+        <w:ind w:left="1440" w:hanging="360"/>
+      </w:pPr>
+    </w:lvl>
+    <w:lvl w:ilvl="2" w:tentative="1">
+      <w:start w:val="1"/>
+      <w:numFmt w:val="decimal"/>
+      <w:lvlText w:val="%3."/>
+      <w:lvlJc w:val="left"/>
+      <w:pPr>
+        <w:tabs>
+          <w:tab w:val="num" w:pos="2160"/>
+        </w:tabs>
+        <w:ind w:left="2160" w:hanging="360"/>
+      </w:pPr>
+    </w:lvl>
+    <w:lvl w:ilvl="3" w:tentative="1">
+      <w:start w:val="1"/>
+      <w:numFmt w:val="decimal"/>
+      <w:lvlText w:val="%4."/>
+      <w:lvlJc w:val="left"/>
+      <w:pPr>
+        <w:tabs>
+          <w:tab w:val="num" w:pos="2880"/>
+        </w:tabs>
+        <w:ind w:left="2880" w:hanging="360"/>
+      </w:pPr>
+    </w:lvl>
+    <w:lvl w:ilvl="4" w:tentative="1">
+      <w:start w:val="1"/>
+      <w:numFmt w:val="decimal"/>
+      <w:lvlText w:val="%5."/>
+      <w:lvlJc w:val="left"/>
+      <w:pPr>
+        <w:tabs>
+          <w:tab w:val="num" w:pos="3600"/>
+        </w:tabs>
+        <w:ind w:left="3600" w:hanging="360"/>
+      </w:pPr>
+    </w:lvl>
+    <w:lvl w:ilvl="5" w:tentative="1">
+      <w:start w:val="1"/>
+      <w:numFmt w:val="decimal"/>
+      <w:lvlText w:val="%6."/>
+      <w:lvlJc w:val="left"/>
+      <w:pPr>
+        <w:tabs>
+          <w:tab w:val="num" w:pos="4320"/>
+        </w:tabs>
+        <w:ind w:left="4320" w:hanging="360"/>
+      </w:pPr>
+    </w:lvl>
+    <w:lvl w:ilvl="6" w:tentative="1">
+      <w:start w:val="1"/>
+      <w:numFmt w:val="decimal"/>
+      <w:lvlText w:val="%7."/>
+      <w:lvlJc w:val="left"/>
+      <w:pPr>
+        <w:tabs>
+          <w:tab w:val="num" w:pos="5040"/>
+        </w:tabs>
+        <w:ind w:left="5040" w:hanging="360"/>
+      </w:pPr>
+    </w:lvl>
+    <w:lvl w:ilvl="7" w:tentative="1">
+      <w:start w:val="1"/>
+      <w:numFmt w:val="decimal"/>
+      <w:lvlText w:val="%8."/>
+      <w:lvlJc w:val="left"/>
+      <w:pPr>
+        <w:tabs>
+          <w:tab w:val="num" w:pos="5760"/>
+        </w:tabs>
+        <w:ind w:left="5760" w:hanging="360"/>
+      </w:pPr>
+    </w:lvl>
+    <w:lvl w:ilvl="8" w:tentative="1">
+      <w:start w:val="1"/>
+      <w:numFmt w:val="decimal"/>
+      <w:lvlText w:val="%9."/>
+      <w:lvlJc w:val="left"/>
+      <w:pPr>
+        <w:tabs>
+          <w:tab w:val="num" w:pos="6480"/>
+        </w:tabs>
+        <w:ind w:left="6480" w:hanging="360"/>
+      </w:pPr>
+    </w:lvl>
+  </w:abstractNum>
+  <w:abstractNum w:abstractNumId="1" w15:restartNumberingAfterBreak="0">
+    <w:nsid w:val="0925034D"/>
+    <w:multiLevelType w:val="multilevel"/>
+    <w:tmpl w:val="960256EE"/>
     <w:lvl w:ilvl="0">
       <w:start w:val="1"/>
       <w:numFmt w:val="bullet"/>
@@ -11003,10 +11147,10 @@
       </w:rPr>
     </w:lvl>
   </w:abstractNum>
-  <w:abstractNum w:abstractNumId="1" w15:restartNumberingAfterBreak="0">
-    <w:nsid w:val="089A1BDB"/>
+  <w:abstractNum w:abstractNumId="2" w15:restartNumberingAfterBreak="0">
+    <w:nsid w:val="0F2F4127"/>
     <w:multiLevelType w:val="multilevel"/>
-    <w:tmpl w:val="C916CAD4"/>
+    <w:tmpl w:val="72BC04FA"/>
     <w:lvl w:ilvl="0">
       <w:start w:val="1"/>
       <w:numFmt w:val="bullet"/>
@@ -11152,123 +11296,10 @@
       </w:rPr>
     </w:lvl>
   </w:abstractNum>
-  <w:abstractNum w:abstractNumId="2" w15:restartNumberingAfterBreak="0">
-    <w:nsid w:val="0A0512C2"/>
+  <w:abstractNum w:abstractNumId="3" w15:restartNumberingAfterBreak="0">
+    <w:nsid w:val="13ED166A"/>
     <w:multiLevelType w:val="multilevel"/>
-    <w:tmpl w:val="846458B0"/>
-    <w:lvl w:ilvl="0">
-      <w:start w:val="1"/>
-      <w:numFmt w:val="decimal"/>
-      <w:lvlText w:val="%1."/>
-      <w:lvlJc w:val="left"/>
-      <w:pPr>
-        <w:tabs>
-          <w:tab w:val="num" w:pos="720"/>
-        </w:tabs>
-        <w:ind w:left="720" w:hanging="360"/>
-      </w:pPr>
-    </w:lvl>
-    <w:lvl w:ilvl="1" w:tentative="1">
-      <w:start w:val="1"/>
-      <w:numFmt w:val="decimal"/>
-      <w:lvlText w:val="%2."/>
-      <w:lvlJc w:val="left"/>
-      <w:pPr>
-        <w:tabs>
-          <w:tab w:val="num" w:pos="1440"/>
-        </w:tabs>
-        <w:ind w:left="1440" w:hanging="360"/>
-      </w:pPr>
-    </w:lvl>
-    <w:lvl w:ilvl="2" w:tentative="1">
-      <w:start w:val="1"/>
-      <w:numFmt w:val="decimal"/>
-      <w:lvlText w:val="%3."/>
-      <w:lvlJc w:val="left"/>
-      <w:pPr>
-        <w:tabs>
-          <w:tab w:val="num" w:pos="2160"/>
-        </w:tabs>
-        <w:ind w:left="2160" w:hanging="360"/>
-      </w:pPr>
-    </w:lvl>
-    <w:lvl w:ilvl="3" w:tentative="1">
-      <w:start w:val="1"/>
-      <w:numFmt w:val="decimal"/>
-      <w:lvlText w:val="%4."/>
-      <w:lvlJc w:val="left"/>
-      <w:pPr>
-        <w:tabs>
-          <w:tab w:val="num" w:pos="2880"/>
-        </w:tabs>
-        <w:ind w:left="2880" w:hanging="360"/>
-      </w:pPr>
-    </w:lvl>
-    <w:lvl w:ilvl="4" w:tentative="1">
-      <w:start w:val="1"/>
-      <w:numFmt w:val="decimal"/>
-      <w:lvlText w:val="%5."/>
-      <w:lvlJc w:val="left"/>
-      <w:pPr>
-        <w:tabs>
-          <w:tab w:val="num" w:pos="3600"/>
-        </w:tabs>
-        <w:ind w:left="3600" w:hanging="360"/>
-      </w:pPr>
-    </w:lvl>
-    <w:lvl w:ilvl="5" w:tentative="1">
-      <w:start w:val="1"/>
-      <w:numFmt w:val="decimal"/>
-      <w:lvlText w:val="%6."/>
-      <w:lvlJc w:val="left"/>
-      <w:pPr>
-        <w:tabs>
-          <w:tab w:val="num" w:pos="4320"/>
-        </w:tabs>
-        <w:ind w:left="4320" w:hanging="360"/>
-      </w:pPr>
-    </w:lvl>
-    <w:lvl w:ilvl="6" w:tentative="1">
-      <w:start w:val="1"/>
-      <w:numFmt w:val="decimal"/>
-      <w:lvlText w:val="%7."/>
-      <w:lvlJc w:val="left"/>
-      <w:pPr>
-        <w:tabs>
-          <w:tab w:val="num" w:pos="5040"/>
-        </w:tabs>
-        <w:ind w:left="5040" w:hanging="360"/>
-      </w:pPr>
-    </w:lvl>
-    <w:lvl w:ilvl="7" w:tentative="1">
-      <w:start w:val="1"/>
-      <w:numFmt w:val="decimal"/>
-      <w:lvlText w:val="%8."/>
-      <w:lvlJc w:val="left"/>
-      <w:pPr>
-        <w:tabs>
-          <w:tab w:val="num" w:pos="5760"/>
-        </w:tabs>
-        <w:ind w:left="5760" w:hanging="360"/>
-      </w:pPr>
-    </w:lvl>
-    <w:lvl w:ilvl="8" w:tentative="1">
-      <w:start w:val="1"/>
-      <w:numFmt w:val="decimal"/>
-      <w:lvlText w:val="%9."/>
-      <w:lvlJc w:val="left"/>
-      <w:pPr>
-        <w:tabs>
-          <w:tab w:val="num" w:pos="6480"/>
-        </w:tabs>
-        <w:ind w:left="6480" w:hanging="360"/>
-      </w:pPr>
-    </w:lvl>
-  </w:abstractNum>
-  <w:abstractNum w:abstractNumId="3" w15:restartNumberingAfterBreak="0">
-    <w:nsid w:val="0A453C8E"/>
-    <w:multiLevelType w:val="multilevel"/>
-    <w:tmpl w:val="A5C05E4E"/>
+    <w:tmpl w:val="18585374"/>
     <w:lvl w:ilvl="0">
       <w:start w:val="1"/>
       <w:numFmt w:val="bullet"/>
@@ -11415,9 +11446,122 @@
     </w:lvl>
   </w:abstractNum>
   <w:abstractNum w:abstractNumId="4" w15:restartNumberingAfterBreak="0">
-    <w:nsid w:val="0AD65655"/>
+    <w:nsid w:val="15EA5BAA"/>
     <w:multiLevelType w:val="multilevel"/>
-    <w:tmpl w:val="8A0EE042"/>
+    <w:tmpl w:val="A33CA8AE"/>
+    <w:lvl w:ilvl="0">
+      <w:start w:val="1"/>
+      <w:numFmt w:val="decimal"/>
+      <w:lvlText w:val="%1."/>
+      <w:lvlJc w:val="left"/>
+      <w:pPr>
+        <w:tabs>
+          <w:tab w:val="num" w:pos="720"/>
+        </w:tabs>
+        <w:ind w:left="720" w:hanging="360"/>
+      </w:pPr>
+    </w:lvl>
+    <w:lvl w:ilvl="1" w:tentative="1">
+      <w:start w:val="1"/>
+      <w:numFmt w:val="decimal"/>
+      <w:lvlText w:val="%2."/>
+      <w:lvlJc w:val="left"/>
+      <w:pPr>
+        <w:tabs>
+          <w:tab w:val="num" w:pos="1440"/>
+        </w:tabs>
+        <w:ind w:left="1440" w:hanging="360"/>
+      </w:pPr>
+    </w:lvl>
+    <w:lvl w:ilvl="2" w:tentative="1">
+      <w:start w:val="1"/>
+      <w:numFmt w:val="decimal"/>
+      <w:lvlText w:val="%3."/>
+      <w:lvlJc w:val="left"/>
+      <w:pPr>
+        <w:tabs>
+          <w:tab w:val="num" w:pos="2160"/>
+        </w:tabs>
+        <w:ind w:left="2160" w:hanging="360"/>
+      </w:pPr>
+    </w:lvl>
+    <w:lvl w:ilvl="3" w:tentative="1">
+      <w:start w:val="1"/>
+      <w:numFmt w:val="decimal"/>
+      <w:lvlText w:val="%4."/>
+      <w:lvlJc w:val="left"/>
+      <w:pPr>
+        <w:tabs>
+          <w:tab w:val="num" w:pos="2880"/>
+        </w:tabs>
+        <w:ind w:left="2880" w:hanging="360"/>
+      </w:pPr>
+    </w:lvl>
+    <w:lvl w:ilvl="4" w:tentative="1">
+      <w:start w:val="1"/>
+      <w:numFmt w:val="decimal"/>
+      <w:lvlText w:val="%5."/>
+      <w:lvlJc w:val="left"/>
+      <w:pPr>
+        <w:tabs>
+          <w:tab w:val="num" w:pos="3600"/>
+        </w:tabs>
+        <w:ind w:left="3600" w:hanging="360"/>
+      </w:pPr>
+    </w:lvl>
+    <w:lvl w:ilvl="5" w:tentative="1">
+      <w:start w:val="1"/>
+      <w:numFmt w:val="decimal"/>
+      <w:lvlText w:val="%6."/>
+      <w:lvlJc w:val="left"/>
+      <w:pPr>
+        <w:tabs>
+          <w:tab w:val="num" w:pos="4320"/>
+        </w:tabs>
+        <w:ind w:left="4320" w:hanging="360"/>
+      </w:pPr>
+    </w:lvl>
+    <w:lvl w:ilvl="6" w:tentative="1">
+      <w:start w:val="1"/>
+      <w:numFmt w:val="decimal"/>
+      <w:lvlText w:val="%7."/>
+      <w:lvlJc w:val="left"/>
+      <w:pPr>
+        <w:tabs>
+          <w:tab w:val="num" w:pos="5040"/>
+        </w:tabs>
+        <w:ind w:left="5040" w:hanging="360"/>
+      </w:pPr>
+    </w:lvl>
+    <w:lvl w:ilvl="7" w:tentative="1">
+      <w:start w:val="1"/>
+      <w:numFmt w:val="decimal"/>
+      <w:lvlText w:val="%8."/>
+      <w:lvlJc w:val="left"/>
+      <w:pPr>
+        <w:tabs>
+          <w:tab w:val="num" w:pos="5760"/>
+        </w:tabs>
+        <w:ind w:left="5760" w:hanging="360"/>
+      </w:pPr>
+    </w:lvl>
+    <w:lvl w:ilvl="8" w:tentative="1">
+      <w:start w:val="1"/>
+      <w:numFmt w:val="decimal"/>
+      <w:lvlText w:val="%9."/>
+      <w:lvlJc w:val="left"/>
+      <w:pPr>
+        <w:tabs>
+          <w:tab w:val="num" w:pos="6480"/>
+        </w:tabs>
+        <w:ind w:left="6480" w:hanging="360"/>
+      </w:pPr>
+    </w:lvl>
+  </w:abstractNum>
+  <w:abstractNum w:abstractNumId="5" w15:restartNumberingAfterBreak="0">
+    <w:nsid w:val="1C3600F0"/>
+    <w:multiLevelType w:val="multilevel"/>
+    <w:tmpl w:val="712E5FD8"/>
     <w:lvl w:ilvl="0">
       <w:start w:val="1"/>
       <w:numFmt w:val="bullet"/>
@@ -11563,10 +11707,10 @@
       </w:rPr>
     </w:lvl>
   </w:abstractNum>
-  <w:abstractNum w:abstractNumId="5" w15:restartNumberingAfterBreak="0">
-    <w:nsid w:val="0C943295"/>
+  <w:abstractNum w:abstractNumId="6" w15:restartNumberingAfterBreak="0">
+    <w:nsid w:val="35525AE9"/>
     <w:multiLevelType w:val="multilevel"/>
-    <w:tmpl w:val="6BC03DC2"/>
+    <w:tmpl w:val="C51C412A"/>
     <w:lvl w:ilvl="0">
       <w:start w:val="1"/>
       <w:numFmt w:val="bullet"/>
@@ -11712,10 +11856,10 @@
       </w:rPr>
     </w:lvl>
   </w:abstractNum>
-  <w:abstractNum w:abstractNumId="6" w15:restartNumberingAfterBreak="0">
-    <w:nsid w:val="146B7153"/>
+  <w:abstractNum w:abstractNumId="7" w15:restartNumberingAfterBreak="0">
+    <w:nsid w:val="3E32539A"/>
     <w:multiLevelType w:val="multilevel"/>
-    <w:tmpl w:val="BE682DC4"/>
+    <w:tmpl w:val="FA589A0A"/>
     <w:lvl w:ilvl="0">
       <w:start w:val="1"/>
       <w:numFmt w:val="bullet"/>
@@ -11861,10 +12005,123 @@
       </w:rPr>
     </w:lvl>
   </w:abstractNum>
-  <w:abstractNum w:abstractNumId="7" w15:restartNumberingAfterBreak="0">
-    <w:nsid w:val="19601C45"/>
+  <w:abstractNum w:abstractNumId="8" w15:restartNumberingAfterBreak="0">
+    <w:nsid w:val="447A3E31"/>
     <w:multiLevelType w:val="multilevel"/>
-    <w:tmpl w:val="861A15E8"/>
+    <w:tmpl w:val="2C46F106"/>
+    <w:lvl w:ilvl="0">
+      <w:start w:val="1"/>
+      <w:numFmt w:val="decimal"/>
+      <w:lvlText w:val="%1."/>
+      <w:lvlJc w:val="left"/>
+      <w:pPr>
+        <w:tabs>
+          <w:tab w:val="num" w:pos="720"/>
+        </w:tabs>
+        <w:ind w:left="720" w:hanging="360"/>
+      </w:pPr>
+    </w:lvl>
+    <w:lvl w:ilvl="1" w:tentative="1">
+      <w:start w:val="1"/>
+      <w:numFmt w:val="decimal"/>
+      <w:lvlText w:val="%2."/>
+      <w:lvlJc w:val="left"/>
+      <w:pPr>
+        <w:tabs>
+          <w:tab w:val="num" w:pos="1440"/>
+        </w:tabs>
+        <w:ind w:left="1440" w:hanging="360"/>
+      </w:pPr>
+    </w:lvl>
+    <w:lvl w:ilvl="2" w:tentative="1">
+      <w:start w:val="1"/>
+      <w:numFmt w:val="decimal"/>
+      <w:lvlText w:val="%3."/>
+      <w:lvlJc w:val="left"/>
+      <w:pPr>
+        <w:tabs>
+          <w:tab w:val="num" w:pos="2160"/>
+        </w:tabs>
+        <w:ind w:left="2160" w:hanging="360"/>
+      </w:pPr>
+    </w:lvl>
+    <w:lvl w:ilvl="3" w:tentative="1">
+      <w:start w:val="1"/>
+      <w:numFmt w:val="decimal"/>
+      <w:lvlText w:val="%4."/>
+      <w:lvlJc w:val="left"/>
+      <w:pPr>
+        <w:tabs>
+          <w:tab w:val="num" w:pos="2880"/>
+        </w:tabs>
+        <w:ind w:left="2880" w:hanging="360"/>
+      </w:pPr>
+    </w:lvl>
+    <w:lvl w:ilvl="4" w:tentative="1">
+      <w:start w:val="1"/>
+      <w:numFmt w:val="decimal"/>
+      <w:lvlText w:val="%5."/>
+      <w:lvlJc w:val="left"/>
+      <w:pPr>
+        <w:tabs>
+          <w:tab w:val="num" w:pos="3600"/>
+        </w:tabs>
+        <w:ind w:left="3600" w:hanging="360"/>
+      </w:pPr>
+    </w:lvl>
+    <w:lvl w:ilvl="5" w:tentative="1">
+      <w:start w:val="1"/>
+      <w:numFmt w:val="decimal"/>
+      <w:lvlText w:val="%6."/>
+      <w:lvlJc w:val="left"/>
+      <w:pPr>
+        <w:tabs>
+          <w:tab w:val="num" w:pos="4320"/>
+        </w:tabs>
+        <w:ind w:left="4320" w:hanging="360"/>
+      </w:pPr>
+    </w:lvl>
+    <w:lvl w:ilvl="6" w:tentative="1">
+      <w:start w:val="1"/>
+      <w:numFmt w:val="decimal"/>
+      <w:lvlText w:val="%7."/>
+      <w:lvlJc w:val="left"/>
+      <w:pPr>
+        <w:tabs>
+          <w:tab w:val="num" w:pos="5040"/>
+        </w:tabs>
+        <w:ind w:left="5040" w:hanging="360"/>
+      </w:pPr>
+    </w:lvl>
+    <w:lvl w:ilvl="7" w:tentative="1">
+      <w:start w:val="1"/>
+      <w:numFmt w:val="decimal"/>
+      <w:lvlText w:val="%8."/>
+      <w:lvlJc w:val="left"/>
+      <w:pPr>
+        <w:tabs>
+          <w:tab w:val="num" w:pos="5760"/>
+        </w:tabs>
+        <w:ind w:left="5760" w:hanging="360"/>
+      </w:pPr>
+    </w:lvl>
+    <w:lvl w:ilvl="8" w:tentative="1">
+      <w:start w:val="1"/>
+      <w:numFmt w:val="decimal"/>
+      <w:lvlText w:val="%9."/>
+      <w:lvlJc w:val="left"/>
+      <w:pPr>
+        <w:tabs>
+          <w:tab w:val="num" w:pos="6480"/>
+        </w:tabs>
+        <w:ind w:left="6480" w:hanging="360"/>
+      </w:pPr>
+    </w:lvl>
+  </w:abstractNum>
+  <w:abstractNum w:abstractNumId="9" w15:restartNumberingAfterBreak="0">
+    <w:nsid w:val="46D05A22"/>
+    <w:multiLevelType w:val="multilevel"/>
+    <w:tmpl w:val="1DD4CBDA"/>
     <w:lvl w:ilvl="0">
       <w:start w:val="1"/>
       <w:numFmt w:val="bullet"/>
@@ -12010,236 +12267,10 @@
       </w:rPr>
     </w:lvl>
   </w:abstractNum>
-  <w:abstractNum w:abstractNumId="8" w15:restartNumberingAfterBreak="0">
-    <w:nsid w:val="1DDC3CFC"/>
+  <w:abstractNum w:abstractNumId="10" w15:restartNumberingAfterBreak="0">
+    <w:nsid w:val="4C9833A2"/>
     <w:multiLevelType w:val="multilevel"/>
-    <w:tmpl w:val="8C3C4888"/>
-    <w:lvl w:ilvl="0">
-      <w:start w:val="1"/>
-      <w:numFmt w:val="decimal"/>
-      <w:lvlText w:val="%1."/>
-      <w:lvlJc w:val="left"/>
-      <w:pPr>
-        <w:tabs>
-          <w:tab w:val="num" w:pos="720"/>
-        </w:tabs>
-        <w:ind w:left="720" w:hanging="360"/>
-      </w:pPr>
-    </w:lvl>
-    <w:lvl w:ilvl="1" w:tentative="1">
-      <w:start w:val="1"/>
-      <w:numFmt w:val="decimal"/>
-      <w:lvlText w:val="%2."/>
-      <w:lvlJc w:val="left"/>
-      <w:pPr>
-        <w:tabs>
-          <w:tab w:val="num" w:pos="1440"/>
-        </w:tabs>
-        <w:ind w:left="1440" w:hanging="360"/>
-      </w:pPr>
-    </w:lvl>
-    <w:lvl w:ilvl="2" w:tentative="1">
-      <w:start w:val="1"/>
-      <w:numFmt w:val="decimal"/>
-      <w:lvlText w:val="%3."/>
-      <w:lvlJc w:val="left"/>
-      <w:pPr>
-        <w:tabs>
-          <w:tab w:val="num" w:pos="2160"/>
-        </w:tabs>
-        <w:ind w:left="2160" w:hanging="360"/>
-      </w:pPr>
-    </w:lvl>
-    <w:lvl w:ilvl="3" w:tentative="1">
-      <w:start w:val="1"/>
-      <w:numFmt w:val="decimal"/>
-      <w:lvlText w:val="%4."/>
-      <w:lvlJc w:val="left"/>
-      <w:pPr>
-        <w:tabs>
-          <w:tab w:val="num" w:pos="2880"/>
-        </w:tabs>
-        <w:ind w:left="2880" w:hanging="360"/>
-      </w:pPr>
-    </w:lvl>
-    <w:lvl w:ilvl="4" w:tentative="1">
-      <w:start w:val="1"/>
-      <w:numFmt w:val="decimal"/>
-      <w:lvlText w:val="%5."/>
-      <w:lvlJc w:val="left"/>
-      <w:pPr>
-        <w:tabs>
-          <w:tab w:val="num" w:pos="3600"/>
-        </w:tabs>
-        <w:ind w:left="3600" w:hanging="360"/>
-      </w:pPr>
-    </w:lvl>
-    <w:lvl w:ilvl="5" w:tentative="1">
-      <w:start w:val="1"/>
-      <w:numFmt w:val="decimal"/>
-      <w:lvlText w:val="%6."/>
-      <w:lvlJc w:val="left"/>
-      <w:pPr>
-        <w:tabs>
-          <w:tab w:val="num" w:pos="4320"/>
-        </w:tabs>
-        <w:ind w:left="4320" w:hanging="360"/>
-      </w:pPr>
-    </w:lvl>
-    <w:lvl w:ilvl="6" w:tentative="1">
-      <w:start w:val="1"/>
-      <w:numFmt w:val="decimal"/>
-      <w:lvlText w:val="%7."/>
-      <w:lvlJc w:val="left"/>
-      <w:pPr>
-        <w:tabs>
-          <w:tab w:val="num" w:pos="5040"/>
-        </w:tabs>
-        <w:ind w:left="5040" w:hanging="360"/>
-      </w:pPr>
-    </w:lvl>
-    <w:lvl w:ilvl="7" w:tentative="1">
-      <w:start w:val="1"/>
-      <w:numFmt w:val="decimal"/>
-      <w:lvlText w:val="%8."/>
-      <w:lvlJc w:val="left"/>
-      <w:pPr>
-        <w:tabs>
-          <w:tab w:val="num" w:pos="5760"/>
-        </w:tabs>
-        <w:ind w:left="5760" w:hanging="360"/>
-      </w:pPr>
-    </w:lvl>
-    <w:lvl w:ilvl="8" w:tentative="1">
-      <w:start w:val="1"/>
-      <w:numFmt w:val="decimal"/>
-      <w:lvlText w:val="%9."/>
-      <w:lvlJc w:val="left"/>
-      <w:pPr>
-        <w:tabs>
-          <w:tab w:val="num" w:pos="6480"/>
-        </w:tabs>
-        <w:ind w:left="6480" w:hanging="360"/>
-      </w:pPr>
-    </w:lvl>
-  </w:abstractNum>
-  <w:abstractNum w:abstractNumId="9" w15:restartNumberingAfterBreak="0">
-    <w:nsid w:val="1E210CD0"/>
-    <w:multiLevelType w:val="multilevel"/>
-    <w:tmpl w:val="6EC84634"/>
-    <w:lvl w:ilvl="0">
-      <w:start w:val="1"/>
-      <w:numFmt w:val="decimal"/>
-      <w:lvlText w:val="%1."/>
-      <w:lvlJc w:val="left"/>
-      <w:pPr>
-        <w:tabs>
-          <w:tab w:val="num" w:pos="720"/>
-        </w:tabs>
-        <w:ind w:left="720" w:hanging="360"/>
-      </w:pPr>
-    </w:lvl>
-    <w:lvl w:ilvl="1" w:tentative="1">
-      <w:start w:val="1"/>
-      <w:numFmt w:val="decimal"/>
-      <w:lvlText w:val="%2."/>
-      <w:lvlJc w:val="left"/>
-      <w:pPr>
-        <w:tabs>
-          <w:tab w:val="num" w:pos="1440"/>
-        </w:tabs>
-        <w:ind w:left="1440" w:hanging="360"/>
-      </w:pPr>
-    </w:lvl>
-    <w:lvl w:ilvl="2" w:tentative="1">
-      <w:start w:val="1"/>
-      <w:numFmt w:val="decimal"/>
-      <w:lvlText w:val="%3."/>
-      <w:lvlJc w:val="left"/>
-      <w:pPr>
-        <w:tabs>
-          <w:tab w:val="num" w:pos="2160"/>
-        </w:tabs>
-        <w:ind w:left="2160" w:hanging="360"/>
-      </w:pPr>
-    </w:lvl>
-    <w:lvl w:ilvl="3" w:tentative="1">
-      <w:start w:val="1"/>
-      <w:numFmt w:val="decimal"/>
-      <w:lvlText w:val="%4."/>
-      <w:lvlJc w:val="left"/>
-      <w:pPr>
-        <w:tabs>
-          <w:tab w:val="num" w:pos="2880"/>
-        </w:tabs>
-        <w:ind w:left="2880" w:hanging="360"/>
-      </w:pPr>
-    </w:lvl>
-    <w:lvl w:ilvl="4" w:tentative="1">
-      <w:start w:val="1"/>
-      <w:numFmt w:val="decimal"/>
-      <w:lvlText w:val="%5."/>
-      <w:lvlJc w:val="left"/>
-      <w:pPr>
-        <w:tabs>
-          <w:tab w:val="num" w:pos="3600"/>
-        </w:tabs>
-        <w:ind w:left="3600" w:hanging="360"/>
-      </w:pPr>
-    </w:lvl>
-    <w:lvl w:ilvl="5" w:tentative="1">
-      <w:start w:val="1"/>
-      <w:numFmt w:val="decimal"/>
-      <w:lvlText w:val="%6."/>
-      <w:lvlJc w:val="left"/>
-      <w:pPr>
-        <w:tabs>
-          <w:tab w:val="num" w:pos="4320"/>
-        </w:tabs>
-        <w:ind w:left="4320" w:hanging="360"/>
-      </w:pPr>
-    </w:lvl>
-    <w:lvl w:ilvl="6" w:tentative="1">
-      <w:start w:val="1"/>
-      <w:numFmt w:val="decimal"/>
-      <w:lvlText w:val="%7."/>
-      <w:lvlJc w:val="left"/>
-      <w:pPr>
-        <w:tabs>
-          <w:tab w:val="num" w:pos="5040"/>
-        </w:tabs>
-        <w:ind w:left="5040" w:hanging="360"/>
-      </w:pPr>
-    </w:lvl>
-    <w:lvl w:ilvl="7" w:tentative="1">
-      <w:start w:val="1"/>
-      <w:numFmt w:val="decimal"/>
-      <w:lvlText w:val="%8."/>
-      <w:lvlJc w:val="left"/>
-      <w:pPr>
-        <w:tabs>
-          <w:tab w:val="num" w:pos="5760"/>
-        </w:tabs>
-        <w:ind w:left="5760" w:hanging="360"/>
-      </w:pPr>
-    </w:lvl>
-    <w:lvl w:ilvl="8" w:tentative="1">
-      <w:start w:val="1"/>
-      <w:numFmt w:val="decimal"/>
-      <w:lvlText w:val="%9."/>
-      <w:lvlJc w:val="left"/>
-      <w:pPr>
-        <w:tabs>
-          <w:tab w:val="num" w:pos="6480"/>
-        </w:tabs>
-        <w:ind w:left="6480" w:hanging="360"/>
-      </w:pPr>
-    </w:lvl>
-  </w:abstractNum>
-  <w:abstractNum w:abstractNumId="10" w15:restartNumberingAfterBreak="0">
-    <w:nsid w:val="2AA95E99"/>
-    <w:multiLevelType w:val="multilevel"/>
-    <w:tmpl w:val="A676667A"/>
+    <w:tmpl w:val="0084406A"/>
     <w:lvl w:ilvl="0">
       <w:start w:val="1"/>
       <w:numFmt w:val="bullet"/>
@@ -12386,235 +12417,9 @@
     </w:lvl>
   </w:abstractNum>
   <w:abstractNum w:abstractNumId="11" w15:restartNumberingAfterBreak="0">
-    <w:nsid w:val="33ED595B"/>
+    <w:nsid w:val="50FF009A"/>
     <w:multiLevelType w:val="multilevel"/>
-    <w:tmpl w:val="8A3A6294"/>
-    <w:lvl w:ilvl="0">
-      <w:start w:val="1"/>
-      <w:numFmt w:val="decimal"/>
-      <w:lvlText w:val="%1."/>
-      <w:lvlJc w:val="left"/>
-      <w:pPr>
-        <w:tabs>
-          <w:tab w:val="num" w:pos="720"/>
-        </w:tabs>
-        <w:ind w:left="720" w:hanging="360"/>
-      </w:pPr>
-    </w:lvl>
-    <w:lvl w:ilvl="1" w:tentative="1">
-      <w:start w:val="1"/>
-      <w:numFmt w:val="decimal"/>
-      <w:lvlText w:val="%2."/>
-      <w:lvlJc w:val="left"/>
-      <w:pPr>
-        <w:tabs>
-          <w:tab w:val="num" w:pos="1440"/>
-        </w:tabs>
-        <w:ind w:left="1440" w:hanging="360"/>
-      </w:pPr>
-    </w:lvl>
-    <w:lvl w:ilvl="2" w:tentative="1">
-      <w:start w:val="1"/>
-      <w:numFmt w:val="decimal"/>
-      <w:lvlText w:val="%3."/>
-      <w:lvlJc w:val="left"/>
-      <w:pPr>
-        <w:tabs>
-          <w:tab w:val="num" w:pos="2160"/>
-        </w:tabs>
-        <w:ind w:left="2160" w:hanging="360"/>
-      </w:pPr>
-    </w:lvl>
-    <w:lvl w:ilvl="3" w:tentative="1">
-      <w:start w:val="1"/>
-      <w:numFmt w:val="decimal"/>
-      <w:lvlText w:val="%4."/>
-      <w:lvlJc w:val="left"/>
-      <w:pPr>
-        <w:tabs>
-          <w:tab w:val="num" w:pos="2880"/>
-        </w:tabs>
-        <w:ind w:left="2880" w:hanging="360"/>
-      </w:pPr>
-    </w:lvl>
-    <w:lvl w:ilvl="4" w:tentative="1">
-      <w:start w:val="1"/>
-      <w:numFmt w:val="decimal"/>
-      <w:lvlText w:val="%5."/>
-      <w:lvlJc w:val="left"/>
-      <w:pPr>
-        <w:tabs>
-          <w:tab w:val="num" w:pos="3600"/>
-        </w:tabs>
-        <w:ind w:left="3600" w:hanging="360"/>
-      </w:pPr>
-    </w:lvl>
-    <w:lvl w:ilvl="5" w:tentative="1">
-      <w:start w:val="1"/>
-      <w:numFmt w:val="decimal"/>
-      <w:lvlText w:val="%6."/>
-      <w:lvlJc w:val="left"/>
-      <w:pPr>
-        <w:tabs>
-          <w:tab w:val="num" w:pos="4320"/>
-        </w:tabs>
-        <w:ind w:left="4320" w:hanging="360"/>
-      </w:pPr>
-    </w:lvl>
-    <w:lvl w:ilvl="6" w:tentative="1">
-      <w:start w:val="1"/>
-      <w:numFmt w:val="decimal"/>
-      <w:lvlText w:val="%7."/>
-      <w:lvlJc w:val="left"/>
-      <w:pPr>
-        <w:tabs>
-          <w:tab w:val="num" w:pos="5040"/>
-        </w:tabs>
-        <w:ind w:left="5040" w:hanging="360"/>
-      </w:pPr>
-    </w:lvl>
-    <w:lvl w:ilvl="7" w:tentative="1">
-      <w:start w:val="1"/>
-      <w:numFmt w:val="decimal"/>
-      <w:lvlText w:val="%8."/>
-      <w:lvlJc w:val="left"/>
-      <w:pPr>
-        <w:tabs>
-          <w:tab w:val="num" w:pos="5760"/>
-        </w:tabs>
-        <w:ind w:left="5760" w:hanging="360"/>
-      </w:pPr>
-    </w:lvl>
-    <w:lvl w:ilvl="8" w:tentative="1">
-      <w:start w:val="1"/>
-      <w:numFmt w:val="decimal"/>
-      <w:lvlText w:val="%9."/>
-      <w:lvlJc w:val="left"/>
-      <w:pPr>
-        <w:tabs>
-          <w:tab w:val="num" w:pos="6480"/>
-        </w:tabs>
-        <w:ind w:left="6480" w:hanging="360"/>
-      </w:pPr>
-    </w:lvl>
-  </w:abstractNum>
-  <w:abstractNum w:abstractNumId="12" w15:restartNumberingAfterBreak="0">
-    <w:nsid w:val="3BC40600"/>
-    <w:multiLevelType w:val="multilevel"/>
-    <w:tmpl w:val="4134BD0A"/>
-    <w:lvl w:ilvl="0">
-      <w:start w:val="1"/>
-      <w:numFmt w:val="decimal"/>
-      <w:lvlText w:val="%1."/>
-      <w:lvlJc w:val="left"/>
-      <w:pPr>
-        <w:tabs>
-          <w:tab w:val="num" w:pos="720"/>
-        </w:tabs>
-        <w:ind w:left="720" w:hanging="360"/>
-      </w:pPr>
-    </w:lvl>
-    <w:lvl w:ilvl="1" w:tentative="1">
-      <w:start w:val="1"/>
-      <w:numFmt w:val="decimal"/>
-      <w:lvlText w:val="%2."/>
-      <w:lvlJc w:val="left"/>
-      <w:pPr>
-        <w:tabs>
-          <w:tab w:val="num" w:pos="1440"/>
-        </w:tabs>
-        <w:ind w:left="1440" w:hanging="360"/>
-      </w:pPr>
-    </w:lvl>
-    <w:lvl w:ilvl="2" w:tentative="1">
-      <w:start w:val="1"/>
-      <w:numFmt w:val="decimal"/>
-      <w:lvlText w:val="%3."/>
-      <w:lvlJc w:val="left"/>
-      <w:pPr>
-        <w:tabs>
-          <w:tab w:val="num" w:pos="2160"/>
-        </w:tabs>
-        <w:ind w:left="2160" w:hanging="360"/>
-      </w:pPr>
-    </w:lvl>
-    <w:lvl w:ilvl="3" w:tentative="1">
-      <w:start w:val="1"/>
-      <w:numFmt w:val="decimal"/>
-      <w:lvlText w:val="%4."/>
-      <w:lvlJc w:val="left"/>
-      <w:pPr>
-        <w:tabs>
-          <w:tab w:val="num" w:pos="2880"/>
-        </w:tabs>
-        <w:ind w:left="2880" w:hanging="360"/>
-      </w:pPr>
-    </w:lvl>
-    <w:lvl w:ilvl="4" w:tentative="1">
-      <w:start w:val="1"/>
-      <w:numFmt w:val="decimal"/>
-      <w:lvlText w:val="%5."/>
-      <w:lvlJc w:val="left"/>
-      <w:pPr>
-        <w:tabs>
-          <w:tab w:val="num" w:pos="3600"/>
-        </w:tabs>
-        <w:ind w:left="3600" w:hanging="360"/>
-      </w:pPr>
-    </w:lvl>
-    <w:lvl w:ilvl="5" w:tentative="1">
-      <w:start w:val="1"/>
-      <w:numFmt w:val="decimal"/>
-      <w:lvlText w:val="%6."/>
-      <w:lvlJc w:val="left"/>
-      <w:pPr>
-        <w:tabs>
-          <w:tab w:val="num" w:pos="4320"/>
-        </w:tabs>
-        <w:ind w:left="4320" w:hanging="360"/>
-      </w:pPr>
-    </w:lvl>
-    <w:lvl w:ilvl="6" w:tentative="1">
-      <w:start w:val="1"/>
-      <w:numFmt w:val="decimal"/>
-      <w:lvlText w:val="%7."/>
-      <w:lvlJc w:val="left"/>
-      <w:pPr>
-        <w:tabs>
-          <w:tab w:val="num" w:pos="5040"/>
-        </w:tabs>
-        <w:ind w:left="5040" w:hanging="360"/>
-      </w:pPr>
-    </w:lvl>
-    <w:lvl w:ilvl="7" w:tentative="1">
-      <w:start w:val="1"/>
-      <w:numFmt w:val="decimal"/>
-      <w:lvlText w:val="%8."/>
-      <w:lvlJc w:val="left"/>
-      <w:pPr>
-        <w:tabs>
-          <w:tab w:val="num" w:pos="5760"/>
-        </w:tabs>
-        <w:ind w:left="5760" w:hanging="360"/>
-      </w:pPr>
-    </w:lvl>
-    <w:lvl w:ilvl="8" w:tentative="1">
-      <w:start w:val="1"/>
-      <w:numFmt w:val="decimal"/>
-      <w:lvlText w:val="%9."/>
-      <w:lvlJc w:val="left"/>
-      <w:pPr>
-        <w:tabs>
-          <w:tab w:val="num" w:pos="6480"/>
-        </w:tabs>
-        <w:ind w:left="6480" w:hanging="360"/>
-      </w:pPr>
-    </w:lvl>
-  </w:abstractNum>
-  <w:abstractNum w:abstractNumId="13" w15:restartNumberingAfterBreak="0">
-    <w:nsid w:val="3D202743"/>
-    <w:multiLevelType w:val="multilevel"/>
-    <w:tmpl w:val="C1F091CE"/>
+    <w:tmpl w:val="69B25A0C"/>
     <w:lvl w:ilvl="0">
       <w:start w:val="1"/>
       <w:numFmt w:val="bullet"/>
@@ -12760,10 +12565,123 @@
       </w:rPr>
     </w:lvl>
   </w:abstractNum>
-  <w:abstractNum w:abstractNumId="14" w15:restartNumberingAfterBreak="0">
-    <w:nsid w:val="403748D8"/>
+  <w:abstractNum w:abstractNumId="12" w15:restartNumberingAfterBreak="0">
+    <w:nsid w:val="5653712F"/>
     <w:multiLevelType w:val="multilevel"/>
-    <w:tmpl w:val="AEB28C7A"/>
+    <w:tmpl w:val="B1406FC8"/>
+    <w:lvl w:ilvl="0">
+      <w:start w:val="1"/>
+      <w:numFmt w:val="decimal"/>
+      <w:lvlText w:val="%1."/>
+      <w:lvlJc w:val="left"/>
+      <w:pPr>
+        <w:tabs>
+          <w:tab w:val="num" w:pos="720"/>
+        </w:tabs>
+        <w:ind w:left="720" w:hanging="360"/>
+      </w:pPr>
+    </w:lvl>
+    <w:lvl w:ilvl="1" w:tentative="1">
+      <w:start w:val="1"/>
+      <w:numFmt w:val="decimal"/>
+      <w:lvlText w:val="%2."/>
+      <w:lvlJc w:val="left"/>
+      <w:pPr>
+        <w:tabs>
+          <w:tab w:val="num" w:pos="1440"/>
+        </w:tabs>
+        <w:ind w:left="1440" w:hanging="360"/>
+      </w:pPr>
+    </w:lvl>
+    <w:lvl w:ilvl="2" w:tentative="1">
+      <w:start w:val="1"/>
+      <w:numFmt w:val="decimal"/>
+      <w:lvlText w:val="%3."/>
+      <w:lvlJc w:val="left"/>
+      <w:pPr>
+        <w:tabs>
+          <w:tab w:val="num" w:pos="2160"/>
+        </w:tabs>
+        <w:ind w:left="2160" w:hanging="360"/>
+      </w:pPr>
+    </w:lvl>
+    <w:lvl w:ilvl="3" w:tentative="1">
+      <w:start w:val="1"/>
+      <w:numFmt w:val="decimal"/>
+      <w:lvlText w:val="%4."/>
+      <w:lvlJc w:val="left"/>
+      <w:pPr>
+        <w:tabs>
+          <w:tab w:val="num" w:pos="2880"/>
+        </w:tabs>
+        <w:ind w:left="2880" w:hanging="360"/>
+      </w:pPr>
+    </w:lvl>
+    <w:lvl w:ilvl="4" w:tentative="1">
+      <w:start w:val="1"/>
+      <w:numFmt w:val="decimal"/>
+      <w:lvlText w:val="%5."/>
+      <w:lvlJc w:val="left"/>
+      <w:pPr>
+        <w:tabs>
+          <w:tab w:val="num" w:pos="3600"/>
+        </w:tabs>
+        <w:ind w:left="3600" w:hanging="360"/>
+      </w:pPr>
+    </w:lvl>
+    <w:lvl w:ilvl="5" w:tentative="1">
+      <w:start w:val="1"/>
+      <w:numFmt w:val="decimal"/>
+      <w:lvlText w:val="%6."/>
+      <w:lvlJc w:val="left"/>
+      <w:pPr>
+        <w:tabs>
+          <w:tab w:val="num" w:pos="4320"/>
+        </w:tabs>
+        <w:ind w:left="4320" w:hanging="360"/>
+      </w:pPr>
+    </w:lvl>
+    <w:lvl w:ilvl="6" w:tentative="1">
+      <w:start w:val="1"/>
+      <w:numFmt w:val="decimal"/>
+      <w:lvlText w:val="%7."/>
+      <w:lvlJc w:val="left"/>
+      <w:pPr>
+        <w:tabs>
+          <w:tab w:val="num" w:pos="5040"/>
+        </w:tabs>
+        <w:ind w:left="5040" w:hanging="360"/>
+      </w:pPr>
+    </w:lvl>
+    <w:lvl w:ilvl="7" w:tentative="1">
+      <w:start w:val="1"/>
+      <w:numFmt w:val="decimal"/>
+      <w:lvlText w:val="%8."/>
+      <w:lvlJc w:val="left"/>
+      <w:pPr>
+        <w:tabs>
+          <w:tab w:val="num" w:pos="5760"/>
+        </w:tabs>
+        <w:ind w:left="5760" w:hanging="360"/>
+      </w:pPr>
+    </w:lvl>
+    <w:lvl w:ilvl="8" w:tentative="1">
+      <w:start w:val="1"/>
+      <w:numFmt w:val="decimal"/>
+      <w:lvlText w:val="%9."/>
+      <w:lvlJc w:val="left"/>
+      <w:pPr>
+        <w:tabs>
+          <w:tab w:val="num" w:pos="6480"/>
+        </w:tabs>
+        <w:ind w:left="6480" w:hanging="360"/>
+      </w:pPr>
+    </w:lvl>
+  </w:abstractNum>
+  <w:abstractNum w:abstractNumId="13" w15:restartNumberingAfterBreak="0">
+    <w:nsid w:val="57117451"/>
+    <w:multiLevelType w:val="multilevel"/>
+    <w:tmpl w:val="1A185E52"/>
     <w:lvl w:ilvl="0">
       <w:start w:val="1"/>
       <w:numFmt w:val="bullet"/>
@@ -12909,10 +12827,10 @@
       </w:rPr>
     </w:lvl>
   </w:abstractNum>
-  <w:abstractNum w:abstractNumId="15" w15:restartNumberingAfterBreak="0">
-    <w:nsid w:val="5C6B48DE"/>
+  <w:abstractNum w:abstractNumId="14" w15:restartNumberingAfterBreak="0">
+    <w:nsid w:val="5D1A696E"/>
     <w:multiLevelType w:val="multilevel"/>
-    <w:tmpl w:val="63542696"/>
+    <w:tmpl w:val="C0D67816"/>
     <w:lvl w:ilvl="0">
       <w:start w:val="1"/>
       <w:numFmt w:val="bullet"/>
@@ -13058,10 +12976,10 @@
       </w:rPr>
     </w:lvl>
   </w:abstractNum>
-  <w:abstractNum w:abstractNumId="16" w15:restartNumberingAfterBreak="0">
-    <w:nsid w:val="5D752B84"/>
+  <w:abstractNum w:abstractNumId="15" w15:restartNumberingAfterBreak="0">
+    <w:nsid w:val="5E373DA6"/>
     <w:multiLevelType w:val="multilevel"/>
-    <w:tmpl w:val="38A0BED2"/>
+    <w:tmpl w:val="A7747ED2"/>
     <w:lvl w:ilvl="0">
       <w:start w:val="1"/>
       <w:numFmt w:val="bullet"/>
@@ -13207,10 +13125,10 @@
       </w:rPr>
     </w:lvl>
   </w:abstractNum>
-  <w:abstractNum w:abstractNumId="17" w15:restartNumberingAfterBreak="0">
-    <w:nsid w:val="646D6922"/>
+  <w:abstractNum w:abstractNumId="16" w15:restartNumberingAfterBreak="0">
+    <w:nsid w:val="678C44D2"/>
     <w:multiLevelType w:val="multilevel"/>
-    <w:tmpl w:val="01B87260"/>
+    <w:tmpl w:val="DB145192"/>
     <w:lvl w:ilvl="0">
       <w:start w:val="1"/>
       <w:numFmt w:val="bullet"/>
@@ -13356,10 +13274,10 @@
       </w:rPr>
     </w:lvl>
   </w:abstractNum>
-  <w:abstractNum w:abstractNumId="18" w15:restartNumberingAfterBreak="0">
-    <w:nsid w:val="6F4A4937"/>
+  <w:abstractNum w:abstractNumId="17" w15:restartNumberingAfterBreak="0">
+    <w:nsid w:val="679458F5"/>
     <w:multiLevelType w:val="multilevel"/>
-    <w:tmpl w:val="FFA4BEB8"/>
+    <w:tmpl w:val="E2489DE2"/>
     <w:lvl w:ilvl="0">
       <w:start w:val="1"/>
       <w:numFmt w:val="bullet"/>
@@ -13505,10 +13423,10 @@
       </w:rPr>
     </w:lvl>
   </w:abstractNum>
-  <w:abstractNum w:abstractNumId="19" w15:restartNumberingAfterBreak="0">
-    <w:nsid w:val="79AA4534"/>
+  <w:abstractNum w:abstractNumId="18" w15:restartNumberingAfterBreak="0">
+    <w:nsid w:val="7AE44B0F"/>
     <w:multiLevelType w:val="multilevel"/>
-    <w:tmpl w:val="3A3EB048"/>
+    <w:tmpl w:val="98FEB44A"/>
     <w:lvl w:ilvl="0">
       <w:start w:val="1"/>
       <w:numFmt w:val="bullet"/>
@@ -13654,65 +13572,178 @@
       </w:rPr>
     </w:lvl>
   </w:abstractNum>
-  <w:num w:numId="1" w16cid:durableId="1805655120">
+  <w:abstractNum w:abstractNumId="19" w15:restartNumberingAfterBreak="0">
+    <w:nsid w:val="7D213425"/>
+    <w:multiLevelType w:val="multilevel"/>
+    <w:tmpl w:val="3F82BF0E"/>
+    <w:lvl w:ilvl="0">
+      <w:start w:val="1"/>
+      <w:numFmt w:val="decimal"/>
+      <w:lvlText w:val="%1."/>
+      <w:lvlJc w:val="left"/>
+      <w:pPr>
+        <w:tabs>
+          <w:tab w:val="num" w:pos="720"/>
+        </w:tabs>
+        <w:ind w:left="720" w:hanging="360"/>
+      </w:pPr>
+    </w:lvl>
+    <w:lvl w:ilvl="1" w:tentative="1">
+      <w:start w:val="1"/>
+      <w:numFmt w:val="decimal"/>
+      <w:lvlText w:val="%2."/>
+      <w:lvlJc w:val="left"/>
+      <w:pPr>
+        <w:tabs>
+          <w:tab w:val="num" w:pos="1440"/>
+        </w:tabs>
+        <w:ind w:left="1440" w:hanging="360"/>
+      </w:pPr>
+    </w:lvl>
+    <w:lvl w:ilvl="2" w:tentative="1">
+      <w:start w:val="1"/>
+      <w:numFmt w:val="decimal"/>
+      <w:lvlText w:val="%3."/>
+      <w:lvlJc w:val="left"/>
+      <w:pPr>
+        <w:tabs>
+          <w:tab w:val="num" w:pos="2160"/>
+        </w:tabs>
+        <w:ind w:left="2160" w:hanging="360"/>
+      </w:pPr>
+    </w:lvl>
+    <w:lvl w:ilvl="3" w:tentative="1">
+      <w:start w:val="1"/>
+      <w:numFmt w:val="decimal"/>
+      <w:lvlText w:val="%4."/>
+      <w:lvlJc w:val="left"/>
+      <w:pPr>
+        <w:tabs>
+          <w:tab w:val="num" w:pos="2880"/>
+        </w:tabs>
+        <w:ind w:left="2880" w:hanging="360"/>
+      </w:pPr>
+    </w:lvl>
+    <w:lvl w:ilvl="4" w:tentative="1">
+      <w:start w:val="1"/>
+      <w:numFmt w:val="decimal"/>
+      <w:lvlText w:val="%5."/>
+      <w:lvlJc w:val="left"/>
+      <w:pPr>
+        <w:tabs>
+          <w:tab w:val="num" w:pos="3600"/>
+        </w:tabs>
+        <w:ind w:left="3600" w:hanging="360"/>
+      </w:pPr>
+    </w:lvl>
+    <w:lvl w:ilvl="5" w:tentative="1">
+      <w:start w:val="1"/>
+      <w:numFmt w:val="decimal"/>
+      <w:lvlText w:val="%6."/>
+      <w:lvlJc w:val="left"/>
+      <w:pPr>
+        <w:tabs>
+          <w:tab w:val="num" w:pos="4320"/>
+        </w:tabs>
+        <w:ind w:left="4320" w:hanging="360"/>
+      </w:pPr>
+    </w:lvl>
+    <w:lvl w:ilvl="6" w:tentative="1">
+      <w:start w:val="1"/>
+      <w:numFmt w:val="decimal"/>
+      <w:lvlText w:val="%7."/>
+      <w:lvlJc w:val="left"/>
+      <w:pPr>
+        <w:tabs>
+          <w:tab w:val="num" w:pos="5040"/>
+        </w:tabs>
+        <w:ind w:left="5040" w:hanging="360"/>
+      </w:pPr>
+    </w:lvl>
+    <w:lvl w:ilvl="7" w:tentative="1">
+      <w:start w:val="1"/>
+      <w:numFmt w:val="decimal"/>
+      <w:lvlText w:val="%8."/>
+      <w:lvlJc w:val="left"/>
+      <w:pPr>
+        <w:tabs>
+          <w:tab w:val="num" w:pos="5760"/>
+        </w:tabs>
+        <w:ind w:left="5760" w:hanging="360"/>
+      </w:pPr>
+    </w:lvl>
+    <w:lvl w:ilvl="8" w:tentative="1">
+      <w:start w:val="1"/>
+      <w:numFmt w:val="decimal"/>
+      <w:lvlText w:val="%9."/>
+      <w:lvlJc w:val="left"/>
+      <w:pPr>
+        <w:tabs>
+          <w:tab w:val="num" w:pos="6480"/>
+        </w:tabs>
+        <w:ind w:left="6480" w:hanging="360"/>
+      </w:pPr>
+    </w:lvl>
+  </w:abstractNum>
+  <w:num w:numId="1" w16cid:durableId="295182557">
+    <w:abstractNumId w:val="0"/>
+  </w:num>
+  <w:num w:numId="2" w16cid:durableId="82341979">
+    <w:abstractNumId w:val="13"/>
+  </w:num>
+  <w:num w:numId="3" w16cid:durableId="941256336">
+    <w:abstractNumId w:val="5"/>
+  </w:num>
+  <w:num w:numId="4" w16cid:durableId="821581463">
+    <w:abstractNumId w:val="14"/>
+  </w:num>
+  <w:num w:numId="5" w16cid:durableId="1229657553">
+    <w:abstractNumId w:val="4"/>
+  </w:num>
+  <w:num w:numId="6" w16cid:durableId="63990286">
+    <w:abstractNumId w:val="9"/>
+  </w:num>
+  <w:num w:numId="7" w16cid:durableId="948195186">
+    <w:abstractNumId w:val="17"/>
+  </w:num>
+  <w:num w:numId="8" w16cid:durableId="2089377092">
+    <w:abstractNumId w:val="3"/>
+  </w:num>
+  <w:num w:numId="9" w16cid:durableId="1157764709">
+    <w:abstractNumId w:val="10"/>
+  </w:num>
+  <w:num w:numId="10" w16cid:durableId="1384020735">
+    <w:abstractNumId w:val="16"/>
+  </w:num>
+  <w:num w:numId="11" w16cid:durableId="71587366">
+    <w:abstractNumId w:val="11"/>
+  </w:num>
+  <w:num w:numId="12" w16cid:durableId="978614965">
+    <w:abstractNumId w:val="6"/>
+  </w:num>
+  <w:num w:numId="13" w16cid:durableId="1906992771">
+    <w:abstractNumId w:val="7"/>
+  </w:num>
+  <w:num w:numId="14" w16cid:durableId="728654042">
+    <w:abstractNumId w:val="1"/>
+  </w:num>
+  <w:num w:numId="15" w16cid:durableId="223488286">
+    <w:abstractNumId w:val="8"/>
+  </w:num>
+  <w:num w:numId="16" w16cid:durableId="28847876">
+    <w:abstractNumId w:val="19"/>
+  </w:num>
+  <w:num w:numId="17" w16cid:durableId="1417289688">
     <w:abstractNumId w:val="12"/>
   </w:num>
-  <w:num w:numId="2" w16cid:durableId="507907309">
-    <w:abstractNumId w:val="3"/>
-  </w:num>
-  <w:num w:numId="3" w16cid:durableId="321355158">
-    <w:abstractNumId w:val="6"/>
-  </w:num>
-  <w:num w:numId="4" w16cid:durableId="1350109398">
-    <w:abstractNumId w:val="14"/>
-  </w:num>
-  <w:num w:numId="5" w16cid:durableId="151991099">
-    <w:abstractNumId w:val="8"/>
-  </w:num>
-  <w:num w:numId="6" w16cid:durableId="916280725">
-    <w:abstractNumId w:val="17"/>
-  </w:num>
-  <w:num w:numId="7" w16cid:durableId="1692489109">
-    <w:abstractNumId w:val="4"/>
-  </w:num>
-  <w:num w:numId="8" w16cid:durableId="394012136">
-    <w:abstractNumId w:val="19"/>
-  </w:num>
-  <w:num w:numId="9" w16cid:durableId="2032028669">
-    <w:abstractNumId w:val="16"/>
-  </w:num>
-  <w:num w:numId="10" w16cid:durableId="1234896164">
+  <w:num w:numId="18" w16cid:durableId="1460496147">
     <w:abstractNumId w:val="15"/>
   </w:num>
-  <w:num w:numId="11" w16cid:durableId="494493248">
-    <w:abstractNumId w:val="18"/>
-  </w:num>
-  <w:num w:numId="12" w16cid:durableId="1420103187">
-    <w:abstractNumId w:val="5"/>
-  </w:num>
-  <w:num w:numId="13" w16cid:durableId="1534657829">
-    <w:abstractNumId w:val="7"/>
-  </w:num>
-  <w:num w:numId="14" w16cid:durableId="1515724586">
-    <w:abstractNumId w:val="0"/>
-  </w:num>
-  <w:num w:numId="15" w16cid:durableId="712851034">
-    <w:abstractNumId w:val="11"/>
-  </w:num>
-  <w:num w:numId="16" w16cid:durableId="1118599236">
-    <w:abstractNumId w:val="9"/>
-  </w:num>
-  <w:num w:numId="17" w16cid:durableId="1457914690">
+  <w:num w:numId="19" w16cid:durableId="649676497">
     <w:abstractNumId w:val="2"/>
   </w:num>
-  <w:num w:numId="18" w16cid:durableId="1888372288">
-    <w:abstractNumId w:val="10"/>
-  </w:num>
-  <w:num w:numId="19" w16cid:durableId="2032217537">
-    <w:abstractNumId w:val="13"/>
-  </w:num>
-  <w:num w:numId="20" w16cid:durableId="1591425865">
-    <w:abstractNumId w:val="1"/>
+  <w:num w:numId="20" w16cid:durableId="746038">
+    <w:abstractNumId w:val="18"/>
   </w:num>
 </w:numbering>
 </file>

</xml_diff>